<commit_message>
Clarify policy dates: add Original Year column and expand pre-2022 entries
The previous version only showed Last Amendment Year, making decades-old
instruments appear recent after 2024-2026 amendments. Added Original Year
column, expanded list to 30 policies (25 adopted before 2022), and added
explanatory note.

Co-authored-by: Vaibhav <shivrain@users.noreply.github.com>
</commit_message>
<xml_diff>
--- a/Norway_Plastic_Pollution_Policies.docx
+++ b/Norway_Plastic_Pollution_Policies.docx
@@ -16,12 +16,12 @@
         <w:jc w:val="center"/>
       </w:pPr>
       <w:r>
-        <w:t>Comprehensive list of national-level policies (laws, regulations, strategies, plans) tackling plastic pollution directly and indirectly across the plastic lifecycle. International treaties excluded. Links are official government sources only (lovdata.no, regjeringen.no). Sorted chronologically by original adoption year.</w:t>
+        <w:t>National-level policies tackling plastic pollution across the lifecycle. International treaties excluded. Official government sources only. Sorted chronologically by ORIGINAL adoption/first-effective year.</w:t>
       </w:r>
     </w:p>
     <w:p>
       <w:r>
-        <w:t>Compiled: 24 June 2026 | Total policies: 21</w:t>
+        <w:t>Compiled: 24 June 2026 | Total policies: 30</w:t>
       </w:r>
     </w:p>
     <w:p/>
@@ -29,28 +29,28 @@
       <w:tblPr>
         <w:tblStyle w:val="TableGrid"/>
         <w:tblW w:type="auto" w:w="0"/>
-        <w:tblLayout w:type="fixed"/>
         <w:tblLook w:firstColumn="1" w:firstRow="1" w:lastColumn="0" w:lastRow="0" w:noHBand="0" w:noVBand="1" w:val="04A0"/>
       </w:tblPr>
       <w:tblGrid>
-        <w:gridCol w:w="1234"/>
-        <w:gridCol w:w="1234"/>
-        <w:gridCol w:w="1234"/>
-        <w:gridCol w:w="1234"/>
-        <w:gridCol w:w="1234"/>
-        <w:gridCol w:w="1234"/>
-        <w:gridCol w:w="1234"/>
+        <w:gridCol w:w="1080"/>
+        <w:gridCol w:w="1080"/>
+        <w:gridCol w:w="1080"/>
+        <w:gridCol w:w="1080"/>
+        <w:gridCol w:w="1080"/>
+        <w:gridCol w:w="1080"/>
+        <w:gridCol w:w="1080"/>
+        <w:gridCol w:w="1080"/>
       </w:tblGrid>
       <w:tr>
         <w:tc>
           <w:tcPr>
-            <w:tcW w:type="dxa" w:w="2304"/>
+            <w:tcW w:type="dxa" w:w="1080"/>
           </w:tcPr>
           <w:p>
             <w:r>
               <w:rPr>
                 <w:b/>
-                <w:sz w:val="16"/>
+                <w:sz w:val="14"/>
               </w:rPr>
               <w:t>Policy Title</w:t>
             </w:r>
@@ -58,13 +58,13 @@
         </w:tc>
         <w:tc>
           <w:tcPr>
-            <w:tcW w:type="dxa" w:w="1296"/>
+            <w:tcW w:type="dxa" w:w="1080"/>
           </w:tcPr>
           <w:p>
             <w:r>
               <w:rPr>
                 <w:b/>
-                <w:sz w:val="16"/>
+                <w:sz w:val="14"/>
               </w:rPr>
               <w:t>Policy Type</w:t>
             </w:r>
@@ -72,13 +72,27 @@
         </w:tc>
         <w:tc>
           <w:tcPr>
-            <w:tcW w:type="dxa" w:w="792"/>
+            <w:tcW w:type="dxa" w:w="1080"/>
           </w:tcPr>
           <w:p>
             <w:r>
               <w:rPr>
                 <w:b/>
-                <w:sz w:val="16"/>
+                <w:sz w:val="14"/>
+              </w:rPr>
+              <w:t>Original Year</w:t>
+            </w:r>
+          </w:p>
+        </w:tc>
+        <w:tc>
+          <w:tcPr>
+            <w:tcW w:type="dxa" w:w="1080"/>
+          </w:tcPr>
+          <w:p>
+            <w:r>
+              <w:rPr>
+                <w:b/>
+                <w:sz w:val="14"/>
               </w:rPr>
               <w:t>Last Amendment Year</w:t>
             </w:r>
@@ -86,13 +100,13 @@
         </w:tc>
         <w:tc>
           <w:tcPr>
-            <w:tcW w:type="dxa" w:w="2880"/>
+            <w:tcW w:type="dxa" w:w="1080"/>
           </w:tcPr>
           <w:p>
             <w:r>
               <w:rPr>
                 <w:b/>
-                <w:sz w:val="16"/>
+                <w:sz w:val="14"/>
               </w:rPr>
               <w:t>Short Description</w:t>
             </w:r>
@@ -100,13 +114,13 @@
         </w:tc>
         <w:tc>
           <w:tcPr>
-            <w:tcW w:type="dxa" w:w="1584"/>
+            <w:tcW w:type="dxa" w:w="1080"/>
           </w:tcPr>
           <w:p>
             <w:r>
               <w:rPr>
                 <w:b/>
-                <w:sz w:val="16"/>
+                <w:sz w:val="14"/>
               </w:rPr>
               <w:t>Sectors</w:t>
             </w:r>
@@ -114,13 +128,13 @@
         </w:tc>
         <w:tc>
           <w:tcPr>
-            <w:tcW w:type="dxa" w:w="1440"/>
+            <w:tcW w:type="dxa" w:w="1080"/>
           </w:tcPr>
           <w:p>
             <w:r>
               <w:rPr>
                 <w:b/>
-                <w:sz w:val="16"/>
+                <w:sz w:val="14"/>
               </w:rPr>
               <w:t>Life-Cycle Stage</w:t>
             </w:r>
@@ -128,13 +142,13 @@
         </w:tc>
         <w:tc>
           <w:tcPr>
-            <w:tcW w:type="dxa" w:w="1872"/>
+            <w:tcW w:type="dxa" w:w="1080"/>
           </w:tcPr>
           <w:p>
             <w:r>
               <w:rPr>
                 <w:b/>
-                <w:sz w:val="16"/>
+                <w:sz w:val="14"/>
               </w:rPr>
               <w:t>Link</w:t>
             </w:r>
@@ -144,12 +158,126 @@
       <w:tr>
         <w:tc>
           <w:tcPr>
-            <w:tcW w:type="dxa" w:w="1234"/>
+            <w:tcW w:type="dxa" w:w="1080"/>
           </w:tcPr>
           <w:p>
             <w:r>
               <w:rPr>
-                <w:sz w:val="14"/>
+                <w:sz w:val="13"/>
+              </w:rPr>
+              <w:t>Lov om særavgifter (særavgiftsloven) – avgifter på drikkevareemballasje</w:t>
+            </w:r>
+          </w:p>
+        </w:tc>
+        <w:tc>
+          <w:tcPr>
+            <w:tcW w:type="dxa" w:w="1080"/>
+          </w:tcPr>
+          <w:p>
+            <w:r>
+              <w:rPr>
+                <w:sz w:val="13"/>
+              </w:rPr>
+              <w:t>Act (Law)</w:t>
+            </w:r>
+          </w:p>
+        </w:tc>
+        <w:tc>
+          <w:tcPr>
+            <w:tcW w:type="dxa" w:w="1080"/>
+          </w:tcPr>
+          <w:p>
+            <w:r>
+              <w:rPr>
+                <w:sz w:val="13"/>
+              </w:rPr>
+              <w:t>1933</w:t>
+            </w:r>
+          </w:p>
+        </w:tc>
+        <w:tc>
+          <w:tcPr>
+            <w:tcW w:type="dxa" w:w="1080"/>
+          </w:tcPr>
+          <w:p>
+            <w:r>
+              <w:rPr>
+                <w:sz w:val="13"/>
+              </w:rPr>
+              <w:t>2026</w:t>
+            </w:r>
+          </w:p>
+        </w:tc>
+        <w:tc>
+          <w:tcPr>
+            <w:tcW w:type="dxa" w:w="1080"/>
+          </w:tcPr>
+          <w:p>
+            <w:r>
+              <w:rPr>
+                <w:sz w:val="13"/>
+              </w:rPr>
+              <w:t>Legal basis for excise on beverage packaging including plastic bottles; environmental tax incentivises deposit-return and recycling. Chapter 5 (2026 consolidation) governs packaging duties.</w:t>
+            </w:r>
+          </w:p>
+        </w:tc>
+        <w:tc>
+          <w:tcPr>
+            <w:tcW w:type="dxa" w:w="1080"/>
+          </w:tcPr>
+          <w:p>
+            <w:r>
+              <w:rPr>
+                <w:sz w:val="13"/>
+              </w:rPr>
+              <w:t>Beverage; packaging; retail</w:t>
+            </w:r>
+          </w:p>
+        </w:tc>
+        <w:tc>
+          <w:tcPr>
+            <w:tcW w:type="dxa" w:w="1080"/>
+          </w:tcPr>
+          <w:p>
+            <w:r>
+              <w:rPr>
+                <w:sz w:val="13"/>
+              </w:rPr>
+              <w:t>Use/Consumption; End-of-life</w:t>
+            </w:r>
+          </w:p>
+        </w:tc>
+        <w:tc>
+          <w:tcPr>
+            <w:tcW w:type="dxa" w:w="1080"/>
+          </w:tcPr>
+          <w:p>
+            <w:r>
+              <w:rPr>
+                <w:sz w:val="13"/>
+              </w:rPr>
+            </w:r>
+            <w:hyperlink r:id="rId9">
+              <w:r>
+                <w:rPr>
+                  <w:color w:val="0563C1"/>
+                  <w:u w:val="single"/>
+                </w:rPr>
+                <w:t>lovdata.no – Særavgiftsloven kap. 5</w:t>
+              </w:r>
+            </w:hyperlink>
+          </w:p>
+        </w:tc>
+      </w:tr>
+      <w:tr>
+        <w:tc>
+          <w:tcPr>
+            <w:tcW w:type="dxa" w:w="1080"/>
+          </w:tcPr>
+          <w:p>
+            <w:r>
+              <w:rPr>
+                <w:sz w:val="13"/>
               </w:rPr>
               <w:t>Lov om kontroll med produkter og forbrukertjenester (Produktkontrolloven)</w:t>
             </w:r>
@@ -157,12 +285,12 @@
         </w:tc>
         <w:tc>
           <w:tcPr>
-            <w:tcW w:type="dxa" w:w="1234"/>
+            <w:tcW w:type="dxa" w:w="1080"/>
           </w:tcPr>
           <w:p>
             <w:r>
               <w:rPr>
-                <w:sz w:val="14"/>
+                <w:sz w:val="13"/>
               </w:rPr>
               <w:t>Act (Law)</w:t>
             </w:r>
@@ -170,12 +298,25 @@
         </w:tc>
         <w:tc>
           <w:tcPr>
-            <w:tcW w:type="dxa" w:w="1234"/>
+            <w:tcW w:type="dxa" w:w="1080"/>
           </w:tcPr>
           <w:p>
             <w:r>
               <w:rPr>
-                <w:sz w:val="14"/>
+                <w:sz w:val="13"/>
+              </w:rPr>
+              <w:t>1976</w:t>
+            </w:r>
+          </w:p>
+        </w:tc>
+        <w:tc>
+          <w:tcPr>
+            <w:tcW w:type="dxa" w:w="1080"/>
+          </w:tcPr>
+          <w:p>
+            <w:r>
+              <w:rPr>
+                <w:sz w:val="13"/>
               </w:rPr>
               <w:t>2024</w:t>
             </w:r>
@@ -183,12 +324,12 @@
         </w:tc>
         <w:tc>
           <w:tcPr>
-            <w:tcW w:type="dxa" w:w="1234"/>
+            <w:tcW w:type="dxa" w:w="1080"/>
           </w:tcPr>
           <w:p>
             <w:r>
               <w:rPr>
-                <w:sz w:val="14"/>
+                <w:sz w:val="13"/>
               </w:rPr>
               <w:t>Framework law authorising national product controls, including restrictions on plastic products placed on the Norwegian market and powers to implement EEA product rules.</w:t>
             </w:r>
@@ -196,12 +337,12 @@
         </w:tc>
         <w:tc>
           <w:tcPr>
-            <w:tcW w:type="dxa" w:w="1234"/>
+            <w:tcW w:type="dxa" w:w="1080"/>
           </w:tcPr>
           <w:p>
             <w:r>
               <w:rPr>
-                <w:sz w:val="14"/>
+                <w:sz w:val="13"/>
               </w:rPr>
               <w:t>All sectors; product manufacturing and trade</w:t>
             </w:r>
@@ -209,12 +350,12 @@
         </w:tc>
         <w:tc>
           <w:tcPr>
-            <w:tcW w:type="dxa" w:w="1234"/>
+            <w:tcW w:type="dxa" w:w="1080"/>
           </w:tcPr>
           <w:p>
             <w:r>
               <w:rPr>
-                <w:sz w:val="14"/>
+                <w:sz w:val="13"/>
               </w:rPr>
               <w:t>Production; Use/Consumption</w:t>
             </w:r>
@@ -222,15 +363,15 @@
         </w:tc>
         <w:tc>
           <w:tcPr>
-            <w:tcW w:type="dxa" w:w="1234"/>
+            <w:tcW w:type="dxa" w:w="1080"/>
           </w:tcPr>
           <w:p>
             <w:r>
               <w:rPr>
-                <w:sz w:val="14"/>
+                <w:sz w:val="13"/>
               </w:rPr>
             </w:r>
-            <w:hyperlink r:id="rId9">
+            <w:hyperlink r:id="rId10">
               <w:r>
                 <w:rPr>
                   <w:color w:val="0563C1"/>
@@ -245,12 +386,12 @@
       <w:tr>
         <w:tc>
           <w:tcPr>
-            <w:tcW w:type="dxa" w:w="1234"/>
+            <w:tcW w:type="dxa" w:w="1080"/>
           </w:tcPr>
           <w:p>
             <w:r>
               <w:rPr>
-                <w:sz w:val="14"/>
+                <w:sz w:val="13"/>
               </w:rPr>
               <w:t>Lov om vern mot forurensninger og om avfall (Forurensningsloven)</w:t>
             </w:r>
@@ -258,12 +399,12 @@
         </w:tc>
         <w:tc>
           <w:tcPr>
-            <w:tcW w:type="dxa" w:w="1234"/>
+            <w:tcW w:type="dxa" w:w="1080"/>
           </w:tcPr>
           <w:p>
             <w:r>
               <w:rPr>
-                <w:sz w:val="14"/>
+                <w:sz w:val="13"/>
               </w:rPr>
               <w:t>Act (Law)</w:t>
             </w:r>
@@ -271,12 +412,25 @@
         </w:tc>
         <w:tc>
           <w:tcPr>
-            <w:tcW w:type="dxa" w:w="1234"/>
+            <w:tcW w:type="dxa" w:w="1080"/>
           </w:tcPr>
           <w:p>
             <w:r>
               <w:rPr>
-                <w:sz w:val="14"/>
+                <w:sz w:val="13"/>
+              </w:rPr>
+              <w:t>1981</w:t>
+            </w:r>
+          </w:p>
+        </w:tc>
+        <w:tc>
+          <w:tcPr>
+            <w:tcW w:type="dxa" w:w="1080"/>
+          </w:tcPr>
+          <w:p>
+            <w:r>
+              <w:rPr>
+                <w:sz w:val="13"/>
               </w:rPr>
               <w:t>2024</w:t>
             </w:r>
@@ -284,25 +438,25 @@
         </w:tc>
         <w:tc>
           <w:tcPr>
-            <w:tcW w:type="dxa" w:w="1234"/>
+            <w:tcW w:type="dxa" w:w="1080"/>
           </w:tcPr>
           <w:p>
             <w:r>
               <w:rPr>
-                <w:sz w:val="14"/>
+                <w:sz w:val="13"/>
               </w:rPr>
-              <w:t>Principal environmental and waste law: prohibits littering, establishes waste hierarchy, municipal waste duties, producer responsibility powers, and legal basis for waste and pollution regulations affecting plastics.</w:t>
+              <w:t>Principal environmental and waste law: prohibits littering (§7), establishes waste hierarchy, municipal waste duties, producer responsibility powers, and legal basis for waste and pollution regulations affecting plastics.</w:t>
             </w:r>
           </w:p>
         </w:tc>
         <w:tc>
           <w:tcPr>
-            <w:tcW w:type="dxa" w:w="1234"/>
+            <w:tcW w:type="dxa" w:w="1080"/>
           </w:tcPr>
           <w:p>
             <w:r>
               <w:rPr>
-                <w:sz w:val="14"/>
+                <w:sz w:val="13"/>
               </w:rPr>
               <w:t>All sectors; municipalities; waste management; industry</w:t>
             </w:r>
@@ -310,12 +464,12 @@
         </w:tc>
         <w:tc>
           <w:tcPr>
-            <w:tcW w:type="dxa" w:w="1234"/>
+            <w:tcW w:type="dxa" w:w="1080"/>
           </w:tcPr>
           <w:p>
             <w:r>
               <w:rPr>
-                <w:sz w:val="14"/>
+                <w:sz w:val="13"/>
               </w:rPr>
               <w:t>End-of-life; Litter/Pollution; Production (indirect)</w:t>
             </w:r>
@@ -323,15 +477,15 @@
         </w:tc>
         <w:tc>
           <w:tcPr>
-            <w:tcW w:type="dxa" w:w="1234"/>
+            <w:tcW w:type="dxa" w:w="1080"/>
           </w:tcPr>
           <w:p>
             <w:r>
               <w:rPr>
-                <w:sz w:val="14"/>
+                <w:sz w:val="13"/>
               </w:rPr>
             </w:r>
-            <w:hyperlink r:id="rId10">
+            <w:hyperlink r:id="rId11">
               <w:r>
                 <w:rPr>
                   <w:color w:val="0563C1"/>
@@ -346,25 +500,139 @@
       <w:tr>
         <w:tc>
           <w:tcPr>
-            <w:tcW w:type="dxa" w:w="1234"/>
+            <w:tcW w:type="dxa" w:w="1080"/>
           </w:tcPr>
           <w:p>
             <w:r>
               <w:rPr>
-                <w:sz w:val="14"/>
+                <w:sz w:val="13"/>
               </w:rPr>
-              <w:t>Forskrift om særavgifter – Kap. 3-5: Avgifter på drikkevareemballasje (miljø- og grunnavgift)</w:t>
+              <w:t>Forskrift om merking av fiskeredskaper</w:t>
             </w:r>
           </w:p>
         </w:tc>
         <w:tc>
           <w:tcPr>
-            <w:tcW w:type="dxa" w:w="1234"/>
+            <w:tcW w:type="dxa" w:w="1080"/>
           </w:tcPr>
           <w:p>
             <w:r>
               <w:rPr>
-                <w:sz w:val="14"/>
+                <w:sz w:val="13"/>
+              </w:rPr>
+              <w:t>Regulation</w:t>
+            </w:r>
+          </w:p>
+        </w:tc>
+        <w:tc>
+          <w:tcPr>
+            <w:tcW w:type="dxa" w:w="1080"/>
+          </w:tcPr>
+          <w:p>
+            <w:r>
+              <w:rPr>
+                <w:sz w:val="13"/>
+              </w:rPr>
+              <w:t>1982</w:t>
+            </w:r>
+          </w:p>
+        </w:tc>
+        <w:tc>
+          <w:tcPr>
+            <w:tcW w:type="dxa" w:w="1080"/>
+          </w:tcPr>
+          <w:p>
+            <w:r>
+              <w:rPr>
+                <w:sz w:val="13"/>
+              </w:rPr>
+              <w:t>1982</w:t>
+            </w:r>
+          </w:p>
+        </w:tc>
+        <w:tc>
+          <w:tcPr>
+            <w:tcW w:type="dxa" w:w="1080"/>
+          </w:tcPr>
+          <w:p>
+            <w:r>
+              <w:rPr>
+                <w:sz w:val="13"/>
+              </w:rPr>
+              <w:t>Requires marking of fixed and drifting fishing gear in the Norwegian EEZ to identify owners; reduces lost gear and associated plastic marine litter (ghost fishing). In force from 1984.</w:t>
+            </w:r>
+          </w:p>
+        </w:tc>
+        <w:tc>
+          <w:tcPr>
+            <w:tcW w:type="dxa" w:w="1080"/>
+          </w:tcPr>
+          <w:p>
+            <w:r>
+              <w:rPr>
+                <w:sz w:val="13"/>
+              </w:rPr>
+              <w:t>Fisheries; aquaculture</w:t>
+            </w:r>
+          </w:p>
+        </w:tc>
+        <w:tc>
+          <w:tcPr>
+            <w:tcW w:type="dxa" w:w="1080"/>
+          </w:tcPr>
+          <w:p>
+            <w:r>
+              <w:rPr>
+                <w:sz w:val="13"/>
+              </w:rPr>
+              <w:t>Use/Consumption; Litter/Pollution</w:t>
+            </w:r>
+          </w:p>
+        </w:tc>
+        <w:tc>
+          <w:tcPr>
+            <w:tcW w:type="dxa" w:w="1080"/>
+          </w:tcPr>
+          <w:p>
+            <w:r>
+              <w:rPr>
+                <w:sz w:val="13"/>
+              </w:rPr>
+            </w:r>
+            <w:hyperlink r:id="rId12">
+              <w:r>
+                <w:rPr>
+                  <w:color w:val="0563C1"/>
+                  <w:u w:val="single"/>
+                </w:rPr>
+                <w:t>lovdata.no – Fiskeriredskapsmerking</w:t>
+              </w:r>
+            </w:hyperlink>
+          </w:p>
+        </w:tc>
+      </w:tr>
+      <w:tr>
+        <w:tc>
+          <w:tcPr>
+            <w:tcW w:type="dxa" w:w="1080"/>
+          </w:tcPr>
+          <w:p>
+            <w:r>
+              <w:rPr>
+                <w:sz w:val="13"/>
+              </w:rPr>
+              <w:t>Forskrift om særavgifter – Kap. 3-5: Avgifter på drikkevareemballasje</w:t>
+            </w:r>
+          </w:p>
+        </w:tc>
+        <w:tc>
+          <w:tcPr>
+            <w:tcW w:type="dxa" w:w="1080"/>
+          </w:tcPr>
+          <w:p>
+            <w:r>
+              <w:rPr>
+                <w:sz w:val="13"/>
               </w:rPr>
               <w:t>Regulation (Tax)</w:t>
             </w:r>
@@ -372,12 +640,25 @@
         </w:tc>
         <w:tc>
           <w:tcPr>
-            <w:tcW w:type="dxa" w:w="1234"/>
+            <w:tcW w:type="dxa" w:w="1080"/>
           </w:tcPr>
           <w:p>
             <w:r>
               <w:rPr>
-                <w:sz w:val="14"/>
+                <w:sz w:val="13"/>
+              </w:rPr>
+              <w:t>2001</w:t>
+            </w:r>
+          </w:p>
+        </w:tc>
+        <w:tc>
+          <w:tcPr>
+            <w:tcW w:type="dxa" w:w="1080"/>
+          </w:tcPr>
+          <w:p>
+            <w:r>
+              <w:rPr>
+                <w:sz w:val="13"/>
               </w:rPr>
               <w:t>2025</w:t>
             </w:r>
@@ -385,25 +666,25 @@
         </w:tc>
         <w:tc>
           <w:tcPr>
-            <w:tcW w:type="dxa" w:w="1234"/>
+            <w:tcW w:type="dxa" w:w="1080"/>
           </w:tcPr>
           <w:p>
             <w:r>
               <w:rPr>
-                <w:sz w:val="14"/>
+                <w:sz w:val="13"/>
               </w:rPr>
-              <w:t>Excise framework for beverage packaging including plastic bottles and cans; environmental tax incentivises return systems and recycling. Rates set annually by Storting.</w:t>
+              <w:t>Detailed excise rules for beverage packaging including plastic; works with annual Stortingsvedtak setting per-unit environmental and basic tax rates.</w:t>
             </w:r>
           </w:p>
         </w:tc>
         <w:tc>
           <w:tcPr>
-            <w:tcW w:type="dxa" w:w="1234"/>
+            <w:tcW w:type="dxa" w:w="1080"/>
           </w:tcPr>
           <w:p>
             <w:r>
               <w:rPr>
-                <w:sz w:val="14"/>
+                <w:sz w:val="13"/>
               </w:rPr>
               <w:t>Beverage; packaging; retail</w:t>
             </w:r>
@@ -411,12 +692,12 @@
         </w:tc>
         <w:tc>
           <w:tcPr>
-            <w:tcW w:type="dxa" w:w="1234"/>
+            <w:tcW w:type="dxa" w:w="1080"/>
           </w:tcPr>
           <w:p>
             <w:r>
               <w:rPr>
-                <w:sz w:val="14"/>
+                <w:sz w:val="13"/>
               </w:rPr>
               <w:t>Use/Consumption; End-of-life</w:t>
             </w:r>
@@ -424,15 +705,15 @@
         </w:tc>
         <w:tc>
           <w:tcPr>
-            <w:tcW w:type="dxa" w:w="1234"/>
+            <w:tcW w:type="dxa" w:w="1080"/>
           </w:tcPr>
           <w:p>
             <w:r>
               <w:rPr>
-                <w:sz w:val="14"/>
+                <w:sz w:val="13"/>
               </w:rPr>
             </w:r>
-            <w:hyperlink r:id="rId11">
+            <w:hyperlink r:id="rId13">
               <w:r>
                 <w:rPr>
                   <w:color w:val="0563C1"/>
@@ -447,12 +728,12 @@
       <w:tr>
         <w:tc>
           <w:tcPr>
-            <w:tcW w:type="dxa" w:w="1234"/>
+            <w:tcW w:type="dxa" w:w="1080"/>
           </w:tcPr>
           <w:p>
             <w:r>
               <w:rPr>
-                <w:sz w:val="14"/>
+                <w:sz w:val="13"/>
               </w:rPr>
               <w:t>Stortingsvedtak om avgifter på drikkevareemballasje for 2026</w:t>
             </w:r>
@@ -460,25 +741,38 @@
         </w:tc>
         <w:tc>
           <w:tcPr>
-            <w:tcW w:type="dxa" w:w="1234"/>
+            <w:tcW w:type="dxa" w:w="1080"/>
           </w:tcPr>
           <w:p>
             <w:r>
               <w:rPr>
-                <w:sz w:val="14"/>
+                <w:sz w:val="13"/>
               </w:rPr>
-              <w:t>Parliamentary resolution (Annual tax rates)</w:t>
+              <w:t>Parliamentary resolution</w:t>
             </w:r>
           </w:p>
         </w:tc>
         <w:tc>
           <w:tcPr>
-            <w:tcW w:type="dxa" w:w="1234"/>
+            <w:tcW w:type="dxa" w:w="1080"/>
           </w:tcPr>
           <w:p>
             <w:r>
               <w:rPr>
-                <w:sz w:val="14"/>
+                <w:sz w:val="13"/>
+              </w:rPr>
+              <w:t>2001</w:t>
+            </w:r>
+          </w:p>
+        </w:tc>
+        <w:tc>
+          <w:tcPr>
+            <w:tcW w:type="dxa" w:w="1080"/>
+          </w:tcPr>
+          <w:p>
+            <w:r>
+              <w:rPr>
+                <w:sz w:val="13"/>
               </w:rPr>
               <w:t>2025</w:t>
             </w:r>
@@ -486,25 +780,25 @@
         </w:tc>
         <w:tc>
           <w:tcPr>
-            <w:tcW w:type="dxa" w:w="1234"/>
+            <w:tcW w:type="dxa" w:w="1080"/>
           </w:tcPr>
           <w:p>
             <w:r>
               <w:rPr>
-                <w:sz w:val="14"/>
+                <w:sz w:val="13"/>
               </w:rPr>
-              <w:t>Sets annual environmental and basic excise rates on beverage packaging; 2026 rate for plastic packaging is NOK 4.27 per unit, with exemptions for packaging in approved deposit-return systems.</w:t>
+              <w:t>Annual rate-setting instrument; 2026 plastic packaging environmental tax NOK 4.27/unit with deposit-system exemptions.</w:t>
             </w:r>
           </w:p>
         </w:tc>
         <w:tc>
           <w:tcPr>
-            <w:tcW w:type="dxa" w:w="1234"/>
+            <w:tcW w:type="dxa" w:w="1080"/>
           </w:tcPr>
           <w:p>
             <w:r>
               <w:rPr>
-                <w:sz w:val="14"/>
+                <w:sz w:val="13"/>
               </w:rPr>
               <w:t>Beverage; plastic packaging</w:t>
             </w:r>
@@ -512,12 +806,12 @@
         </w:tc>
         <w:tc>
           <w:tcPr>
-            <w:tcW w:type="dxa" w:w="1234"/>
+            <w:tcW w:type="dxa" w:w="1080"/>
           </w:tcPr>
           <w:p>
             <w:r>
               <w:rPr>
-                <w:sz w:val="14"/>
+                <w:sz w:val="13"/>
               </w:rPr>
               <w:t>Use/Consumption; End-of-life</w:t>
             </w:r>
@@ -525,15 +819,15 @@
         </w:tc>
         <w:tc>
           <w:tcPr>
-            <w:tcW w:type="dxa" w:w="1234"/>
+            <w:tcW w:type="dxa" w:w="1080"/>
           </w:tcPr>
           <w:p>
             <w:r>
               <w:rPr>
-                <w:sz w:val="14"/>
+                <w:sz w:val="13"/>
               </w:rPr>
             </w:r>
-            <w:hyperlink r:id="rId12">
+            <w:hyperlink r:id="rId14">
               <w:r>
                 <w:rPr>
                   <w:color w:val="0563C1"/>
@@ -548,25 +842,25 @@
       <w:tr>
         <w:tc>
           <w:tcPr>
-            <w:tcW w:type="dxa" w:w="1234"/>
+            <w:tcW w:type="dxa" w:w="1080"/>
           </w:tcPr>
           <w:p>
             <w:r>
               <w:rPr>
-                <w:sz w:val="14"/>
+                <w:sz w:val="13"/>
               </w:rPr>
-              <w:t>Forskrift om begrensning av forurensning (Forurensningsforskriften) – Kap. 20: Levering og mottak av avfall fra skip</w:t>
+              <w:t>Avfallsforskriften – Kap. 15: Kommunalt avfallsgebyr</w:t>
             </w:r>
           </w:p>
         </w:tc>
         <w:tc>
           <w:tcPr>
-            <w:tcW w:type="dxa" w:w="1234"/>
+            <w:tcW w:type="dxa" w:w="1080"/>
           </w:tcPr>
           <w:p>
             <w:r>
               <w:rPr>
-                <w:sz w:val="14"/>
+                <w:sz w:val="13"/>
               </w:rPr>
               <w:t>Regulation</w:t>
             </w:r>
@@ -574,12 +868,139 @@
         </w:tc>
         <w:tc>
           <w:tcPr>
-            <w:tcW w:type="dxa" w:w="1234"/>
+            <w:tcW w:type="dxa" w:w="1080"/>
           </w:tcPr>
           <w:p>
             <w:r>
               <w:rPr>
-                <w:sz w:val="14"/>
+                <w:sz w:val="13"/>
+              </w:rPr>
+              <w:t>2004</w:t>
+            </w:r>
+          </w:p>
+        </w:tc>
+        <w:tc>
+          <w:tcPr>
+            <w:tcW w:type="dxa" w:w="1080"/>
+          </w:tcPr>
+          <w:p>
+            <w:r>
+              <w:rPr>
+                <w:sz w:val="13"/>
+              </w:rPr>
+              <w:t>2024</w:t>
+            </w:r>
+          </w:p>
+        </w:tc>
+        <w:tc>
+          <w:tcPr>
+            <w:tcW w:type="dxa" w:w="1080"/>
+          </w:tcPr>
+          <w:p>
+            <w:r>
+              <w:rPr>
+                <w:sz w:val="13"/>
+              </w:rPr>
+              <w:t>National rules for municipal household waste fees; enables and structures local (subnational) waste collection and treatment financing including plastic household waste.</w:t>
+            </w:r>
+          </w:p>
+        </w:tc>
+        <w:tc>
+          <w:tcPr>
+            <w:tcW w:type="dxa" w:w="1080"/>
+          </w:tcPr>
+          <w:p>
+            <w:r>
+              <w:rPr>
+                <w:sz w:val="13"/>
+              </w:rPr>
+              <w:t>Municipalities; households; waste management</w:t>
+            </w:r>
+          </w:p>
+        </w:tc>
+        <w:tc>
+          <w:tcPr>
+            <w:tcW w:type="dxa" w:w="1080"/>
+          </w:tcPr>
+          <w:p>
+            <w:r>
+              <w:rPr>
+                <w:sz w:val="13"/>
+              </w:rPr>
+              <w:t>End-of-life</w:t>
+            </w:r>
+          </w:p>
+        </w:tc>
+        <w:tc>
+          <w:tcPr>
+            <w:tcW w:type="dxa" w:w="1080"/>
+          </w:tcPr>
+          <w:p>
+            <w:r>
+              <w:rPr>
+                <w:sz w:val="13"/>
+              </w:rPr>
+            </w:r>
+            <w:hyperlink r:id="rId15">
+              <w:r>
+                <w:rPr>
+                  <w:color w:val="0563C1"/>
+                  <w:u w:val="single"/>
+                </w:rPr>
+                <w:t>lovdata.no – Avfallsforskriften kap. 15</w:t>
+              </w:r>
+            </w:hyperlink>
+          </w:p>
+        </w:tc>
+      </w:tr>
+      <w:tr>
+        <w:tc>
+          <w:tcPr>
+            <w:tcW w:type="dxa" w:w="1080"/>
+          </w:tcPr>
+          <w:p>
+            <w:r>
+              <w:rPr>
+                <w:sz w:val="13"/>
+              </w:rPr>
+              <w:t>Avfallsforskriften – Kap. 1: Kasserte elektriske og elektroniske produkter (EE-avfall)</w:t>
+            </w:r>
+          </w:p>
+        </w:tc>
+        <w:tc>
+          <w:tcPr>
+            <w:tcW w:type="dxa" w:w="1080"/>
+          </w:tcPr>
+          <w:p>
+            <w:r>
+              <w:rPr>
+                <w:sz w:val="13"/>
+              </w:rPr>
+              <w:t>Regulation</w:t>
+            </w:r>
+          </w:p>
+        </w:tc>
+        <w:tc>
+          <w:tcPr>
+            <w:tcW w:type="dxa" w:w="1080"/>
+          </w:tcPr>
+          <w:p>
+            <w:r>
+              <w:rPr>
+                <w:sz w:val="13"/>
+              </w:rPr>
+              <w:t>2004</w:t>
+            </w:r>
+          </w:p>
+        </w:tc>
+        <w:tc>
+          <w:tcPr>
+            <w:tcW w:type="dxa" w:w="1080"/>
+          </w:tcPr>
+          <w:p>
+            <w:r>
+              <w:rPr>
+                <w:sz w:val="13"/>
               </w:rPr>
               <w:t>2025</w:t>
             </w:r>
@@ -587,38 +1008,266 @@
         </w:tc>
         <w:tc>
           <w:tcPr>
-            <w:tcW w:type="dxa" w:w="1234"/>
+            <w:tcW w:type="dxa" w:w="1080"/>
           </w:tcPr>
           <w:p>
             <w:r>
               <w:rPr>
-                <w:sz w:val="14"/>
+                <w:sz w:val="13"/>
               </w:rPr>
-              <w:t>Requires port waste reception facilities and delivery of ship-generated waste (including plastics under MARPOL Annex V); supports sorting and recycling of ship waste and reduces marine plastic litter.</w:t>
+              <w:t>EPR for discarded electrical/electronic equipment containing significant plastics; requires collection, treatment and recycling nationwide.</w:t>
             </w:r>
           </w:p>
         </w:tc>
         <w:tc>
           <w:tcPr>
-            <w:tcW w:type="dxa" w:w="1234"/>
+            <w:tcW w:type="dxa" w:w="1080"/>
           </w:tcPr>
           <w:p>
             <w:r>
               <w:rPr>
-                <w:sz w:val="14"/>
+                <w:sz w:val="13"/>
               </w:rPr>
-              <w:t>Maritime; ports; fisheries; waste management</w:t>
+              <w:t>Electronics; retail; waste management</w:t>
             </w:r>
           </w:p>
         </w:tc>
         <w:tc>
           <w:tcPr>
-            <w:tcW w:type="dxa" w:w="1234"/>
+            <w:tcW w:type="dxa" w:w="1080"/>
           </w:tcPr>
           <w:p>
             <w:r>
               <w:rPr>
-                <w:sz w:val="14"/>
+                <w:sz w:val="13"/>
+              </w:rPr>
+              <w:t>End-of-life</w:t>
+            </w:r>
+          </w:p>
+        </w:tc>
+        <w:tc>
+          <w:tcPr>
+            <w:tcW w:type="dxa" w:w="1080"/>
+          </w:tcPr>
+          <w:p>
+            <w:r>
+              <w:rPr>
+                <w:sz w:val="13"/>
+              </w:rPr>
+            </w:r>
+            <w:hyperlink r:id="rId16">
+              <w:r>
+                <w:rPr>
+                  <w:color w:val="0563C1"/>
+                  <w:u w:val="single"/>
+                </w:rPr>
+                <w:t>lovdata.no – Avfallsforskriften kap. 1</w:t>
+              </w:r>
+            </w:hyperlink>
+          </w:p>
+        </w:tc>
+      </w:tr>
+      <w:tr>
+        <w:tc>
+          <w:tcPr>
+            <w:tcW w:type="dxa" w:w="1080"/>
+          </w:tcPr>
+          <w:p>
+            <w:r>
+              <w:rPr>
+                <w:sz w:val="13"/>
+              </w:rPr>
+              <w:t>Avfallsforskriften – Kap. 4: Kasserte kjøretøy</w:t>
+            </w:r>
+          </w:p>
+        </w:tc>
+        <w:tc>
+          <w:tcPr>
+            <w:tcW w:type="dxa" w:w="1080"/>
+          </w:tcPr>
+          <w:p>
+            <w:r>
+              <w:rPr>
+                <w:sz w:val="13"/>
+              </w:rPr>
+              <w:t>Regulation</w:t>
+            </w:r>
+          </w:p>
+        </w:tc>
+        <w:tc>
+          <w:tcPr>
+            <w:tcW w:type="dxa" w:w="1080"/>
+          </w:tcPr>
+          <w:p>
+            <w:r>
+              <w:rPr>
+                <w:sz w:val="13"/>
+              </w:rPr>
+              <w:t>2004</w:t>
+            </w:r>
+          </w:p>
+        </w:tc>
+        <w:tc>
+          <w:tcPr>
+            <w:tcW w:type="dxa" w:w="1080"/>
+          </w:tcPr>
+          <w:p>
+            <w:r>
+              <w:rPr>
+                <w:sz w:val="13"/>
+              </w:rPr>
+              <w:t>2024</w:t>
+            </w:r>
+          </w:p>
+        </w:tc>
+        <w:tc>
+          <w:tcPr>
+            <w:tcW w:type="dxa" w:w="1080"/>
+          </w:tcPr>
+          <w:p>
+            <w:r>
+              <w:rPr>
+                <w:sz w:val="13"/>
+              </w:rPr>
+              <w:t>EPR for end-of-life vehicles including plastic components (bumpers, interiors, etc.); mandates depollution, reuse and material recovery.</w:t>
+            </w:r>
+          </w:p>
+        </w:tc>
+        <w:tc>
+          <w:tcPr>
+            <w:tcW w:type="dxa" w:w="1080"/>
+          </w:tcPr>
+          <w:p>
+            <w:r>
+              <w:rPr>
+                <w:sz w:val="13"/>
+              </w:rPr>
+              <w:t>Automotive; waste management</w:t>
+            </w:r>
+          </w:p>
+        </w:tc>
+        <w:tc>
+          <w:tcPr>
+            <w:tcW w:type="dxa" w:w="1080"/>
+          </w:tcPr>
+          <w:p>
+            <w:r>
+              <w:rPr>
+                <w:sz w:val="13"/>
+              </w:rPr>
+              <w:t>End-of-life</w:t>
+            </w:r>
+          </w:p>
+        </w:tc>
+        <w:tc>
+          <w:tcPr>
+            <w:tcW w:type="dxa" w:w="1080"/>
+          </w:tcPr>
+          <w:p>
+            <w:r>
+              <w:rPr>
+                <w:sz w:val="13"/>
+              </w:rPr>
+            </w:r>
+            <w:hyperlink r:id="rId17">
+              <w:r>
+                <w:rPr>
+                  <w:color w:val="0563C1"/>
+                  <w:u w:val="single"/>
+                </w:rPr>
+                <w:t>lovdata.no – Avfallsforskriften kap. 4</w:t>
+              </w:r>
+            </w:hyperlink>
+          </w:p>
+        </w:tc>
+      </w:tr>
+      <w:tr>
+        <w:tc>
+          <w:tcPr>
+            <w:tcW w:type="dxa" w:w="1080"/>
+          </w:tcPr>
+          <w:p>
+            <w:r>
+              <w:rPr>
+                <w:sz w:val="13"/>
+              </w:rPr>
+              <w:t>Avfallsforskriften – Kap. 5: Kasserte dekk</w:t>
+            </w:r>
+          </w:p>
+        </w:tc>
+        <w:tc>
+          <w:tcPr>
+            <w:tcW w:type="dxa" w:w="1080"/>
+          </w:tcPr>
+          <w:p>
+            <w:r>
+              <w:rPr>
+                <w:sz w:val="13"/>
+              </w:rPr>
+              <w:t>Regulation</w:t>
+            </w:r>
+          </w:p>
+        </w:tc>
+        <w:tc>
+          <w:tcPr>
+            <w:tcW w:type="dxa" w:w="1080"/>
+          </w:tcPr>
+          <w:p>
+            <w:r>
+              <w:rPr>
+                <w:sz w:val="13"/>
+              </w:rPr>
+              <w:t>2004</w:t>
+            </w:r>
+          </w:p>
+        </w:tc>
+        <w:tc>
+          <w:tcPr>
+            <w:tcW w:type="dxa" w:w="1080"/>
+          </w:tcPr>
+          <w:p>
+            <w:r>
+              <w:rPr>
+                <w:sz w:val="13"/>
+              </w:rPr>
+              <w:t>2024</w:t>
+            </w:r>
+          </w:p>
+        </w:tc>
+        <w:tc>
+          <w:tcPr>
+            <w:tcW w:type="dxa" w:w="1080"/>
+          </w:tcPr>
+          <w:p>
+            <w:r>
+              <w:rPr>
+                <w:sz w:val="13"/>
+              </w:rPr>
+              <w:t>EPR for end-of-life tyres (synthetic rubber/plastic polymers); requires collection and recycling to reduce tyre waste and microplastic pollution.</w:t>
+            </w:r>
+          </w:p>
+        </w:tc>
+        <w:tc>
+          <w:tcPr>
+            <w:tcW w:type="dxa" w:w="1080"/>
+          </w:tcPr>
+          <w:p>
+            <w:r>
+              <w:rPr>
+                <w:sz w:val="13"/>
+              </w:rPr>
+              <w:t>Automotive; transport; waste management</w:t>
+            </w:r>
+          </w:p>
+        </w:tc>
+        <w:tc>
+          <w:tcPr>
+            <w:tcW w:type="dxa" w:w="1080"/>
+          </w:tcPr>
+          <w:p>
+            <w:r>
+              <w:rPr>
+                <w:sz w:val="13"/>
               </w:rPr>
               <w:t>End-of-life; Litter/Pollution</w:t>
             </w:r>
@@ -626,15 +1275,699 @@
         </w:tc>
         <w:tc>
           <w:tcPr>
-            <w:tcW w:type="dxa" w:w="1234"/>
+            <w:tcW w:type="dxa" w:w="1080"/>
           </w:tcPr>
           <w:p>
             <w:r>
               <w:rPr>
-                <w:sz w:val="14"/>
+                <w:sz w:val="13"/>
               </w:rPr>
             </w:r>
-            <w:hyperlink r:id="rId13">
+            <w:hyperlink r:id="rId18">
+              <w:r>
+                <w:rPr>
+                  <w:color w:val="0563C1"/>
+                  <w:u w:val="single"/>
+                </w:rPr>
+                <w:t>lovdata.no – Avfallsforskriften kap. 5</w:t>
+              </w:r>
+            </w:hyperlink>
+          </w:p>
+        </w:tc>
+      </w:tr>
+      <w:tr>
+        <w:tc>
+          <w:tcPr>
+            <w:tcW w:type="dxa" w:w="1080"/>
+          </w:tcPr>
+          <w:p>
+            <w:r>
+              <w:rPr>
+                <w:sz w:val="13"/>
+              </w:rPr>
+              <w:t>Avfallsforskriften – Kap. 6: Retursystemer for emballasje til drikkevarer (pant)</w:t>
+            </w:r>
+          </w:p>
+        </w:tc>
+        <w:tc>
+          <w:tcPr>
+            <w:tcW w:type="dxa" w:w="1080"/>
+          </w:tcPr>
+          <w:p>
+            <w:r>
+              <w:rPr>
+                <w:sz w:val="13"/>
+              </w:rPr>
+              <w:t>Regulation</w:t>
+            </w:r>
+          </w:p>
+        </w:tc>
+        <w:tc>
+          <w:tcPr>
+            <w:tcW w:type="dxa" w:w="1080"/>
+          </w:tcPr>
+          <w:p>
+            <w:r>
+              <w:rPr>
+                <w:sz w:val="13"/>
+              </w:rPr>
+              <w:t>2004</w:t>
+            </w:r>
+          </w:p>
+        </w:tc>
+        <w:tc>
+          <w:tcPr>
+            <w:tcW w:type="dxa" w:w="1080"/>
+          </w:tcPr>
+          <w:p>
+            <w:r>
+              <w:rPr>
+                <w:sz w:val="13"/>
+              </w:rPr>
+              <w:t>2025</w:t>
+            </w:r>
+          </w:p>
+        </w:tc>
+        <w:tc>
+          <w:tcPr>
+            <w:tcW w:type="dxa" w:w="1080"/>
+          </w:tcPr>
+          <w:p>
+            <w:r>
+              <w:rPr>
+                <w:sz w:val="13"/>
+              </w:rPr>
+              <w:t>Mandatory deposit-return system for beverage containers including plastic bottles; &gt;95% return rate target; retailer take-back and approved PRO requirements.</w:t>
+            </w:r>
+          </w:p>
+        </w:tc>
+        <w:tc>
+          <w:tcPr>
+            <w:tcW w:type="dxa" w:w="1080"/>
+          </w:tcPr>
+          <w:p>
+            <w:r>
+              <w:rPr>
+                <w:sz w:val="13"/>
+              </w:rPr>
+              <w:t>Beverage; retail; waste management</w:t>
+            </w:r>
+          </w:p>
+        </w:tc>
+        <w:tc>
+          <w:tcPr>
+            <w:tcW w:type="dxa" w:w="1080"/>
+          </w:tcPr>
+          <w:p>
+            <w:r>
+              <w:rPr>
+                <w:sz w:val="13"/>
+              </w:rPr>
+              <w:t>Use/Consumption; End-of-life; Litter/Pollution</w:t>
+            </w:r>
+          </w:p>
+        </w:tc>
+        <w:tc>
+          <w:tcPr>
+            <w:tcW w:type="dxa" w:w="1080"/>
+          </w:tcPr>
+          <w:p>
+            <w:r>
+              <w:rPr>
+                <w:sz w:val="13"/>
+              </w:rPr>
+            </w:r>
+            <w:hyperlink r:id="rId19">
+              <w:r>
+                <w:rPr>
+                  <w:color w:val="0563C1"/>
+                  <w:u w:val="single"/>
+                </w:rPr>
+                <w:t>lovdata.no – Avfallsforskriften kap. 6</w:t>
+              </w:r>
+            </w:hyperlink>
+          </w:p>
+        </w:tc>
+      </w:tr>
+      <w:tr>
+        <w:tc>
+          <w:tcPr>
+            <w:tcW w:type="dxa" w:w="1080"/>
+          </w:tcPr>
+          <w:p>
+            <w:r>
+              <w:rPr>
+                <w:sz w:val="13"/>
+              </w:rPr>
+              <w:t>Avfallsforskriften – Kap. 7: Emballasje og emballasjeavfall</w:t>
+            </w:r>
+          </w:p>
+        </w:tc>
+        <w:tc>
+          <w:tcPr>
+            <w:tcW w:type="dxa" w:w="1080"/>
+          </w:tcPr>
+          <w:p>
+            <w:r>
+              <w:rPr>
+                <w:sz w:val="13"/>
+              </w:rPr>
+              <w:t>Regulation</w:t>
+            </w:r>
+          </w:p>
+        </w:tc>
+        <w:tc>
+          <w:tcPr>
+            <w:tcW w:type="dxa" w:w="1080"/>
+          </w:tcPr>
+          <w:p>
+            <w:r>
+              <w:rPr>
+                <w:sz w:val="13"/>
+              </w:rPr>
+              <w:t>2004</w:t>
+            </w:r>
+          </w:p>
+        </w:tc>
+        <w:tc>
+          <w:tcPr>
+            <w:tcW w:type="dxa" w:w="1080"/>
+          </w:tcPr>
+          <w:p>
+            <w:r>
+              <w:rPr>
+                <w:sz w:val="13"/>
+              </w:rPr>
+              <w:t>2025</w:t>
+            </w:r>
+          </w:p>
+        </w:tc>
+        <w:tc>
+          <w:tcPr>
+            <w:tcW w:type="dxa" w:w="1080"/>
+          </w:tcPr>
+          <w:p>
+            <w:r>
+              <w:rPr>
+                <w:sz w:val="13"/>
+              </w:rPr>
+              <w:t>EPR for packaging including plastic; recycling targets (47% plastic from 2025), plastic carrier bag reporting, essential design requirements. Implements EU Packaging Directive framework.</w:t>
+            </w:r>
+          </w:p>
+        </w:tc>
+        <w:tc>
+          <w:tcPr>
+            <w:tcW w:type="dxa" w:w="1080"/>
+          </w:tcPr>
+          <w:p>
+            <w:r>
+              <w:rPr>
+                <w:sz w:val="13"/>
+              </w:rPr>
+              <w:t>Packaging; retail; manufacturing; waste management</w:t>
+            </w:r>
+          </w:p>
+        </w:tc>
+        <w:tc>
+          <w:tcPr>
+            <w:tcW w:type="dxa" w:w="1080"/>
+          </w:tcPr>
+          <w:p>
+            <w:r>
+              <w:rPr>
+                <w:sz w:val="13"/>
+              </w:rPr>
+              <w:t>Production; Design; End-of-life; Use/Consumption</w:t>
+            </w:r>
+          </w:p>
+        </w:tc>
+        <w:tc>
+          <w:tcPr>
+            <w:tcW w:type="dxa" w:w="1080"/>
+          </w:tcPr>
+          <w:p>
+            <w:r>
+              <w:rPr>
+                <w:sz w:val="13"/>
+              </w:rPr>
+            </w:r>
+            <w:hyperlink r:id="rId20">
+              <w:r>
+                <w:rPr>
+                  <w:color w:val="0563C1"/>
+                  <w:u w:val="single"/>
+                </w:rPr>
+                <w:t>lovdata.no – Avfallsforskriften kap. 7</w:t>
+              </w:r>
+            </w:hyperlink>
+          </w:p>
+        </w:tc>
+      </w:tr>
+      <w:tr>
+        <w:tc>
+          <w:tcPr>
+            <w:tcW w:type="dxa" w:w="1080"/>
+          </w:tcPr>
+          <w:p>
+            <w:r>
+              <w:rPr>
+                <w:sz w:val="13"/>
+              </w:rPr>
+              <w:t>Forskrift om begrensning av forurensning (Forurensningsforskriften)</w:t>
+            </w:r>
+          </w:p>
+        </w:tc>
+        <w:tc>
+          <w:tcPr>
+            <w:tcW w:type="dxa" w:w="1080"/>
+          </w:tcPr>
+          <w:p>
+            <w:r>
+              <w:rPr>
+                <w:sz w:val="13"/>
+              </w:rPr>
+              <w:t>Regulation</w:t>
+            </w:r>
+          </w:p>
+        </w:tc>
+        <w:tc>
+          <w:tcPr>
+            <w:tcW w:type="dxa" w:w="1080"/>
+          </w:tcPr>
+          <w:p>
+            <w:r>
+              <w:rPr>
+                <w:sz w:val="13"/>
+              </w:rPr>
+              <w:t>2004</w:t>
+            </w:r>
+          </w:p>
+        </w:tc>
+        <w:tc>
+          <w:tcPr>
+            <w:tcW w:type="dxa" w:w="1080"/>
+          </w:tcPr>
+          <w:p>
+            <w:r>
+              <w:rPr>
+                <w:sz w:val="13"/>
+              </w:rPr>
+              <w:t>2026</w:t>
+            </w:r>
+          </w:p>
+        </w:tc>
+        <w:tc>
+          <w:tcPr>
+            <w:tcW w:type="dxa" w:w="1080"/>
+          </w:tcPr>
+          <w:p>
+            <w:r>
+              <w:rPr>
+                <w:sz w:val="13"/>
+              </w:rPr>
+              <w:t>Principal pollution regulation; includes ship waste reception, artificial turf/microplastic controls, and discharge rules indirectly preventing plastic pollution to water.</w:t>
+            </w:r>
+          </w:p>
+        </w:tc>
+        <w:tc>
+          <w:tcPr>
+            <w:tcW w:type="dxa" w:w="1080"/>
+          </w:tcPr>
+          <w:p>
+            <w:r>
+              <w:rPr>
+                <w:sz w:val="13"/>
+              </w:rPr>
+              <w:t>Industry; maritime; municipalities</w:t>
+            </w:r>
+          </w:p>
+        </w:tc>
+        <w:tc>
+          <w:tcPr>
+            <w:tcW w:type="dxa" w:w="1080"/>
+          </w:tcPr>
+          <w:p>
+            <w:r>
+              <w:rPr>
+                <w:sz w:val="13"/>
+              </w:rPr>
+              <w:t>Litter/Pollution; End-of-life</w:t>
+            </w:r>
+          </w:p>
+        </w:tc>
+        <w:tc>
+          <w:tcPr>
+            <w:tcW w:type="dxa" w:w="1080"/>
+          </w:tcPr>
+          <w:p>
+            <w:r>
+              <w:rPr>
+                <w:sz w:val="13"/>
+              </w:rPr>
+            </w:r>
+            <w:hyperlink r:id="rId21">
+              <w:r>
+                <w:rPr>
+                  <w:color w:val="0563C1"/>
+                  <w:u w:val="single"/>
+                </w:rPr>
+                <w:t>lovdata.no – Forurensningsforskriften</w:t>
+              </w:r>
+            </w:hyperlink>
+          </w:p>
+        </w:tc>
+      </w:tr>
+      <w:tr>
+        <w:tc>
+          <w:tcPr>
+            <w:tcW w:type="dxa" w:w="1080"/>
+          </w:tcPr>
+          <w:p>
+            <w:r>
+              <w:rPr>
+                <w:sz w:val="13"/>
+              </w:rPr>
+              <w:t>Forskrift om begrensning i bruk av helse- og miljøfarlige kjemikalier (Produktforskriften)</w:t>
+            </w:r>
+          </w:p>
+        </w:tc>
+        <w:tc>
+          <w:tcPr>
+            <w:tcW w:type="dxa" w:w="1080"/>
+          </w:tcPr>
+          <w:p>
+            <w:r>
+              <w:rPr>
+                <w:sz w:val="13"/>
+              </w:rPr>
+              <w:t>Regulation</w:t>
+            </w:r>
+          </w:p>
+        </w:tc>
+        <w:tc>
+          <w:tcPr>
+            <w:tcW w:type="dxa" w:w="1080"/>
+          </w:tcPr>
+          <w:p>
+            <w:r>
+              <w:rPr>
+                <w:sz w:val="13"/>
+              </w:rPr>
+              <w:t>2004</w:t>
+            </w:r>
+          </w:p>
+        </w:tc>
+        <w:tc>
+          <w:tcPr>
+            <w:tcW w:type="dxa" w:w="1080"/>
+          </w:tcPr>
+          <w:p>
+            <w:r>
+              <w:rPr>
+                <w:sz w:val="13"/>
+              </w:rPr>
+              <w:t>2026</w:t>
+            </w:r>
+          </w:p>
+        </w:tc>
+        <w:tc>
+          <w:tcPr>
+            <w:tcW w:type="dxa" w:w="1080"/>
+          </w:tcPr>
+          <w:p>
+            <w:r>
+              <w:rPr>
+                <w:sz w:val="13"/>
+              </w:rPr>
+              <w:t>Umbrella product regulation implementing EU/EEA chemical and product rules; parent instrument for Chapter 2b plastic product measures and other substance restrictions relevant to plastics.</w:t>
+            </w:r>
+          </w:p>
+        </w:tc>
+        <w:tc>
+          <w:tcPr>
+            <w:tcW w:type="dxa" w:w="1080"/>
+          </w:tcPr>
+          <w:p>
+            <w:r>
+              <w:rPr>
+                <w:sz w:val="13"/>
+              </w:rPr>
+              <w:t>Manufacturing; retail; chemicals</w:t>
+            </w:r>
+          </w:p>
+        </w:tc>
+        <w:tc>
+          <w:tcPr>
+            <w:tcW w:type="dxa" w:w="1080"/>
+          </w:tcPr>
+          <w:p>
+            <w:r>
+              <w:rPr>
+                <w:sz w:val="13"/>
+              </w:rPr>
+              <w:t>Production; Use/Consumption</w:t>
+            </w:r>
+          </w:p>
+        </w:tc>
+        <w:tc>
+          <w:tcPr>
+            <w:tcW w:type="dxa" w:w="1080"/>
+          </w:tcPr>
+          <w:p>
+            <w:r>
+              <w:rPr>
+                <w:sz w:val="13"/>
+              </w:rPr>
+            </w:r>
+            <w:hyperlink r:id="rId22">
+              <w:r>
+                <w:rPr>
+                  <w:color w:val="0563C1"/>
+                  <w:u w:val="single"/>
+                </w:rPr>
+                <w:t>lovdata.no – Produktforskriften</w:t>
+              </w:r>
+            </w:hyperlink>
+          </w:p>
+        </w:tc>
+      </w:tr>
+      <w:tr>
+        <w:tc>
+          <w:tcPr>
+            <w:tcW w:type="dxa" w:w="1080"/>
+          </w:tcPr>
+          <w:p>
+            <w:r>
+              <w:rPr>
+                <w:sz w:val="13"/>
+              </w:rPr>
+              <w:t>Forskrift om gjenvinning og behandling av avfall (Avfallsforskriften)</w:t>
+            </w:r>
+          </w:p>
+        </w:tc>
+        <w:tc>
+          <w:tcPr>
+            <w:tcW w:type="dxa" w:w="1080"/>
+          </w:tcPr>
+          <w:p>
+            <w:r>
+              <w:rPr>
+                <w:sz w:val="13"/>
+              </w:rPr>
+              <w:t>Regulation</w:t>
+            </w:r>
+          </w:p>
+        </w:tc>
+        <w:tc>
+          <w:tcPr>
+            <w:tcW w:type="dxa" w:w="1080"/>
+          </w:tcPr>
+          <w:p>
+            <w:r>
+              <w:rPr>
+                <w:sz w:val="13"/>
+              </w:rPr>
+              <w:t>2004</w:t>
+            </w:r>
+          </w:p>
+        </w:tc>
+        <w:tc>
+          <w:tcPr>
+            <w:tcW w:type="dxa" w:w="1080"/>
+          </w:tcPr>
+          <w:p>
+            <w:r>
+              <w:rPr>
+                <w:sz w:val="13"/>
+              </w:rPr>
+              <w:t>2025</w:t>
+            </w:r>
+          </w:p>
+        </w:tc>
+        <w:tc>
+          <w:tcPr>
+            <w:tcW w:type="dxa" w:w="1080"/>
+          </w:tcPr>
+          <w:p>
+            <w:r>
+              <w:rPr>
+                <w:sz w:val="13"/>
+              </w:rPr>
+              <w:t>Central waste regulation implementing EU waste directives; establishes producer responsibility schemes, municipal duties, and treatment rules for many plastic-containing waste streams.</w:t>
+            </w:r>
+          </w:p>
+        </w:tc>
+        <w:tc>
+          <w:tcPr>
+            <w:tcW w:type="dxa" w:w="1080"/>
+          </w:tcPr>
+          <w:p>
+            <w:r>
+              <w:rPr>
+                <w:sz w:val="13"/>
+              </w:rPr>
+              <w:t>Waste management; municipalities; all sectors</w:t>
+            </w:r>
+          </w:p>
+        </w:tc>
+        <w:tc>
+          <w:tcPr>
+            <w:tcW w:type="dxa" w:w="1080"/>
+          </w:tcPr>
+          <w:p>
+            <w:r>
+              <w:rPr>
+                <w:sz w:val="13"/>
+              </w:rPr>
+              <w:t>End-of-life; Litter/Pollution</w:t>
+            </w:r>
+          </w:p>
+        </w:tc>
+        <w:tc>
+          <w:tcPr>
+            <w:tcW w:type="dxa" w:w="1080"/>
+          </w:tcPr>
+          <w:p>
+            <w:r>
+              <w:rPr>
+                <w:sz w:val="13"/>
+              </w:rPr>
+            </w:r>
+            <w:hyperlink r:id="rId23">
+              <w:r>
+                <w:rPr>
+                  <w:color w:val="0563C1"/>
+                  <w:u w:val="single"/>
+                </w:rPr>
+                <w:t>lovdata.no – Avfallsforskriften</w:t>
+              </w:r>
+            </w:hyperlink>
+          </w:p>
+        </w:tc>
+      </w:tr>
+      <w:tr>
+        <w:tc>
+          <w:tcPr>
+            <w:tcW w:type="dxa" w:w="1080"/>
+          </w:tcPr>
+          <w:p>
+            <w:r>
+              <w:rPr>
+                <w:sz w:val="13"/>
+              </w:rPr>
+              <w:t>Forurensningsforskriften – Kap. 20: Levering og mottak av avfall fra skip</w:t>
+            </w:r>
+          </w:p>
+        </w:tc>
+        <w:tc>
+          <w:tcPr>
+            <w:tcW w:type="dxa" w:w="1080"/>
+          </w:tcPr>
+          <w:p>
+            <w:r>
+              <w:rPr>
+                <w:sz w:val="13"/>
+              </w:rPr>
+              <w:t>Regulation</w:t>
+            </w:r>
+          </w:p>
+        </w:tc>
+        <w:tc>
+          <w:tcPr>
+            <w:tcW w:type="dxa" w:w="1080"/>
+          </w:tcPr>
+          <w:p>
+            <w:r>
+              <w:rPr>
+                <w:sz w:val="13"/>
+              </w:rPr>
+              <w:t>2004</w:t>
+            </w:r>
+          </w:p>
+        </w:tc>
+        <w:tc>
+          <w:tcPr>
+            <w:tcW w:type="dxa" w:w="1080"/>
+          </w:tcPr>
+          <w:p>
+            <w:r>
+              <w:rPr>
+                <w:sz w:val="13"/>
+              </w:rPr>
+              <w:t>2025</w:t>
+            </w:r>
+          </w:p>
+        </w:tc>
+        <w:tc>
+          <w:tcPr>
+            <w:tcW w:type="dxa" w:w="1080"/>
+          </w:tcPr>
+          <w:p>
+            <w:r>
+              <w:rPr>
+                <w:sz w:val="13"/>
+              </w:rPr>
+              <w:t>Port waste reception facilities; mandatory delivery of ship waste including plastics (MARPOL Annex V); sorting and recycling obligations.</w:t>
+            </w:r>
+          </w:p>
+        </w:tc>
+        <w:tc>
+          <w:tcPr>
+            <w:tcW w:type="dxa" w:w="1080"/>
+          </w:tcPr>
+          <w:p>
+            <w:r>
+              <w:rPr>
+                <w:sz w:val="13"/>
+              </w:rPr>
+              <w:t>Maritime; ports; fisheries</w:t>
+            </w:r>
+          </w:p>
+        </w:tc>
+        <w:tc>
+          <w:tcPr>
+            <w:tcW w:type="dxa" w:w="1080"/>
+          </w:tcPr>
+          <w:p>
+            <w:r>
+              <w:rPr>
+                <w:sz w:val="13"/>
+              </w:rPr>
+              <w:t>End-of-life; Litter/Pollution</w:t>
+            </w:r>
+          </w:p>
+        </w:tc>
+        <w:tc>
+          <w:tcPr>
+            <w:tcW w:type="dxa" w:w="1080"/>
+          </w:tcPr>
+          <w:p>
+            <w:r>
+              <w:rPr>
+                <w:sz w:val="13"/>
+              </w:rPr>
+            </w:r>
+            <w:hyperlink r:id="rId24">
               <w:r>
                 <w:rPr>
                   <w:color w:val="0563C1"/>
@@ -649,25 +1982,25 @@
       <w:tr>
         <w:tc>
           <w:tcPr>
-            <w:tcW w:type="dxa" w:w="1234"/>
+            <w:tcW w:type="dxa" w:w="1080"/>
           </w:tcPr>
           <w:p>
             <w:r>
               <w:rPr>
-                <w:sz w:val="14"/>
+                <w:sz w:val="13"/>
               </w:rPr>
-              <w:t>Forskrift om gjenvinning og behandling av avfall (Avfallsforskriften) – Kap. 5: Innsamling og gjenvinning av kasserte dekk</w:t>
+              <w:t>Forskrift om registrering, vurdering, godkjenning og begrensning av kjemikalier (REACH-forskriften)</w:t>
             </w:r>
           </w:p>
         </w:tc>
         <w:tc>
           <w:tcPr>
-            <w:tcW w:type="dxa" w:w="1234"/>
+            <w:tcW w:type="dxa" w:w="1080"/>
           </w:tcPr>
           <w:p>
             <w:r>
               <w:rPr>
-                <w:sz w:val="14"/>
+                <w:sz w:val="13"/>
               </w:rPr>
               <w:t>Regulation</w:t>
             </w:r>
@@ -675,315 +2008,25 @@
         </w:tc>
         <w:tc>
           <w:tcPr>
-            <w:tcW w:type="dxa" w:w="1234"/>
+            <w:tcW w:type="dxa" w:w="1080"/>
           </w:tcPr>
           <w:p>
             <w:r>
               <w:rPr>
-                <w:sz w:val="14"/>
+                <w:sz w:val="13"/>
               </w:rPr>
-              <w:t>2024</w:t>
+              <w:t>2008</w:t>
             </w:r>
           </w:p>
         </w:tc>
         <w:tc>
           <w:tcPr>
-            <w:tcW w:type="dxa" w:w="1234"/>
+            <w:tcW w:type="dxa" w:w="1080"/>
           </w:tcPr>
           <w:p>
             <w:r>
               <w:rPr>
-                <w:sz w:val="14"/>
-              </w:rPr>
-              <w:t>Producer responsibility for end-of-life tyres (largely synthetic rubber/plastic polymers); requires collection and recycling, reducing tyre waste that contributes to microplastic pollution.</w:t>
-            </w:r>
-          </w:p>
-        </w:tc>
-        <w:tc>
-          <w:tcPr>
-            <w:tcW w:type="dxa" w:w="1234"/>
-          </w:tcPr>
-          <w:p>
-            <w:r>
-              <w:rPr>
-                <w:sz w:val="14"/>
-              </w:rPr>
-              <w:t>Automotive; transport; waste management</w:t>
-            </w:r>
-          </w:p>
-        </w:tc>
-        <w:tc>
-          <w:tcPr>
-            <w:tcW w:type="dxa" w:w="1234"/>
-          </w:tcPr>
-          <w:p>
-            <w:r>
-              <w:rPr>
-                <w:sz w:val="14"/>
-              </w:rPr>
-              <w:t>End-of-life; Litter/Pollution</w:t>
-            </w:r>
-          </w:p>
-        </w:tc>
-        <w:tc>
-          <w:tcPr>
-            <w:tcW w:type="dxa" w:w="1234"/>
-          </w:tcPr>
-          <w:p>
-            <w:r>
-              <w:rPr>
-                <w:sz w:val="14"/>
-              </w:rPr>
-            </w:r>
-            <w:hyperlink r:id="rId14">
-              <w:r>
-                <w:rPr>
-                  <w:color w:val="0563C1"/>
-                  <w:u w:val="single"/>
-                </w:rPr>
-                <w:t>lovdata.no – Avfallsforskriften kap. 5</w:t>
-              </w:r>
-            </w:hyperlink>
-          </w:p>
-        </w:tc>
-      </w:tr>
-      <w:tr>
-        <w:tc>
-          <w:tcPr>
-            <w:tcW w:type="dxa" w:w="1234"/>
-          </w:tcPr>
-          <w:p>
-            <w:r>
-              <w:rPr>
-                <w:sz w:val="14"/>
-              </w:rPr>
-              <w:t>Forskrift om gjenvinning og behandling av avfall (Avfallsforskriften) – Kap. 6: Retursystemer for emballasje til drikkevarer</w:t>
-            </w:r>
-          </w:p>
-        </w:tc>
-        <w:tc>
-          <w:tcPr>
-            <w:tcW w:type="dxa" w:w="1234"/>
-          </w:tcPr>
-          <w:p>
-            <w:r>
-              <w:rPr>
-                <w:sz w:val="14"/>
-              </w:rPr>
-              <w:t>Regulation</w:t>
-            </w:r>
-          </w:p>
-        </w:tc>
-        <w:tc>
-          <w:tcPr>
-            <w:tcW w:type="dxa" w:w="1234"/>
-          </w:tcPr>
-          <w:p>
-            <w:r>
-              <w:rPr>
-                <w:sz w:val="14"/>
-              </w:rPr>
-              <w:t>2025</w:t>
-            </w:r>
-          </w:p>
-        </w:tc>
-        <w:tc>
-          <w:tcPr>
-            <w:tcW w:type="dxa" w:w="1234"/>
-          </w:tcPr>
-          <w:p>
-            <w:r>
-              <w:rPr>
-                <w:sz w:val="14"/>
-              </w:rPr>
-              <w:t>Mandatory deposit-return system (pant) for beverage containers including plastic bottles; requires approved return systems, minimum return rates, labelling, and retailer take-back obligations.</w:t>
-            </w:r>
-          </w:p>
-        </w:tc>
-        <w:tc>
-          <w:tcPr>
-            <w:tcW w:type="dxa" w:w="1234"/>
-          </w:tcPr>
-          <w:p>
-            <w:r>
-              <w:rPr>
-                <w:sz w:val="14"/>
-              </w:rPr>
-              <w:t>Beverage; retail; waste management</w:t>
-            </w:r>
-          </w:p>
-        </w:tc>
-        <w:tc>
-          <w:tcPr>
-            <w:tcW w:type="dxa" w:w="1234"/>
-          </w:tcPr>
-          <w:p>
-            <w:r>
-              <w:rPr>
-                <w:sz w:val="14"/>
-              </w:rPr>
-              <w:t>Use/Consumption; End-of-life; Litter/Pollution</w:t>
-            </w:r>
-          </w:p>
-        </w:tc>
-        <w:tc>
-          <w:tcPr>
-            <w:tcW w:type="dxa" w:w="1234"/>
-          </w:tcPr>
-          <w:p>
-            <w:r>
-              <w:rPr>
-                <w:sz w:val="14"/>
-              </w:rPr>
-            </w:r>
-            <w:hyperlink r:id="rId15">
-              <w:r>
-                <w:rPr>
-                  <w:color w:val="0563C1"/>
-                  <w:u w:val="single"/>
-                </w:rPr>
-                <w:t>lovdata.no – Avfallsforskriften kap. 6</w:t>
-              </w:r>
-            </w:hyperlink>
-          </w:p>
-        </w:tc>
-      </w:tr>
-      <w:tr>
-        <w:tc>
-          <w:tcPr>
-            <w:tcW w:type="dxa" w:w="1234"/>
-          </w:tcPr>
-          <w:p>
-            <w:r>
-              <w:rPr>
-                <w:sz w:val="14"/>
-              </w:rPr>
-              <w:t>Forskrift om gjenvinning og behandling av avfall (Avfallsforskriften) – Kap. 7: Emballasje og emballasjeavfall</w:t>
-            </w:r>
-          </w:p>
-        </w:tc>
-        <w:tc>
-          <w:tcPr>
-            <w:tcW w:type="dxa" w:w="1234"/>
-          </w:tcPr>
-          <w:p>
-            <w:r>
-              <w:rPr>
-                <w:sz w:val="14"/>
-              </w:rPr>
-              <w:t>Regulation</w:t>
-            </w:r>
-          </w:p>
-        </w:tc>
-        <w:tc>
-          <w:tcPr>
-            <w:tcW w:type="dxa" w:w="1234"/>
-          </w:tcPr>
-          <w:p>
-            <w:r>
-              <w:rPr>
-                <w:sz w:val="14"/>
-              </w:rPr>
-              <w:t>2025</w:t>
-            </w:r>
-          </w:p>
-        </w:tc>
-        <w:tc>
-          <w:tcPr>
-            <w:tcW w:type="dxa" w:w="1234"/>
-          </w:tcPr>
-          <w:p>
-            <w:r>
-              <w:rPr>
-                <w:sz w:val="14"/>
-              </w:rPr>
-              <w:t>Extended producer responsibility for packaging including plastic; sets material recycling targets (47% plastic from 2025, 52% by 2030), reporting on plastic carrier bags, and essential packaging design requirements.</w:t>
-            </w:r>
-          </w:p>
-        </w:tc>
-        <w:tc>
-          <w:tcPr>
-            <w:tcW w:type="dxa" w:w="1234"/>
-          </w:tcPr>
-          <w:p>
-            <w:r>
-              <w:rPr>
-                <w:sz w:val="14"/>
-              </w:rPr>
-              <w:t>Packaging; retail; manufacturing; waste management</w:t>
-            </w:r>
-          </w:p>
-        </w:tc>
-        <w:tc>
-          <w:tcPr>
-            <w:tcW w:type="dxa" w:w="1234"/>
-          </w:tcPr>
-          <w:p>
-            <w:r>
-              <w:rPr>
-                <w:sz w:val="14"/>
-              </w:rPr>
-              <w:t>Production; Design; End-of-life; Use/Consumption</w:t>
-            </w:r>
-          </w:p>
-        </w:tc>
-        <w:tc>
-          <w:tcPr>
-            <w:tcW w:type="dxa" w:w="1234"/>
-          </w:tcPr>
-          <w:p>
-            <w:r>
-              <w:rPr>
-                <w:sz w:val="14"/>
-              </w:rPr>
-            </w:r>
-            <w:hyperlink r:id="rId16">
-              <w:r>
-                <w:rPr>
-                  <w:color w:val="0563C1"/>
-                  <w:u w:val="single"/>
-                </w:rPr>
-                <w:t>lovdata.no – Avfallsforskriften kap. 7</w:t>
-              </w:r>
-            </w:hyperlink>
-          </w:p>
-        </w:tc>
-      </w:tr>
-      <w:tr>
-        <w:tc>
-          <w:tcPr>
-            <w:tcW w:type="dxa" w:w="1234"/>
-          </w:tcPr>
-          <w:p>
-            <w:r>
-              <w:rPr>
-                <w:sz w:val="14"/>
-              </w:rPr>
-              <w:t>Forskrift om registrering, vurdering, godkjenning og begrensning av kjemikalier (REACH-forskriften)</w:t>
-            </w:r>
-          </w:p>
-        </w:tc>
-        <w:tc>
-          <w:tcPr>
-            <w:tcW w:type="dxa" w:w="1234"/>
-          </w:tcPr>
-          <w:p>
-            <w:r>
-              <w:rPr>
-                <w:sz w:val="14"/>
-              </w:rPr>
-              <w:t>Regulation</w:t>
-            </w:r>
-          </w:p>
-        </w:tc>
-        <w:tc>
-          <w:tcPr>
-            <w:tcW w:type="dxa" w:w="1234"/>
-          </w:tcPr>
-          <w:p>
-            <w:r>
-              <w:rPr>
-                <w:sz w:val="14"/>
+                <w:sz w:val="13"/>
               </w:rPr>
               <w:t>2026</w:t>
             </w:r>
@@ -991,38 +2034,38 @@
         </w:tc>
         <w:tc>
           <w:tcPr>
-            <w:tcW w:type="dxa" w:w="1234"/>
+            <w:tcW w:type="dxa" w:w="1080"/>
           </w:tcPr>
           <w:p>
             <w:r>
               <w:rPr>
-                <w:sz w:val="14"/>
+                <w:sz w:val="13"/>
               </w:rPr>
-              <w:t>Norwegian implementation of EU REACH; includes restriction on intentionally added microplastics (synthetic polymer microparticles) effective in Norway from 17 March 2025, with phased market bans by product category.</w:t>
+              <w:t>Norwegian REACH implementation; includes restriction on intentionally added microplastics (effective Norway 17 March 2025) with phased market bans.</w:t>
             </w:r>
           </w:p>
         </w:tc>
         <w:tc>
           <w:tcPr>
-            <w:tcW w:type="dxa" w:w="1234"/>
+            <w:tcW w:type="dxa" w:w="1080"/>
           </w:tcPr>
           <w:p>
             <w:r>
               <w:rPr>
-                <w:sz w:val="14"/>
+                <w:sz w:val="13"/>
               </w:rPr>
-              <w:t>Cosmetics; detergents; agriculture; sports surfaces; chemicals; manufacturing</w:t>
+              <w:t>Cosmetics; detergents; chemicals; manufacturing</w:t>
             </w:r>
           </w:p>
         </w:tc>
         <w:tc>
           <w:tcPr>
-            <w:tcW w:type="dxa" w:w="1234"/>
+            <w:tcW w:type="dxa" w:w="1080"/>
           </w:tcPr>
           <w:p>
             <w:r>
               <w:rPr>
-                <w:sz w:val="14"/>
+                <w:sz w:val="13"/>
               </w:rPr>
               <w:t>Production; Use/Consumption; Litter/Pollution</w:t>
             </w:r>
@@ -1030,15 +2073,15 @@
         </w:tc>
         <w:tc>
           <w:tcPr>
-            <w:tcW w:type="dxa" w:w="1234"/>
+            <w:tcW w:type="dxa" w:w="1080"/>
           </w:tcPr>
           <w:p>
             <w:r>
               <w:rPr>
-                <w:sz w:val="14"/>
+                <w:sz w:val="13"/>
               </w:rPr>
             </w:r>
-            <w:hyperlink r:id="rId17">
+            <w:hyperlink r:id="rId25">
               <w:r>
                 <w:rPr>
                   <w:color w:val="0563C1"/>
@@ -1053,25 +2096,25 @@
       <w:tr>
         <w:tc>
           <w:tcPr>
-            <w:tcW w:type="dxa" w:w="1234"/>
+            <w:tcW w:type="dxa" w:w="1080"/>
           </w:tcPr>
           <w:p>
             <w:r>
               <w:rPr>
-                <w:sz w:val="14"/>
+                <w:sz w:val="13"/>
               </w:rPr>
-              <w:t>Forskrift om miljømessig sikkerhet for skip og flyttbare innretninger – § 11: MARPOL vedlegg V (søppelforurensing)</w:t>
+              <w:t>Forskrift om miljømessig sikkerhet for skip – § 11: MARPOL vedlegg V</w:t>
             </w:r>
           </w:p>
         </w:tc>
         <w:tc>
           <w:tcPr>
-            <w:tcW w:type="dxa" w:w="1234"/>
+            <w:tcW w:type="dxa" w:w="1080"/>
           </w:tcPr>
           <w:p>
             <w:r>
               <w:rPr>
-                <w:sz w:val="14"/>
+                <w:sz w:val="13"/>
               </w:rPr>
               <w:t>Regulation</w:t>
             </w:r>
@@ -1079,12 +2122,25 @@
         </w:tc>
         <w:tc>
           <w:tcPr>
-            <w:tcW w:type="dxa" w:w="1234"/>
+            <w:tcW w:type="dxa" w:w="1080"/>
           </w:tcPr>
           <w:p>
             <w:r>
               <w:rPr>
-                <w:sz w:val="14"/>
+                <w:sz w:val="13"/>
+              </w:rPr>
+              <w:t>2012</w:t>
+            </w:r>
+          </w:p>
+        </w:tc>
+        <w:tc>
+          <w:tcPr>
+            <w:tcW w:type="dxa" w:w="1080"/>
+          </w:tcPr>
+          <w:p>
+            <w:r>
+              <w:rPr>
+                <w:sz w:val="13"/>
               </w:rPr>
               <w:t>2025</w:t>
             </w:r>
@@ -1092,25 +2148,25 @@
         </w:tc>
         <w:tc>
           <w:tcPr>
-            <w:tcW w:type="dxa" w:w="1234"/>
+            <w:tcW w:type="dxa" w:w="1080"/>
           </w:tcPr>
           <w:p>
             <w:r>
               <w:rPr>
-                <w:sz w:val="14"/>
+                <w:sz w:val="13"/>
               </w:rPr>
-              <w:t>Incorporates MARPOL Annex V (2022 consolidated edition) prohibiting discharge of garbage including plastics at sea; requires onboard storage, waste record books, and delivery to port reception facilities.</w:t>
+              <w:t>Incorporates MARPOL Annex V prohibiting discharge of garbage including plastics at sea; onboard storage and port delivery requirements.</w:t>
             </w:r>
           </w:p>
         </w:tc>
         <w:tc>
           <w:tcPr>
-            <w:tcW w:type="dxa" w:w="1234"/>
+            <w:tcW w:type="dxa" w:w="1080"/>
           </w:tcPr>
           <w:p>
             <w:r>
               <w:rPr>
-                <w:sz w:val="14"/>
+                <w:sz w:val="13"/>
               </w:rPr>
               <w:t>Maritime; offshore; fisheries</w:t>
             </w:r>
@@ -1118,12 +2174,12 @@
         </w:tc>
         <w:tc>
           <w:tcPr>
-            <w:tcW w:type="dxa" w:w="1234"/>
+            <w:tcW w:type="dxa" w:w="1080"/>
           </w:tcPr>
           <w:p>
             <w:r>
               <w:rPr>
-                <w:sz w:val="14"/>
+                <w:sz w:val="13"/>
               </w:rPr>
               <w:t>Use/Consumption; Litter/Pollution</w:t>
             </w:r>
@@ -1131,15 +2187,15 @@
         </w:tc>
         <w:tc>
           <w:tcPr>
-            <w:tcW w:type="dxa" w:w="1234"/>
+            <w:tcW w:type="dxa" w:w="1080"/>
           </w:tcPr>
           <w:p>
             <w:r>
               <w:rPr>
-                <w:sz w:val="14"/>
+                <w:sz w:val="13"/>
               </w:rPr>
             </w:r>
-            <w:hyperlink r:id="rId18">
+            <w:hyperlink r:id="rId26">
               <w:r>
                 <w:rPr>
                   <w:color w:val="0563C1"/>
@@ -1154,12 +2210,12 @@
       <w:tr>
         <w:tc>
           <w:tcPr>
-            <w:tcW w:type="dxa" w:w="1234"/>
+            <w:tcW w:type="dxa" w:w="1080"/>
           </w:tcPr>
           <w:p>
             <w:r>
               <w:rPr>
-                <w:sz w:val="14"/>
+                <w:sz w:val="13"/>
               </w:rPr>
               <w:t>Meld. St. 45 (2016–2017) – Kap. 7: Marin forsøpling og mikroplast</w:t>
             </w:r>
@@ -1167,12 +2223,12 @@
         </w:tc>
         <w:tc>
           <w:tcPr>
-            <w:tcW w:type="dxa" w:w="1234"/>
+            <w:tcW w:type="dxa" w:w="1080"/>
           </w:tcPr>
           <w:p>
             <w:r>
               <w:rPr>
-                <w:sz w:val="14"/>
+                <w:sz w:val="13"/>
               </w:rPr>
               <w:t>Government white paper / Strategy</w:t>
             </w:r>
@@ -1180,12 +2236,12 @@
         </w:tc>
         <w:tc>
           <w:tcPr>
-            <w:tcW w:type="dxa" w:w="1234"/>
+            <w:tcW w:type="dxa" w:w="1080"/>
           </w:tcPr>
           <w:p>
             <w:r>
               <w:rPr>
-                <w:sz w:val="14"/>
+                <w:sz w:val="13"/>
               </w:rPr>
               <w:t>2017</w:t>
             </w:r>
@@ -1193,60 +2249,73 @@
         </w:tc>
         <w:tc>
           <w:tcPr>
-            <w:tcW w:type="dxa" w:w="1234"/>
+            <w:tcW w:type="dxa" w:w="1080"/>
           </w:tcPr>
           <w:p>
             <w:r>
               <w:rPr>
-                <w:sz w:val="14"/>
+                <w:sz w:val="13"/>
               </w:rPr>
-              <w:t>National strategy chapter on marine litter and microplastics; responds to Parliament's request for a microplastics action plan; sets ambitions to prevent plastic and microplastic inputs to marine and freshwater environments.</w:t>
+              <w:t>2017</w:t>
             </w:r>
           </w:p>
         </w:tc>
         <w:tc>
           <w:tcPr>
-            <w:tcW w:type="dxa" w:w="1234"/>
+            <w:tcW w:type="dxa" w:w="1080"/>
           </w:tcPr>
           <w:p>
             <w:r>
               <w:rPr>
-                <w:sz w:val="14"/>
+                <w:sz w:val="13"/>
               </w:rPr>
-              <w:t>Marine; fisheries; municipalities; industry</w:t>
+              <w:t>National strategy on marine litter and microplastics; Parliament-requested microplastics action plan framework.</w:t>
             </w:r>
           </w:p>
         </w:tc>
         <w:tc>
           <w:tcPr>
-            <w:tcW w:type="dxa" w:w="1234"/>
+            <w:tcW w:type="dxa" w:w="1080"/>
           </w:tcPr>
           <w:p>
             <w:r>
               <w:rPr>
-                <w:sz w:val="14"/>
+                <w:sz w:val="13"/>
               </w:rPr>
-              <w:t>Litter/Pollution; End-of-life; Production (indirect)</w:t>
+              <w:t>Marine; fisheries; municipalities</w:t>
             </w:r>
           </w:p>
         </w:tc>
         <w:tc>
           <w:tcPr>
-            <w:tcW w:type="dxa" w:w="1234"/>
+            <w:tcW w:type="dxa" w:w="1080"/>
           </w:tcPr>
           <w:p>
             <w:r>
               <w:rPr>
-                <w:sz w:val="14"/>
+                <w:sz w:val="13"/>
+              </w:rPr>
+              <w:t>Litter/Pollution; End-of-life</w:t>
+            </w:r>
+          </w:p>
+        </w:tc>
+        <w:tc>
+          <w:tcPr>
+            <w:tcW w:type="dxa" w:w="1080"/>
+          </w:tcPr>
+          <w:p>
+            <w:r>
+              <w:rPr>
+                <w:sz w:val="13"/>
               </w:rPr>
             </w:r>
-            <w:hyperlink r:id="rId19">
+            <w:hyperlink r:id="rId27">
               <w:r>
                 <w:rPr>
                   <w:color w:val="0563C1"/>
                   <w:u w:val="single"/>
                 </w:rPr>
-                <w:t>regjeringen.no – Meld. St. 45 (2016–2017) kap. 7</w:t>
+                <w:t>regjeringen.no – Meld. St. 45 kap. 7</w:t>
               </w:r>
             </w:hyperlink>
           </w:p>
@@ -1255,25 +2324,139 @@
       <w:tr>
         <w:tc>
           <w:tcPr>
-            <w:tcW w:type="dxa" w:w="1234"/>
+            <w:tcW w:type="dxa" w:w="1080"/>
           </w:tcPr>
           <w:p>
             <w:r>
               <w:rPr>
-                <w:sz w:val="14"/>
+                <w:sz w:val="13"/>
               </w:rPr>
-              <w:t>Forskrift om begrensning av forurensning (Forurensningsforskriften) – Kap. 23A: Idrettsbaner med plastholdig løst fyllmateriale</w:t>
+              <w:t>Forskrift om endring i produktforskriften (forbud mot enkelte plastprodukter) – 18.12.2020 nr. 3200</w:t>
             </w:r>
           </w:p>
         </w:tc>
         <w:tc>
           <w:tcPr>
-            <w:tcW w:type="dxa" w:w="1234"/>
+            <w:tcW w:type="dxa" w:w="1080"/>
           </w:tcPr>
           <w:p>
             <w:r>
               <w:rPr>
-                <w:sz w:val="14"/>
+                <w:sz w:val="13"/>
+              </w:rPr>
+              <w:t>Regulation (amending)</w:t>
+            </w:r>
+          </w:p>
+        </w:tc>
+        <w:tc>
+          <w:tcPr>
+            <w:tcW w:type="dxa" w:w="1080"/>
+          </w:tcPr>
+          <w:p>
+            <w:r>
+              <w:rPr>
+                <w:sz w:val="13"/>
+              </w:rPr>
+              <w:t>2021</w:t>
+            </w:r>
+          </w:p>
+        </w:tc>
+        <w:tc>
+          <w:tcPr>
+            <w:tcW w:type="dxa" w:w="1080"/>
+          </w:tcPr>
+          <w:p>
+            <w:r>
+              <w:rPr>
+                <w:sz w:val="13"/>
+              </w:rPr>
+              <w:t>2021</w:t>
+            </w:r>
+          </w:p>
+        </w:tc>
+        <w:tc>
+          <w:tcPr>
+            <w:tcW w:type="dxa" w:w="1080"/>
+          </w:tcPr>
+          <w:p>
+            <w:r>
+              <w:rPr>
+                <w:sz w:val="13"/>
+              </w:rPr>
+              <w:t>Adopted Chapter 2b and SUP bans (cutlery, straws, EPS food containers, oxo-degradable plastic, etc.); entered into force 3 July 2021. Parent chapter now in Produktforskriften kap. 2b.</w:t>
+            </w:r>
+          </w:p>
+        </w:tc>
+        <w:tc>
+          <w:tcPr>
+            <w:tcW w:type="dxa" w:w="1080"/>
+          </w:tcPr>
+          <w:p>
+            <w:r>
+              <w:rPr>
+                <w:sz w:val="13"/>
+              </w:rPr>
+              <w:t>Retail; food service; manufacturing</w:t>
+            </w:r>
+          </w:p>
+        </w:tc>
+        <w:tc>
+          <w:tcPr>
+            <w:tcW w:type="dxa" w:w="1080"/>
+          </w:tcPr>
+          <w:p>
+            <w:r>
+              <w:rPr>
+                <w:sz w:val="13"/>
+              </w:rPr>
+              <w:t>Production; Use/Consumption; Litter/Pollution</w:t>
+            </w:r>
+          </w:p>
+        </w:tc>
+        <w:tc>
+          <w:tcPr>
+            <w:tcW w:type="dxa" w:w="1080"/>
+          </w:tcPr>
+          <w:p>
+            <w:r>
+              <w:rPr>
+                <w:sz w:val="13"/>
+              </w:rPr>
+            </w:r>
+            <w:hyperlink r:id="rId28">
+              <w:r>
+                <w:rPr>
+                  <w:color w:val="0563C1"/>
+                  <w:u w:val="single"/>
+                </w:rPr>
+                <w:t>lovdata.no – Forskrift 2020-12-18-3200</w:t>
+              </w:r>
+            </w:hyperlink>
+          </w:p>
+        </w:tc>
+      </w:tr>
+      <w:tr>
+        <w:tc>
+          <w:tcPr>
+            <w:tcW w:type="dxa" w:w="1080"/>
+          </w:tcPr>
+          <w:p>
+            <w:r>
+              <w:rPr>
+                <w:sz w:val="13"/>
+              </w:rPr>
+              <w:t>Forurensningsforskriften – Kap. 23A: Idrettsbaner med plastholdig fyllmateriale</w:t>
+            </w:r>
+          </w:p>
+        </w:tc>
+        <w:tc>
+          <w:tcPr>
+            <w:tcW w:type="dxa" w:w="1080"/>
+          </w:tcPr>
+          <w:p>
+            <w:r>
+              <w:rPr>
+                <w:sz w:val="13"/>
               </w:rPr>
               <w:t>Regulation</w:t>
             </w:r>
@@ -1281,12 +2464,12 @@
         </w:tc>
         <w:tc>
           <w:tcPr>
-            <w:tcW w:type="dxa" w:w="1234"/>
+            <w:tcW w:type="dxa" w:w="1080"/>
           </w:tcPr>
           <w:p>
             <w:r>
               <w:rPr>
-                <w:sz w:val="14"/>
+                <w:sz w:val="13"/>
               </w:rPr>
               <w:t>2021</w:t>
             </w:r>
@@ -1294,25 +2477,38 @@
         </w:tc>
         <w:tc>
           <w:tcPr>
-            <w:tcW w:type="dxa" w:w="1234"/>
+            <w:tcW w:type="dxa" w:w="1080"/>
           </w:tcPr>
           <w:p>
             <w:r>
               <w:rPr>
-                <w:sz w:val="14"/>
+                <w:sz w:val="13"/>
               </w:rPr>
-              <w:t>Requirements for design and operation of sports surfaces using plastic infill (e.g. artificial turf rubber granulate): physical barriers, snow handling, granulate management, and substitution assessments to prevent microplastic spread.</w:t>
+              <w:t>2021</w:t>
             </w:r>
           </w:p>
         </w:tc>
         <w:tc>
           <w:tcPr>
-            <w:tcW w:type="dxa" w:w="1234"/>
+            <w:tcW w:type="dxa" w:w="1080"/>
           </w:tcPr>
           <w:p>
             <w:r>
               <w:rPr>
-                <w:sz w:val="14"/>
+                <w:sz w:val="13"/>
+              </w:rPr>
+              <w:t>Design and operation rules for artificial turf and sports surfaces using plastic infill; barriers and granulate management to prevent microplastic spread. In force 1 July 2021.</w:t>
+            </w:r>
+          </w:p>
+        </w:tc>
+        <w:tc>
+          <w:tcPr>
+            <w:tcW w:type="dxa" w:w="1080"/>
+          </w:tcPr>
+          <w:p>
+            <w:r>
+              <w:rPr>
+                <w:sz w:val="13"/>
               </w:rPr>
               <w:t>Sports; municipalities; construction</w:t>
             </w:r>
@@ -1320,12 +2516,12 @@
         </w:tc>
         <w:tc>
           <w:tcPr>
-            <w:tcW w:type="dxa" w:w="1234"/>
+            <w:tcW w:type="dxa" w:w="1080"/>
           </w:tcPr>
           <w:p>
             <w:r>
               <w:rPr>
-                <w:sz w:val="14"/>
+                <w:sz w:val="13"/>
               </w:rPr>
               <w:t>Use/Consumption; Litter/Pollution</w:t>
             </w:r>
@@ -1333,15 +2529,15 @@
         </w:tc>
         <w:tc>
           <w:tcPr>
-            <w:tcW w:type="dxa" w:w="1234"/>
+            <w:tcW w:type="dxa" w:w="1080"/>
           </w:tcPr>
           <w:p>
             <w:r>
               <w:rPr>
-                <w:sz w:val="14"/>
+                <w:sz w:val="13"/>
               </w:rPr>
             </w:r>
-            <w:hyperlink r:id="rId20">
+            <w:hyperlink r:id="rId29">
               <w:r>
                 <w:rPr>
                   <w:color w:val="0563C1"/>
@@ -1356,25 +2552,25 @@
       <w:tr>
         <w:tc>
           <w:tcPr>
-            <w:tcW w:type="dxa" w:w="1234"/>
+            <w:tcW w:type="dxa" w:w="1080"/>
           </w:tcPr>
           <w:p>
             <w:r>
               <w:rPr>
-                <w:sz w:val="14"/>
+                <w:sz w:val="13"/>
               </w:rPr>
-              <w:t>Forskrift om begrensning i bruk av helse- og miljøfarlige kjemikalier og andre produkter (Produktforskriften) – Kap. 2b: Regulering av enkelte produkter av plast</w:t>
+              <w:t>Høstingsforskriften – Kap. XV–XVI: Merking og tap av fiskeredskap</w:t>
             </w:r>
           </w:p>
         </w:tc>
         <w:tc>
           <w:tcPr>
-            <w:tcW w:type="dxa" w:w="1234"/>
+            <w:tcW w:type="dxa" w:w="1080"/>
           </w:tcPr>
           <w:p>
             <w:r>
               <w:rPr>
-                <w:sz w:val="14"/>
+                <w:sz w:val="13"/>
               </w:rPr>
               <w:t>Regulation</w:t>
             </w:r>
@@ -1382,12 +2578,367 @@
         </w:tc>
         <w:tc>
           <w:tcPr>
-            <w:tcW w:type="dxa" w:w="1234"/>
+            <w:tcW w:type="dxa" w:w="1080"/>
           </w:tcPr>
           <w:p>
             <w:r>
               <w:rPr>
-                <w:sz w:val="14"/>
+                <w:sz w:val="13"/>
+              </w:rPr>
+              <w:t>2021</w:t>
+            </w:r>
+          </w:p>
+        </w:tc>
+        <w:tc>
+          <w:tcPr>
+            <w:tcW w:type="dxa" w:w="1080"/>
+          </w:tcPr>
+          <w:p>
+            <w:r>
+              <w:rPr>
+                <w:sz w:val="13"/>
+              </w:rPr>
+              <w:t>2025</w:t>
+            </w:r>
+          </w:p>
+        </w:tc>
+        <w:tc>
+          <w:tcPr>
+            <w:tcW w:type="dxa" w:w="1080"/>
+          </w:tcPr>
+          <w:p>
+            <w:r>
+              <w:rPr>
+                <w:sz w:val="13"/>
+              </w:rPr>
+              <w:t>Modern fisheries regulation on gear marking and lost-gear prevention for plastic-containing fishing equipment.</w:t>
+            </w:r>
+          </w:p>
+        </w:tc>
+        <w:tc>
+          <w:tcPr>
+            <w:tcW w:type="dxa" w:w="1080"/>
+          </w:tcPr>
+          <w:p>
+            <w:r>
+              <w:rPr>
+                <w:sz w:val="13"/>
+              </w:rPr>
+              <w:t>Fisheries; aquaculture; recreational fishing</w:t>
+            </w:r>
+          </w:p>
+        </w:tc>
+        <w:tc>
+          <w:tcPr>
+            <w:tcW w:type="dxa" w:w="1080"/>
+          </w:tcPr>
+          <w:p>
+            <w:r>
+              <w:rPr>
+                <w:sz w:val="13"/>
+              </w:rPr>
+              <w:t>Use/Consumption; Litter/Pollution</w:t>
+            </w:r>
+          </w:p>
+        </w:tc>
+        <w:tc>
+          <w:tcPr>
+            <w:tcW w:type="dxa" w:w="1080"/>
+          </w:tcPr>
+          <w:p>
+            <w:r>
+              <w:rPr>
+                <w:sz w:val="13"/>
+              </w:rPr>
+            </w:r>
+            <w:hyperlink r:id="rId30">
+              <w:r>
+                <w:rPr>
+                  <w:color w:val="0563C1"/>
+                  <w:u w:val="single"/>
+                </w:rPr>
+                <w:t>lovdata.no – Høstingsforskriften kap. XVI</w:t>
+              </w:r>
+            </w:hyperlink>
+          </w:p>
+        </w:tc>
+      </w:tr>
+      <w:tr>
+        <w:tc>
+          <w:tcPr>
+            <w:tcW w:type="dxa" w:w="1080"/>
+          </w:tcPr>
+          <w:p>
+            <w:r>
+              <w:rPr>
+                <w:sz w:val="13"/>
+              </w:rPr>
+              <w:t>Nasjonal strategi for ein grøn, sirkulær økonomi</w:t>
+            </w:r>
+          </w:p>
+        </w:tc>
+        <w:tc>
+          <w:tcPr>
+            <w:tcW w:type="dxa" w:w="1080"/>
+          </w:tcPr>
+          <w:p>
+            <w:r>
+              <w:rPr>
+                <w:sz w:val="13"/>
+              </w:rPr>
+              <w:t>National strategy</w:t>
+            </w:r>
+          </w:p>
+        </w:tc>
+        <w:tc>
+          <w:tcPr>
+            <w:tcW w:type="dxa" w:w="1080"/>
+          </w:tcPr>
+          <w:p>
+            <w:r>
+              <w:rPr>
+                <w:sz w:val="13"/>
+              </w:rPr>
+              <w:t>2021</w:t>
+            </w:r>
+          </w:p>
+        </w:tc>
+        <w:tc>
+          <w:tcPr>
+            <w:tcW w:type="dxa" w:w="1080"/>
+          </w:tcPr>
+          <w:p>
+            <w:r>
+              <w:rPr>
+                <w:sz w:val="13"/>
+              </w:rPr>
+              <w:t>2021</w:t>
+            </w:r>
+          </w:p>
+        </w:tc>
+        <w:tc>
+          <w:tcPr>
+            <w:tcW w:type="dxa" w:w="1080"/>
+          </w:tcPr>
+          <w:p>
+            <w:r>
+              <w:rPr>
+                <w:sz w:val="13"/>
+              </w:rPr>
+              <w:t>Circular economy strategy including plastics measures to reduce marine litter and strengthen recycling.</w:t>
+            </w:r>
+          </w:p>
+        </w:tc>
+        <w:tc>
+          <w:tcPr>
+            <w:tcW w:type="dxa" w:w="1080"/>
+          </w:tcPr>
+          <w:p>
+            <w:r>
+              <w:rPr>
+                <w:sz w:val="13"/>
+              </w:rPr>
+              <w:t>All sectors</w:t>
+            </w:r>
+          </w:p>
+        </w:tc>
+        <w:tc>
+          <w:tcPr>
+            <w:tcW w:type="dxa" w:w="1080"/>
+          </w:tcPr>
+          <w:p>
+            <w:r>
+              <w:rPr>
+                <w:sz w:val="13"/>
+              </w:rPr>
+              <w:t>Production; End-of-life; Use/Consumption</w:t>
+            </w:r>
+          </w:p>
+        </w:tc>
+        <w:tc>
+          <w:tcPr>
+            <w:tcW w:type="dxa" w:w="1080"/>
+          </w:tcPr>
+          <w:p>
+            <w:r>
+              <w:rPr>
+                <w:sz w:val="13"/>
+              </w:rPr>
+            </w:r>
+            <w:hyperlink r:id="rId31">
+              <w:r>
+                <w:rPr>
+                  <w:color w:val="0563C1"/>
+                  <w:u w:val="single"/>
+                </w:rPr>
+                <w:t>regjeringen.no – Sirkulærøkonomistrategi</w:t>
+              </w:r>
+            </w:hyperlink>
+          </w:p>
+        </w:tc>
+      </w:tr>
+      <w:tr>
+        <w:tc>
+          <w:tcPr>
+            <w:tcW w:type="dxa" w:w="1080"/>
+          </w:tcPr>
+          <w:p>
+            <w:r>
+              <w:rPr>
+                <w:sz w:val="13"/>
+              </w:rPr>
+              <w:t>Noregs plaststrategi</w:t>
+            </w:r>
+          </w:p>
+        </w:tc>
+        <w:tc>
+          <w:tcPr>
+            <w:tcW w:type="dxa" w:w="1080"/>
+          </w:tcPr>
+          <w:p>
+            <w:r>
+              <w:rPr>
+                <w:sz w:val="13"/>
+              </w:rPr>
+              <w:t>National strategy / Action plan</w:t>
+            </w:r>
+          </w:p>
+        </w:tc>
+        <w:tc>
+          <w:tcPr>
+            <w:tcW w:type="dxa" w:w="1080"/>
+          </w:tcPr>
+          <w:p>
+            <w:r>
+              <w:rPr>
+                <w:sz w:val="13"/>
+              </w:rPr>
+              <w:t>2021</w:t>
+            </w:r>
+          </w:p>
+        </w:tc>
+        <w:tc>
+          <w:tcPr>
+            <w:tcW w:type="dxa" w:w="1080"/>
+          </w:tcPr>
+          <w:p>
+            <w:r>
+              <w:rPr>
+                <w:sz w:val="13"/>
+              </w:rPr>
+              <w:t>2021</w:t>
+            </w:r>
+          </w:p>
+        </w:tc>
+        <w:tc>
+          <w:tcPr>
+            <w:tcW w:type="dxa" w:w="1080"/>
+          </w:tcPr>
+          <w:p>
+            <w:r>
+              <w:rPr>
+                <w:sz w:val="13"/>
+              </w:rPr>
+              <w:t>Comprehensive national plastics management plan across the full lifecycle; Norway's national example of a plastics management plan.</w:t>
+            </w:r>
+          </w:p>
+        </w:tc>
+        <w:tc>
+          <w:tcPr>
+            <w:tcW w:type="dxa" w:w="1080"/>
+          </w:tcPr>
+          <w:p>
+            <w:r>
+              <w:rPr>
+                <w:sz w:val="13"/>
+              </w:rPr>
+              <w:t>All sectors; fisheries; municipalities</w:t>
+            </w:r>
+          </w:p>
+        </w:tc>
+        <w:tc>
+          <w:tcPr>
+            <w:tcW w:type="dxa" w:w="1080"/>
+          </w:tcPr>
+          <w:p>
+            <w:r>
+              <w:rPr>
+                <w:sz w:val="13"/>
+              </w:rPr>
+              <w:t>Production; Use/Consumption; End-of-life; Litter/Pollution</w:t>
+            </w:r>
+          </w:p>
+        </w:tc>
+        <w:tc>
+          <w:tcPr>
+            <w:tcW w:type="dxa" w:w="1080"/>
+          </w:tcPr>
+          <w:p>
+            <w:r>
+              <w:rPr>
+                <w:sz w:val="13"/>
+              </w:rPr>
+            </w:r>
+            <w:hyperlink r:id="rId32">
+              <w:r>
+                <w:rPr>
+                  <w:color w:val="0563C1"/>
+                  <w:u w:val="single"/>
+                </w:rPr>
+                <w:t>regjeringen.no – Noregs plaststrategi</w:t>
+              </w:r>
+            </w:hyperlink>
+          </w:p>
+        </w:tc>
+      </w:tr>
+      <w:tr>
+        <w:tc>
+          <w:tcPr>
+            <w:tcW w:type="dxa" w:w="1080"/>
+          </w:tcPr>
+          <w:p>
+            <w:r>
+              <w:rPr>
+                <w:sz w:val="13"/>
+              </w:rPr>
+              <w:t>Produktforskriften – Kap. 2b: Regulering av enkelte produkter av plast</w:t>
+            </w:r>
+          </w:p>
+        </w:tc>
+        <w:tc>
+          <w:tcPr>
+            <w:tcW w:type="dxa" w:w="1080"/>
+          </w:tcPr>
+          <w:p>
+            <w:r>
+              <w:rPr>
+                <w:sz w:val="13"/>
+              </w:rPr>
+              <w:t>Regulation</w:t>
+            </w:r>
+          </w:p>
+        </w:tc>
+        <w:tc>
+          <w:tcPr>
+            <w:tcW w:type="dxa" w:w="1080"/>
+          </w:tcPr>
+          <w:p>
+            <w:r>
+              <w:rPr>
+                <w:sz w:val="13"/>
+              </w:rPr>
+              <w:t>2021</w:t>
+            </w:r>
+          </w:p>
+        </w:tc>
+        <w:tc>
+          <w:tcPr>
+            <w:tcW w:type="dxa" w:w="1080"/>
+          </w:tcPr>
+          <w:p>
+            <w:r>
+              <w:rPr>
+                <w:sz w:val="13"/>
               </w:rPr>
               <w:t>2026</w:t>
             </w:r>
@@ -1395,25 +2946,25 @@
         </w:tc>
         <w:tc>
           <w:tcPr>
-            <w:tcW w:type="dxa" w:w="1234"/>
+            <w:tcW w:type="dxa" w:w="1080"/>
           </w:tcPr>
           <w:p>
             <w:r>
               <w:rPr>
-                <w:sz w:val="14"/>
+                <w:sz w:val="13"/>
               </w:rPr>
-              <w:t>Implements EU Single-Use Plastics rules: bans on certain SUP items and oxo-degradable plastic; marking requirements; tethered caps on plastic beverage containers; minimum 25% recycled PET in bottles from 2025.</w:t>
+              <w:t>Ongoing SUP rules: product bans, marking, tethered caps, 25% recycled PET in bottles from 2025. Chapter added 2021; subsequently amended.</w:t>
             </w:r>
           </w:p>
         </w:tc>
         <w:tc>
           <w:tcPr>
-            <w:tcW w:type="dxa" w:w="1234"/>
+            <w:tcW w:type="dxa" w:w="1080"/>
           </w:tcPr>
           <w:p>
             <w:r>
               <w:rPr>
-                <w:sz w:val="14"/>
+                <w:sz w:val="13"/>
               </w:rPr>
               <w:t>Retail; food service; cosmetics; manufacturing</w:t>
             </w:r>
@@ -1421,12 +2972,12 @@
         </w:tc>
         <w:tc>
           <w:tcPr>
-            <w:tcW w:type="dxa" w:w="1234"/>
+            <w:tcW w:type="dxa" w:w="1080"/>
           </w:tcPr>
           <w:p>
             <w:r>
               <w:rPr>
-                <w:sz w:val="14"/>
+                <w:sz w:val="13"/>
               </w:rPr>
               <w:t>Production; Design; Use/Consumption; Litter/Pollution</w:t>
             </w:r>
@@ -1434,15 +2985,15 @@
         </w:tc>
         <w:tc>
           <w:tcPr>
-            <w:tcW w:type="dxa" w:w="1234"/>
+            <w:tcW w:type="dxa" w:w="1080"/>
           </w:tcPr>
           <w:p>
             <w:r>
               <w:rPr>
-                <w:sz w:val="14"/>
+                <w:sz w:val="13"/>
               </w:rPr>
             </w:r>
-            <w:hyperlink r:id="rId21">
+            <w:hyperlink r:id="rId33">
               <w:r>
                 <w:rPr>
                   <w:color w:val="0563C1"/>
@@ -1457,25 +3008,25 @@
       <w:tr>
         <w:tc>
           <w:tcPr>
-            <w:tcW w:type="dxa" w:w="1234"/>
+            <w:tcW w:type="dxa" w:w="1080"/>
           </w:tcPr>
           <w:p>
             <w:r>
               <w:rPr>
-                <w:sz w:val="14"/>
+                <w:sz w:val="13"/>
               </w:rPr>
-              <w:t>Forskrift om gjennomføring av fiske, fangst og høsting (Høstingsforskriften) – Kap. XV–XVI: Merking og tap av redskap</w:t>
+              <w:t>Avfallsforskriften – Kap. 10a: Utsortering og innsamling av plastavfall</w:t>
             </w:r>
           </w:p>
         </w:tc>
         <w:tc>
           <w:tcPr>
-            <w:tcW w:type="dxa" w:w="1234"/>
+            <w:tcW w:type="dxa" w:w="1080"/>
           </w:tcPr>
           <w:p>
             <w:r>
               <w:rPr>
-                <w:sz w:val="14"/>
+                <w:sz w:val="13"/>
               </w:rPr>
               <w:t>Regulation</w:t>
             </w:r>
@@ -1483,12 +3034,25 @@
         </w:tc>
         <w:tc>
           <w:tcPr>
-            <w:tcW w:type="dxa" w:w="1234"/>
+            <w:tcW w:type="dxa" w:w="1080"/>
           </w:tcPr>
           <w:p>
             <w:r>
               <w:rPr>
-                <w:sz w:val="14"/>
+                <w:sz w:val="13"/>
+              </w:rPr>
+              <w:t>2023</w:t>
+            </w:r>
+          </w:p>
+        </w:tc>
+        <w:tc>
+          <w:tcPr>
+            <w:tcW w:type="dxa" w:w="1080"/>
+          </w:tcPr>
+          <w:p>
+            <w:r>
+              <w:rPr>
+                <w:sz w:val="13"/>
               </w:rPr>
               <w:t>2025</w:t>
             </w:r>
@@ -1496,341 +3060,38 @@
         </w:tc>
         <w:tc>
           <w:tcPr>
-            <w:tcW w:type="dxa" w:w="1234"/>
+            <w:tcW w:type="dxa" w:w="1080"/>
           </w:tcPr>
           <w:p>
             <w:r>
               <w:rPr>
-                <w:sz w:val="14"/>
+                <w:sz w:val="13"/>
               </w:rPr>
-              <w:t>Rules on marking of fishing gear and measures to prevent and address lost gear (including plastic-containing gear), reducing ghost fishing and marine plastic pollution from fisheries.</w:t>
+              <w:t>Municipal duties for household plastic waste source-sorting (50% by 2028, 70% by 2035) and agricultural plastic waste collection.</w:t>
             </w:r>
           </w:p>
         </w:tc>
         <w:tc>
           <w:tcPr>
-            <w:tcW w:type="dxa" w:w="1234"/>
+            <w:tcW w:type="dxa" w:w="1080"/>
           </w:tcPr>
           <w:p>
             <w:r>
               <w:rPr>
-                <w:sz w:val="14"/>
+                <w:sz w:val="13"/>
               </w:rPr>
-              <w:t>Fisheries; aquaculture; recreational fishing</w:t>
+              <w:t>Municipalities; agriculture; waste management</w:t>
             </w:r>
           </w:p>
         </w:tc>
         <w:tc>
           <w:tcPr>
-            <w:tcW w:type="dxa" w:w="1234"/>
+            <w:tcW w:type="dxa" w:w="1080"/>
           </w:tcPr>
           <w:p>
             <w:r>
               <w:rPr>
-                <w:sz w:val="14"/>
-              </w:rPr>
-              <w:t>Use/Consumption; Litter/Pollution</w:t>
-            </w:r>
-          </w:p>
-        </w:tc>
-        <w:tc>
-          <w:tcPr>
-            <w:tcW w:type="dxa" w:w="1234"/>
-          </w:tcPr>
-          <w:p>
-            <w:r>
-              <w:rPr>
-                <w:sz w:val="14"/>
-              </w:rPr>
-            </w:r>
-            <w:hyperlink r:id="rId22">
-              <w:r>
-                <w:rPr>
-                  <w:color w:val="0563C1"/>
-                  <w:u w:val="single"/>
-                </w:rPr>
-                <w:t>lovdata.no – Høstingsforskriften kap. XVI</w:t>
-              </w:r>
-            </w:hyperlink>
-          </w:p>
-        </w:tc>
-      </w:tr>
-      <w:tr>
-        <w:tc>
-          <w:tcPr>
-            <w:tcW w:type="dxa" w:w="1234"/>
-          </w:tcPr>
-          <w:p>
-            <w:r>
-              <w:rPr>
-                <w:sz w:val="14"/>
-              </w:rPr>
-              <w:t>Nasjonal strategi for ein grøn, sirkulær økonomi</w:t>
-            </w:r>
-          </w:p>
-        </w:tc>
-        <w:tc>
-          <w:tcPr>
-            <w:tcW w:type="dxa" w:w="1234"/>
-          </w:tcPr>
-          <w:p>
-            <w:r>
-              <w:rPr>
-                <w:sz w:val="14"/>
-              </w:rPr>
-              <w:t>National strategy</w:t>
-            </w:r>
-          </w:p>
-        </w:tc>
-        <w:tc>
-          <w:tcPr>
-            <w:tcW w:type="dxa" w:w="1234"/>
-          </w:tcPr>
-          <w:p>
-            <w:r>
-              <w:rPr>
-                <w:sz w:val="14"/>
-              </w:rPr>
-              <w:t>2021</w:t>
-            </w:r>
-          </w:p>
-        </w:tc>
-        <w:tc>
-          <w:tcPr>
-            <w:tcW w:type="dxa" w:w="1234"/>
-          </w:tcPr>
-          <w:p>
-            <w:r>
-              <w:rPr>
-                <w:sz w:val="14"/>
-              </w:rPr>
-              <w:t>Overarching circular economy strategy including measures to promote circular plastics use, reduce marine plastic litter, and strengthen material recycling across value chains.</w:t>
-            </w:r>
-          </w:p>
-        </w:tc>
-        <w:tc>
-          <w:tcPr>
-            <w:tcW w:type="dxa" w:w="1234"/>
-          </w:tcPr>
-          <w:p>
-            <w:r>
-              <w:rPr>
-                <w:sz w:val="14"/>
-              </w:rPr>
-              <w:t>All sectors; waste management; manufacturing</w:t>
-            </w:r>
-          </w:p>
-        </w:tc>
-        <w:tc>
-          <w:tcPr>
-            <w:tcW w:type="dxa" w:w="1234"/>
-          </w:tcPr>
-          <w:p>
-            <w:r>
-              <w:rPr>
-                <w:sz w:val="14"/>
-              </w:rPr>
-              <w:t>Production; End-of-life; Use/Consumption</w:t>
-            </w:r>
-          </w:p>
-        </w:tc>
-        <w:tc>
-          <w:tcPr>
-            <w:tcW w:type="dxa" w:w="1234"/>
-          </w:tcPr>
-          <w:p>
-            <w:r>
-              <w:rPr>
-                <w:sz w:val="14"/>
-              </w:rPr>
-            </w:r>
-            <w:hyperlink r:id="rId23">
-              <w:r>
-                <w:rPr>
-                  <w:color w:val="0563C1"/>
-                  <w:u w:val="single"/>
-                </w:rPr>
-                <w:t>regjeringen.no – Nasjonal sirkulærøkonomistrategi</w:t>
-              </w:r>
-            </w:hyperlink>
-          </w:p>
-        </w:tc>
-      </w:tr>
-      <w:tr>
-        <w:tc>
-          <w:tcPr>
-            <w:tcW w:type="dxa" w:w="1234"/>
-          </w:tcPr>
-          <w:p>
-            <w:r>
-              <w:rPr>
-                <w:sz w:val="14"/>
-              </w:rPr>
-              <w:t>Noregs plaststrategi (Norwegian Plastics Strategy)</w:t>
-            </w:r>
-          </w:p>
-        </w:tc>
-        <w:tc>
-          <w:tcPr>
-            <w:tcW w:type="dxa" w:w="1234"/>
-          </w:tcPr>
-          <w:p>
-            <w:r>
-              <w:rPr>
-                <w:sz w:val="14"/>
-              </w:rPr>
-              <w:t>National strategy / Action plan</w:t>
-            </w:r>
-          </w:p>
-        </w:tc>
-        <w:tc>
-          <w:tcPr>
-            <w:tcW w:type="dxa" w:w="1234"/>
-          </w:tcPr>
-          <w:p>
-            <w:r>
-              <w:rPr>
-                <w:sz w:val="14"/>
-              </w:rPr>
-              <w:t>2021</w:t>
-            </w:r>
-          </w:p>
-        </w:tc>
-        <w:tc>
-          <w:tcPr>
-            <w:tcW w:type="dxa" w:w="1234"/>
-          </w:tcPr>
-          <w:p>
-            <w:r>
-              <w:rPr>
-                <w:sz w:val="14"/>
-              </w:rPr>
-              <w:t>Comprehensive national plastics management plan covering the full plastic lifecycle: prevention, sustainable production/consumption, waste management, marine litter cleanup, and microplastics; coordinates sectoral measures.</w:t>
-            </w:r>
-          </w:p>
-        </w:tc>
-        <w:tc>
-          <w:tcPr>
-            <w:tcW w:type="dxa" w:w="1234"/>
-          </w:tcPr>
-          <w:p>
-            <w:r>
-              <w:rPr>
-                <w:sz w:val="14"/>
-              </w:rPr>
-              <w:t>All sectors; fisheries; aquaculture; municipalities; industry</w:t>
-            </w:r>
-          </w:p>
-        </w:tc>
-        <w:tc>
-          <w:tcPr>
-            <w:tcW w:type="dxa" w:w="1234"/>
-          </w:tcPr>
-          <w:p>
-            <w:r>
-              <w:rPr>
-                <w:sz w:val="14"/>
-              </w:rPr>
-              <w:t>Production; Use/Consumption; End-of-life; Litter/Pollution</w:t>
-            </w:r>
-          </w:p>
-        </w:tc>
-        <w:tc>
-          <w:tcPr>
-            <w:tcW w:type="dxa" w:w="1234"/>
-          </w:tcPr>
-          <w:p>
-            <w:r>
-              <w:rPr>
-                <w:sz w:val="14"/>
-              </w:rPr>
-            </w:r>
-            <w:hyperlink r:id="rId24">
-              <w:r>
-                <w:rPr>
-                  <w:color w:val="0563C1"/>
-                  <w:u w:val="single"/>
-                </w:rPr>
-                <w:t>regjeringen.no – Noregs plaststrategi</w:t>
-              </w:r>
-            </w:hyperlink>
-          </w:p>
-        </w:tc>
-      </w:tr>
-      <w:tr>
-        <w:tc>
-          <w:tcPr>
-            <w:tcW w:type="dxa" w:w="1234"/>
-          </w:tcPr>
-          <w:p>
-            <w:r>
-              <w:rPr>
-                <w:sz w:val="14"/>
-              </w:rPr>
-              <w:t>Forskrift om gjenvinning og behandling av avfall (Avfallsforskriften) – Kap. 10a: Utsortering og innsamling av plastavfall</w:t>
-            </w:r>
-          </w:p>
-        </w:tc>
-        <w:tc>
-          <w:tcPr>
-            <w:tcW w:type="dxa" w:w="1234"/>
-          </w:tcPr>
-          <w:p>
-            <w:r>
-              <w:rPr>
-                <w:sz w:val="14"/>
-              </w:rPr>
-              <w:t>Regulation</w:t>
-            </w:r>
-          </w:p>
-        </w:tc>
-        <w:tc>
-          <w:tcPr>
-            <w:tcW w:type="dxa" w:w="1234"/>
-          </w:tcPr>
-          <w:p>
-            <w:r>
-              <w:rPr>
-                <w:sz w:val="14"/>
-              </w:rPr>
-              <w:t>2025</w:t>
-            </w:r>
-          </w:p>
-        </w:tc>
-        <w:tc>
-          <w:tcPr>
-            <w:tcW w:type="dxa" w:w="1234"/>
-          </w:tcPr>
-          <w:p>
-            <w:r>
-              <w:rPr>
-                <w:sz w:val="14"/>
-              </w:rPr>
-              <w:t>Municipal and business duties for source separation and collection of household plastic waste; targets 50% source-sorting of recyclable plastic waste by 2028, 60% by 2030, 70% by 2035. Also covers agricultural plastic waste.</w:t>
-            </w:r>
-          </w:p>
-        </w:tc>
-        <w:tc>
-          <w:tcPr>
-            <w:tcW w:type="dxa" w:w="1234"/>
-          </w:tcPr>
-          <w:p>
-            <w:r>
-              <w:rPr>
-                <w:sz w:val="14"/>
-              </w:rPr>
-              <w:t>Municipalities; waste management; agriculture; households</w:t>
-            </w:r>
-          </w:p>
-        </w:tc>
-        <w:tc>
-          <w:tcPr>
-            <w:tcW w:type="dxa" w:w="1234"/>
-          </w:tcPr>
-          <w:p>
-            <w:r>
-              <w:rPr>
-                <w:sz w:val="14"/>
+                <w:sz w:val="13"/>
               </w:rPr>
               <w:t>End-of-life</w:t>
             </w:r>
@@ -1838,15 +3099,15 @@
         </w:tc>
         <w:tc>
           <w:tcPr>
-            <w:tcW w:type="dxa" w:w="1234"/>
+            <w:tcW w:type="dxa" w:w="1080"/>
           </w:tcPr>
           <w:p>
             <w:r>
               <w:rPr>
-                <w:sz w:val="14"/>
+                <w:sz w:val="13"/>
               </w:rPr>
             </w:r>
-            <w:hyperlink r:id="rId25">
+            <w:hyperlink r:id="rId34">
               <w:r>
                 <w:rPr>
                   <w:color w:val="0563C1"/>
@@ -1861,12 +3122,12 @@
       <w:tr>
         <w:tc>
           <w:tcPr>
-            <w:tcW w:type="dxa" w:w="1234"/>
+            <w:tcW w:type="dxa" w:w="1080"/>
           </w:tcPr>
           <w:p>
             <w:r>
               <w:rPr>
-                <w:sz w:val="14"/>
+                <w:sz w:val="13"/>
               </w:rPr>
               <w:t>Handlingsplan for en sirkulær økonomi 2024–2025</w:t>
             </w:r>
@@ -1874,12 +3135,12 @@
         </w:tc>
         <w:tc>
           <w:tcPr>
-            <w:tcW w:type="dxa" w:w="1234"/>
+            <w:tcW w:type="dxa" w:w="1080"/>
           </w:tcPr>
           <w:p>
             <w:r>
               <w:rPr>
-                <w:sz w:val="14"/>
+                <w:sz w:val="13"/>
               </w:rPr>
               <w:t>Government action plan</w:t>
             </w:r>
@@ -1887,12 +3148,12 @@
         </w:tc>
         <w:tc>
           <w:tcPr>
-            <w:tcW w:type="dxa" w:w="1234"/>
+            <w:tcW w:type="dxa" w:w="1080"/>
           </w:tcPr>
           <w:p>
             <w:r>
               <w:rPr>
-                <w:sz w:val="14"/>
+                <w:sz w:val="13"/>
               </w:rPr>
               <w:t>2024</w:t>
             </w:r>
@@ -1900,38 +3161,51 @@
         </w:tc>
         <w:tc>
           <w:tcPr>
-            <w:tcW w:type="dxa" w:w="1234"/>
+            <w:tcW w:type="dxa" w:w="1080"/>
           </w:tcPr>
           <w:p>
             <w:r>
               <w:rPr>
-                <w:sz w:val="14"/>
+                <w:sz w:val="13"/>
               </w:rPr>
-              <w:t>Follow-up action plan to the circular economy strategy; includes concrete measures on plastics: EPR for single-use plastics and fishing gear, microplastics under REACH, and preparation for EU packaging rules.</w:t>
+              <w:t>2024</w:t>
             </w:r>
           </w:p>
         </w:tc>
         <w:tc>
           <w:tcPr>
-            <w:tcW w:type="dxa" w:w="1234"/>
+            <w:tcW w:type="dxa" w:w="1080"/>
           </w:tcPr>
           <w:p>
             <w:r>
               <w:rPr>
-                <w:sz w:val="14"/>
+                <w:sz w:val="13"/>
               </w:rPr>
-              <w:t>All sectors; fisheries; waste management</w:t>
+              <w:t>Follow-up plan with concrete plastics measures: SUP EPR, fishing-gear EPR, REACH microplastics, packaging regulation preparation.</w:t>
             </w:r>
           </w:p>
         </w:tc>
         <w:tc>
           <w:tcPr>
-            <w:tcW w:type="dxa" w:w="1234"/>
+            <w:tcW w:type="dxa" w:w="1080"/>
           </w:tcPr>
           <w:p>
             <w:r>
               <w:rPr>
-                <w:sz w:val="14"/>
+                <w:sz w:val="13"/>
+              </w:rPr>
+              <w:t>All sectors; fisheries</w:t>
+            </w:r>
+          </w:p>
+        </w:tc>
+        <w:tc>
+          <w:tcPr>
+            <w:tcW w:type="dxa" w:w="1080"/>
+          </w:tcPr>
+          <w:p>
+            <w:r>
+              <w:rPr>
+                <w:sz w:val="13"/>
               </w:rPr>
               <w:t>Production; End-of-life; Litter/Pollution</w:t>
             </w:r>
@@ -1939,21 +3213,21 @@
         </w:tc>
         <w:tc>
           <w:tcPr>
-            <w:tcW w:type="dxa" w:w="1234"/>
+            <w:tcW w:type="dxa" w:w="1080"/>
           </w:tcPr>
           <w:p>
             <w:r>
               <w:rPr>
-                <w:sz w:val="14"/>
+                <w:sz w:val="13"/>
               </w:rPr>
             </w:r>
-            <w:hyperlink r:id="rId26">
+            <w:hyperlink r:id="rId35">
               <w:r>
                 <w:rPr>
                   <w:color w:val="0563C1"/>
                   <w:u w:val="single"/>
                 </w:rPr>
-                <w:t>regjeringen.no – Handlingsplan sirkulær økonomi</w:t>
+                <w:t>regjeringen.no – Handlingsplan 2024–2025</w:t>
               </w:r>
             </w:hyperlink>
           </w:p>
@@ -1962,25 +3236,25 @@
       <w:tr>
         <w:tc>
           <w:tcPr>
-            <w:tcW w:type="dxa" w:w="1234"/>
+            <w:tcW w:type="dxa" w:w="1080"/>
           </w:tcPr>
           <w:p>
             <w:r>
               <w:rPr>
-                <w:sz w:val="14"/>
+                <w:sz w:val="13"/>
               </w:rPr>
-              <w:t>Lov om bærekraftige produkter og verdikjeder (Bærekraftige produkter-loven)</w:t>
+              <w:t>Lov om bærekraftige produkter og verdikjeder</w:t>
             </w:r>
           </w:p>
         </w:tc>
         <w:tc>
           <w:tcPr>
-            <w:tcW w:type="dxa" w:w="1234"/>
+            <w:tcW w:type="dxa" w:w="1080"/>
           </w:tcPr>
           <w:p>
             <w:r>
               <w:rPr>
-                <w:sz w:val="14"/>
+                <w:sz w:val="13"/>
               </w:rPr>
               <w:t>Act (Law)</w:t>
             </w:r>
@@ -1988,12 +3262,25 @@
         </w:tc>
         <w:tc>
           <w:tcPr>
-            <w:tcW w:type="dxa" w:w="1234"/>
+            <w:tcW w:type="dxa" w:w="1080"/>
           </w:tcPr>
           <w:p>
             <w:r>
               <w:rPr>
-                <w:sz w:val="14"/>
+                <w:sz w:val="13"/>
+              </w:rPr>
+              <w:t>2024</w:t>
+            </w:r>
+          </w:p>
+        </w:tc>
+        <w:tc>
+          <w:tcPr>
+            <w:tcW w:type="dxa" w:w="1080"/>
+          </w:tcPr>
+          <w:p>
+            <w:r>
+              <w:rPr>
+                <w:sz w:val="13"/>
               </w:rPr>
               <w:t>2026</w:t>
             </w:r>
@@ -2001,54 +3288,54 @@
         </w:tc>
         <w:tc>
           <w:tcPr>
-            <w:tcW w:type="dxa" w:w="1234"/>
+            <w:tcW w:type="dxa" w:w="1080"/>
           </w:tcPr>
           <w:p>
             <w:r>
               <w:rPr>
-                <w:sz w:val="14"/>
+                <w:sz w:val="13"/>
               </w:rPr>
-              <w:t>Enabling law for implementing EU sustainable product and circular economy rules in Norway, including future requirements on plastic products, packaging, EPR, waste prevention, and recycled content across value chains.</w:t>
+              <w:t>Enabling law for EU sustainable product/circular economy rules including future plastic packaging and EPR requirements.</w:t>
             </w:r>
           </w:p>
         </w:tc>
         <w:tc>
           <w:tcPr>
-            <w:tcW w:type="dxa" w:w="1234"/>
+            <w:tcW w:type="dxa" w:w="1080"/>
           </w:tcPr>
           <w:p>
             <w:r>
               <w:rPr>
-                <w:sz w:val="14"/>
+                <w:sz w:val="13"/>
               </w:rPr>
-              <w:t>All sectors; manufacturing; retail</w:t>
+              <w:t>All sectors; manufacturing</w:t>
             </w:r>
           </w:p>
         </w:tc>
         <w:tc>
           <w:tcPr>
-            <w:tcW w:type="dxa" w:w="1234"/>
+            <w:tcW w:type="dxa" w:w="1080"/>
           </w:tcPr>
           <w:p>
             <w:r>
               <w:rPr>
-                <w:sz w:val="14"/>
+                <w:sz w:val="13"/>
               </w:rPr>
-              <w:t>Production; Design; End-of-life; Use/Consumption</w:t>
+              <w:t>Production; Design; End-of-life</w:t>
             </w:r>
           </w:p>
         </w:tc>
         <w:tc>
           <w:tcPr>
-            <w:tcW w:type="dxa" w:w="1234"/>
+            <w:tcW w:type="dxa" w:w="1080"/>
           </w:tcPr>
           <w:p>
             <w:r>
               <w:rPr>
-                <w:sz w:val="14"/>
+                <w:sz w:val="13"/>
               </w:rPr>
             </w:r>
-            <w:hyperlink r:id="rId27">
+            <w:hyperlink r:id="rId36">
               <w:r>
                 <w:rPr>
                   <w:color w:val="0563C1"/>
@@ -2063,25 +3350,25 @@
       <w:tr>
         <w:tc>
           <w:tcPr>
-            <w:tcW w:type="dxa" w:w="1234"/>
+            <w:tcW w:type="dxa" w:w="1080"/>
           </w:tcPr>
           <w:p>
             <w:r>
               <w:rPr>
-                <w:sz w:val="14"/>
+                <w:sz w:val="13"/>
               </w:rPr>
-              <w:t>Forskrift om gjenvinning og behandling av avfall (Avfallsforskriften) – Kap. 7A: Utvidet produsentansvar for engangsplastprodukter</w:t>
+              <w:t>Avfallsforskriften – Kap. 7A: EPR for engangsplastprodukter</w:t>
             </w:r>
           </w:p>
         </w:tc>
         <w:tc>
           <w:tcPr>
-            <w:tcW w:type="dxa" w:w="1234"/>
+            <w:tcW w:type="dxa" w:w="1080"/>
           </w:tcPr>
           <w:p>
             <w:r>
               <w:rPr>
-                <w:sz w:val="14"/>
+                <w:sz w:val="13"/>
               </w:rPr>
               <w:t>Regulation</w:t>
             </w:r>
@@ -2089,12 +3376,12 @@
         </w:tc>
         <w:tc>
           <w:tcPr>
-            <w:tcW w:type="dxa" w:w="1234"/>
+            <w:tcW w:type="dxa" w:w="1080"/>
           </w:tcPr>
           <w:p>
             <w:r>
               <w:rPr>
-                <w:sz w:val="14"/>
+                <w:sz w:val="13"/>
               </w:rPr>
               <w:t>2025</w:t>
             </w:r>
@@ -2102,54 +3389,67 @@
         </w:tc>
         <w:tc>
           <w:tcPr>
-            <w:tcW w:type="dxa" w:w="1234"/>
+            <w:tcW w:type="dxa" w:w="1080"/>
           </w:tcPr>
           <w:p>
             <w:r>
               <w:rPr>
-                <w:sz w:val="14"/>
+                <w:sz w:val="13"/>
               </w:rPr>
-              <w:t>New EPR chapter for listed single-use plastic products (food containers, cups, wet wipes, lightweight carrier bags, etc.): producers must cover municipal litter cleanup and public-bin collection costs from 1 January 2027; consumer awareness obligations.</w:t>
+              <w:t>2025</w:t>
             </w:r>
           </w:p>
         </w:tc>
         <w:tc>
           <w:tcPr>
-            <w:tcW w:type="dxa" w:w="1234"/>
+            <w:tcW w:type="dxa" w:w="1080"/>
           </w:tcPr>
           <w:p>
             <w:r>
               <w:rPr>
-                <w:sz w:val="14"/>
+                <w:sz w:val="13"/>
               </w:rPr>
-              <w:t>Retail; food service; tobacco; manufacturing; municipalities</w:t>
+              <w:t>New EPR for listed SUP items: producers cover municipal litter cleanup and public-bin collection from 1 January 2027.</w:t>
             </w:r>
           </w:p>
         </w:tc>
         <w:tc>
           <w:tcPr>
-            <w:tcW w:type="dxa" w:w="1234"/>
+            <w:tcW w:type="dxa" w:w="1080"/>
           </w:tcPr>
           <w:p>
             <w:r>
               <w:rPr>
-                <w:sz w:val="14"/>
+                <w:sz w:val="13"/>
               </w:rPr>
-              <w:t>Use/Consumption; End-of-life; Litter/Pollution</w:t>
+              <w:t>Retail; food service; municipalities</w:t>
             </w:r>
           </w:p>
         </w:tc>
         <w:tc>
           <w:tcPr>
-            <w:tcW w:type="dxa" w:w="1234"/>
+            <w:tcW w:type="dxa" w:w="1080"/>
           </w:tcPr>
           <w:p>
             <w:r>
               <w:rPr>
-                <w:sz w:val="14"/>
+                <w:sz w:val="13"/>
+              </w:rPr>
+              <w:t>Use/Consumption; Litter/Pollution; End-of-life</w:t>
+            </w:r>
+          </w:p>
+        </w:tc>
+        <w:tc>
+          <w:tcPr>
+            <w:tcW w:type="dxa" w:w="1080"/>
+          </w:tcPr>
+          <w:p>
+            <w:r>
+              <w:rPr>
+                <w:sz w:val="13"/>
               </w:rPr>
             </w:r>
-            <w:hyperlink r:id="rId28">
+            <w:hyperlink r:id="rId37">
               <w:r>
                 <w:rPr>
                   <w:color w:val="0563C1"/>
@@ -2164,25 +3464,25 @@
       <w:tr>
         <w:tc>
           <w:tcPr>
-            <w:tcW w:type="dxa" w:w="1234"/>
+            <w:tcW w:type="dxa" w:w="1080"/>
           </w:tcPr>
           <w:p>
             <w:r>
               <w:rPr>
-                <w:sz w:val="14"/>
+                <w:sz w:val="13"/>
               </w:rPr>
-              <w:t>Forskrift om gjenvinning og behandling av avfall (Avfallsforskriften) – Kap. 7B: Utvidet produsentansvar for fiskeutstyr med plast</w:t>
+              <w:t>Avfallsforskriften – Kap. 7B: EPR for fiskeutstyr med plast</w:t>
             </w:r>
           </w:p>
         </w:tc>
         <w:tc>
           <w:tcPr>
-            <w:tcW w:type="dxa" w:w="1234"/>
+            <w:tcW w:type="dxa" w:w="1080"/>
           </w:tcPr>
           <w:p>
             <w:r>
               <w:rPr>
-                <w:sz w:val="14"/>
+                <w:sz w:val="13"/>
               </w:rPr>
               <w:t>Regulation</w:t>
             </w:r>
@@ -2190,12 +3490,12 @@
         </w:tc>
         <w:tc>
           <w:tcPr>
-            <w:tcW w:type="dxa" w:w="1234"/>
+            <w:tcW w:type="dxa" w:w="1080"/>
           </w:tcPr>
           <w:p>
             <w:r>
               <w:rPr>
-                <w:sz w:val="14"/>
+                <w:sz w:val="13"/>
               </w:rPr>
               <w:t>2025</w:t>
             </w:r>
@@ -2203,38 +3503,51 @@
         </w:tc>
         <w:tc>
           <w:tcPr>
-            <w:tcW w:type="dxa" w:w="1234"/>
+            <w:tcW w:type="dxa" w:w="1080"/>
           </w:tcPr>
           <w:p>
             <w:r>
               <w:rPr>
-                <w:sz w:val="14"/>
+                <w:sz w:val="13"/>
               </w:rPr>
-              <w:t>New EPR for fishing, recreational fishing and aquaculture equipment containing plastic: producers must ensure separate collection, treatment, and cost coverage; aims to reduce fishing-gear litter and microplastic spread.</w:t>
+              <w:t>2025</w:t>
             </w:r>
           </w:p>
         </w:tc>
         <w:tc>
           <w:tcPr>
-            <w:tcW w:type="dxa" w:w="1234"/>
+            <w:tcW w:type="dxa" w:w="1080"/>
           </w:tcPr>
           <w:p>
             <w:r>
               <w:rPr>
-                <w:sz w:val="14"/>
+                <w:sz w:val="13"/>
               </w:rPr>
-              <w:t>Fisheries; aquaculture; recreational fishing; manufacturing</w:t>
+              <w:t>New EPR for fishing, aquaculture and recreational fishing gear containing plastic.</w:t>
             </w:r>
           </w:p>
         </w:tc>
         <w:tc>
           <w:tcPr>
-            <w:tcW w:type="dxa" w:w="1234"/>
+            <w:tcW w:type="dxa" w:w="1080"/>
           </w:tcPr>
           <w:p>
             <w:r>
               <w:rPr>
-                <w:sz w:val="14"/>
+                <w:sz w:val="13"/>
+              </w:rPr>
+              <w:t>Fisheries; aquaculture; manufacturing</w:t>
+            </w:r>
+          </w:p>
+        </w:tc>
+        <w:tc>
+          <w:tcPr>
+            <w:tcW w:type="dxa" w:w="1080"/>
+          </w:tcPr>
+          <w:p>
+            <w:r>
+              <w:rPr>
+                <w:sz w:val="13"/>
               </w:rPr>
               <w:t>Use/Consumption; End-of-life; Litter/Pollution</w:t>
             </w:r>
@@ -2242,15 +3555,15 @@
         </w:tc>
         <w:tc>
           <w:tcPr>
-            <w:tcW w:type="dxa" w:w="1234"/>
+            <w:tcW w:type="dxa" w:w="1080"/>
           </w:tcPr>
           <w:p>
             <w:r>
               <w:rPr>
-                <w:sz w:val="14"/>
+                <w:sz w:val="13"/>
               </w:rPr>
             </w:r>
-            <w:hyperlink r:id="rId29">
+            <w:hyperlink r:id="rId38">
               <w:r>
                 <w:rPr>
                   <w:color w:val="0563C1"/>
@@ -2269,10 +3582,15 @@
         <w:rPr>
           <w:b/>
         </w:rPr>
-        <w:t xml:space="preserve">Notes: </w:t>
+        <w:t xml:space="preserve">Important note on dates: </w:t>
       </w:r>
       <w:r>
-        <w:t>Last amendment years verified against Lovdata (legislation) and regjeringen.no (strategies/plans) as of June 2026. Kapittel 2b of Produktforskriften entered into force 3 July 2021 (forskrift 18 December 2020 nr. 3200). REACH microplastics restriction incorporated in Norway 17 March 2025 (forskrift 17 March 2025 nr. 487). Plastic carrier bag reduction is implemented via Avfallsforskriften kap. 7 (reporting) and industry measures under the EU Packaging Directive framework; national target is max. 40 bags per person per year by end-2025 per government strategy.</w:t>
+        <w:t>Many instruments date from the 1970s–2000s but show recent Last Amendment Years (2024–2026) because Norwegian regulations are living instruments updated frequently to transpose new EU/EEA rules. Use the Original Year column for chronological policy history; use Last Amendment Year for the current legal text.</w:t>
+      </w:r>
+    </w:p>
+    <w:p>
+      <w:r>
+        <w:t>Policies with original year before 2022: 25 of 30.</w:t>
       </w:r>
     </w:p>
     <w:sectPr>

</xml_diff>

<commit_message>
Add English translation column for Norwegian policy titles
Co-authored-by: Vaibhav <shivrain@users.noreply.github.com>
</commit_message>
<xml_diff>
--- a/Norway_Plastic_Pollution_Policies.docx
+++ b/Norway_Plastic_Pollution_Policies.docx
@@ -16,7 +16,7 @@
         <w:jc w:val="center"/>
       </w:pPr>
       <w:r>
-        <w:t>National-level policies tackling plastic pollution across the lifecycle. International treaties excluded. Official government sources only. Sorted chronologically by ORIGINAL adoption/first-effective year.</w:t>
+        <w:t>National-level policies tackling plastic pollution across the lifecycle. International treaties excluded. Official government sources only. Sorted chronologically by original adoption/first-effective year.</w:t>
       </w:r>
     </w:p>
     <w:p>
@@ -32,39 +32,54 @@
         <w:tblLook w:firstColumn="1" w:firstRow="1" w:lastColumn="0" w:lastRow="0" w:noHBand="0" w:noVBand="1" w:val="04A0"/>
       </w:tblPr>
       <w:tblGrid>
-        <w:gridCol w:w="1080"/>
-        <w:gridCol w:w="1080"/>
-        <w:gridCol w:w="1080"/>
-        <w:gridCol w:w="1080"/>
-        <w:gridCol w:w="1080"/>
-        <w:gridCol w:w="1080"/>
-        <w:gridCol w:w="1080"/>
-        <w:gridCol w:w="1080"/>
+        <w:gridCol w:w="960"/>
+        <w:gridCol w:w="960"/>
+        <w:gridCol w:w="960"/>
+        <w:gridCol w:w="960"/>
+        <w:gridCol w:w="960"/>
+        <w:gridCol w:w="960"/>
+        <w:gridCol w:w="960"/>
+        <w:gridCol w:w="960"/>
+        <w:gridCol w:w="960"/>
       </w:tblGrid>
       <w:tr>
         <w:tc>
           <w:tcPr>
-            <w:tcW w:type="dxa" w:w="1080"/>
+            <w:tcW w:type="dxa" w:w="960"/>
           </w:tcPr>
           <w:p>
             <w:r>
               <w:rPr>
                 <w:b/>
-                <w:sz w:val="14"/>
+                <w:sz w:val="13"/>
               </w:rPr>
-              <w:t>Policy Title</w:t>
+              <w:t>Policy Title (Norwegian)</w:t>
             </w:r>
           </w:p>
         </w:tc>
         <w:tc>
           <w:tcPr>
-            <w:tcW w:type="dxa" w:w="1080"/>
+            <w:tcW w:type="dxa" w:w="960"/>
           </w:tcPr>
           <w:p>
             <w:r>
               <w:rPr>
                 <w:b/>
-                <w:sz w:val="14"/>
+                <w:sz w:val="13"/>
+              </w:rPr>
+              <w:t>Policy Title (English)</w:t>
+            </w:r>
+          </w:p>
+        </w:tc>
+        <w:tc>
+          <w:tcPr>
+            <w:tcW w:type="dxa" w:w="960"/>
+          </w:tcPr>
+          <w:p>
+            <w:r>
+              <w:rPr>
+                <w:b/>
+                <w:sz w:val="13"/>
               </w:rPr>
               <w:t>Policy Type</w:t>
             </w:r>
@@ -72,13 +87,13 @@
         </w:tc>
         <w:tc>
           <w:tcPr>
-            <w:tcW w:type="dxa" w:w="1080"/>
+            <w:tcW w:type="dxa" w:w="960"/>
           </w:tcPr>
           <w:p>
             <w:r>
               <w:rPr>
                 <w:b/>
-                <w:sz w:val="14"/>
+                <w:sz w:val="13"/>
               </w:rPr>
               <w:t>Original Year</w:t>
             </w:r>
@@ -86,13 +101,13 @@
         </w:tc>
         <w:tc>
           <w:tcPr>
-            <w:tcW w:type="dxa" w:w="1080"/>
+            <w:tcW w:type="dxa" w:w="960"/>
           </w:tcPr>
           <w:p>
             <w:r>
               <w:rPr>
                 <w:b/>
-                <w:sz w:val="14"/>
+                <w:sz w:val="13"/>
               </w:rPr>
               <w:t>Last Amendment Year</w:t>
             </w:r>
@@ -100,13 +115,13 @@
         </w:tc>
         <w:tc>
           <w:tcPr>
-            <w:tcW w:type="dxa" w:w="1080"/>
+            <w:tcW w:type="dxa" w:w="960"/>
           </w:tcPr>
           <w:p>
             <w:r>
               <w:rPr>
                 <w:b/>
-                <w:sz w:val="14"/>
+                <w:sz w:val="13"/>
               </w:rPr>
               <w:t>Short Description</w:t>
             </w:r>
@@ -114,13 +129,13 @@
         </w:tc>
         <w:tc>
           <w:tcPr>
-            <w:tcW w:type="dxa" w:w="1080"/>
+            <w:tcW w:type="dxa" w:w="960"/>
           </w:tcPr>
           <w:p>
             <w:r>
               <w:rPr>
                 <w:b/>
-                <w:sz w:val="14"/>
+                <w:sz w:val="13"/>
               </w:rPr>
               <w:t>Sectors</w:t>
             </w:r>
@@ -128,13 +143,13 @@
         </w:tc>
         <w:tc>
           <w:tcPr>
-            <w:tcW w:type="dxa" w:w="1080"/>
+            <w:tcW w:type="dxa" w:w="960"/>
           </w:tcPr>
           <w:p>
             <w:r>
               <w:rPr>
                 <w:b/>
-                <w:sz w:val="14"/>
+                <w:sz w:val="13"/>
               </w:rPr>
               <w:t>Life-Cycle Stage</w:t>
             </w:r>
@@ -142,13 +157,13 @@
         </w:tc>
         <w:tc>
           <w:tcPr>
-            <w:tcW w:type="dxa" w:w="1080"/>
+            <w:tcW w:type="dxa" w:w="960"/>
           </w:tcPr>
           <w:p>
             <w:r>
               <w:rPr>
                 <w:b/>
-                <w:sz w:val="14"/>
+                <w:sz w:val="13"/>
               </w:rPr>
               <w:t>Link</w:t>
             </w:r>
@@ -158,12 +173,12 @@
       <w:tr>
         <w:tc>
           <w:tcPr>
-            <w:tcW w:type="dxa" w:w="1080"/>
+            <w:tcW w:type="dxa" w:w="960"/>
           </w:tcPr>
           <w:p>
             <w:r>
               <w:rPr>
-                <w:sz w:val="13"/>
+                <w:sz w:val="12"/>
               </w:rPr>
               <w:t>Lov om særavgifter (særavgiftsloven) – avgifter på drikkevareemballasje</w:t>
             </w:r>
@@ -171,12 +186,25 @@
         </w:tc>
         <w:tc>
           <w:tcPr>
-            <w:tcW w:type="dxa" w:w="1080"/>
+            <w:tcW w:type="dxa" w:w="960"/>
           </w:tcPr>
           <w:p>
             <w:r>
               <w:rPr>
-                <w:sz w:val="13"/>
+                <w:sz w:val="12"/>
+              </w:rPr>
+              <w:t>Act relating to special excise duties (Special Excise Duties Act) – duties on beverage packaging</w:t>
+            </w:r>
+          </w:p>
+        </w:tc>
+        <w:tc>
+          <w:tcPr>
+            <w:tcW w:type="dxa" w:w="960"/>
+          </w:tcPr>
+          <w:p>
+            <w:r>
+              <w:rPr>
+                <w:sz w:val="12"/>
               </w:rPr>
               <w:t>Act (Law)</w:t>
             </w:r>
@@ -184,12 +212,12 @@
         </w:tc>
         <w:tc>
           <w:tcPr>
-            <w:tcW w:type="dxa" w:w="1080"/>
+            <w:tcW w:type="dxa" w:w="960"/>
           </w:tcPr>
           <w:p>
             <w:r>
               <w:rPr>
-                <w:sz w:val="13"/>
+                <w:sz w:val="12"/>
               </w:rPr>
               <w:t>1933</w:t>
             </w:r>
@@ -197,12 +225,12 @@
         </w:tc>
         <w:tc>
           <w:tcPr>
-            <w:tcW w:type="dxa" w:w="1080"/>
+            <w:tcW w:type="dxa" w:w="960"/>
           </w:tcPr>
           <w:p>
             <w:r>
               <w:rPr>
-                <w:sz w:val="13"/>
+                <w:sz w:val="12"/>
               </w:rPr>
               <w:t>2026</w:t>
             </w:r>
@@ -210,12 +238,12 @@
         </w:tc>
         <w:tc>
           <w:tcPr>
-            <w:tcW w:type="dxa" w:w="1080"/>
+            <w:tcW w:type="dxa" w:w="960"/>
           </w:tcPr>
           <w:p>
             <w:r>
               <w:rPr>
-                <w:sz w:val="13"/>
+                <w:sz w:val="12"/>
               </w:rPr>
               <w:t>Legal basis for excise on beverage packaging including plastic bottles; environmental tax incentivises deposit-return and recycling. Chapter 5 (2026 consolidation) governs packaging duties.</w:t>
             </w:r>
@@ -223,12 +251,12 @@
         </w:tc>
         <w:tc>
           <w:tcPr>
-            <w:tcW w:type="dxa" w:w="1080"/>
+            <w:tcW w:type="dxa" w:w="960"/>
           </w:tcPr>
           <w:p>
             <w:r>
               <w:rPr>
-                <w:sz w:val="13"/>
+                <w:sz w:val="12"/>
               </w:rPr>
               <w:t>Beverage; packaging; retail</w:t>
             </w:r>
@@ -236,12 +264,12 @@
         </w:tc>
         <w:tc>
           <w:tcPr>
-            <w:tcW w:type="dxa" w:w="1080"/>
+            <w:tcW w:type="dxa" w:w="960"/>
           </w:tcPr>
           <w:p>
             <w:r>
               <w:rPr>
-                <w:sz w:val="13"/>
+                <w:sz w:val="12"/>
               </w:rPr>
               <w:t>Use/Consumption; End-of-life</w:t>
             </w:r>
@@ -249,12 +277,12 @@
         </w:tc>
         <w:tc>
           <w:tcPr>
-            <w:tcW w:type="dxa" w:w="1080"/>
+            <w:tcW w:type="dxa" w:w="960"/>
           </w:tcPr>
           <w:p>
             <w:r>
               <w:rPr>
-                <w:sz w:val="13"/>
+                <w:sz w:val="12"/>
               </w:rPr>
             </w:r>
             <w:hyperlink r:id="rId9">
@@ -272,12 +300,12 @@
       <w:tr>
         <w:tc>
           <w:tcPr>
-            <w:tcW w:type="dxa" w:w="1080"/>
+            <w:tcW w:type="dxa" w:w="960"/>
           </w:tcPr>
           <w:p>
             <w:r>
               <w:rPr>
-                <w:sz w:val="13"/>
+                <w:sz w:val="12"/>
               </w:rPr>
               <w:t>Lov om kontroll med produkter og forbrukertjenester (Produktkontrolloven)</w:t>
             </w:r>
@@ -285,12 +313,25 @@
         </w:tc>
         <w:tc>
           <w:tcPr>
-            <w:tcW w:type="dxa" w:w="1080"/>
+            <w:tcW w:type="dxa" w:w="960"/>
           </w:tcPr>
           <w:p>
             <w:r>
               <w:rPr>
-                <w:sz w:val="13"/>
+                <w:sz w:val="12"/>
+              </w:rPr>
+              <w:t>Act relating to control of products and consumer services (Product Control Act)</w:t>
+            </w:r>
+          </w:p>
+        </w:tc>
+        <w:tc>
+          <w:tcPr>
+            <w:tcW w:type="dxa" w:w="960"/>
+          </w:tcPr>
+          <w:p>
+            <w:r>
+              <w:rPr>
+                <w:sz w:val="12"/>
               </w:rPr>
               <w:t>Act (Law)</w:t>
             </w:r>
@@ -298,12 +339,12 @@
         </w:tc>
         <w:tc>
           <w:tcPr>
-            <w:tcW w:type="dxa" w:w="1080"/>
+            <w:tcW w:type="dxa" w:w="960"/>
           </w:tcPr>
           <w:p>
             <w:r>
               <w:rPr>
-                <w:sz w:val="13"/>
+                <w:sz w:val="12"/>
               </w:rPr>
               <w:t>1976</w:t>
             </w:r>
@@ -311,12 +352,12 @@
         </w:tc>
         <w:tc>
           <w:tcPr>
-            <w:tcW w:type="dxa" w:w="1080"/>
+            <w:tcW w:type="dxa" w:w="960"/>
           </w:tcPr>
           <w:p>
             <w:r>
               <w:rPr>
-                <w:sz w:val="13"/>
+                <w:sz w:val="12"/>
               </w:rPr>
               <w:t>2024</w:t>
             </w:r>
@@ -324,12 +365,12 @@
         </w:tc>
         <w:tc>
           <w:tcPr>
-            <w:tcW w:type="dxa" w:w="1080"/>
+            <w:tcW w:type="dxa" w:w="960"/>
           </w:tcPr>
           <w:p>
             <w:r>
               <w:rPr>
-                <w:sz w:val="13"/>
+                <w:sz w:val="12"/>
               </w:rPr>
               <w:t>Framework law authorising national product controls, including restrictions on plastic products placed on the Norwegian market and powers to implement EEA product rules.</w:t>
             </w:r>
@@ -337,12 +378,12 @@
         </w:tc>
         <w:tc>
           <w:tcPr>
-            <w:tcW w:type="dxa" w:w="1080"/>
+            <w:tcW w:type="dxa" w:w="960"/>
           </w:tcPr>
           <w:p>
             <w:r>
               <w:rPr>
-                <w:sz w:val="13"/>
+                <w:sz w:val="12"/>
               </w:rPr>
               <w:t>All sectors; product manufacturing and trade</w:t>
             </w:r>
@@ -350,12 +391,12 @@
         </w:tc>
         <w:tc>
           <w:tcPr>
-            <w:tcW w:type="dxa" w:w="1080"/>
+            <w:tcW w:type="dxa" w:w="960"/>
           </w:tcPr>
           <w:p>
             <w:r>
               <w:rPr>
-                <w:sz w:val="13"/>
+                <w:sz w:val="12"/>
               </w:rPr>
               <w:t>Production; Use/Consumption</w:t>
             </w:r>
@@ -363,12 +404,12 @@
         </w:tc>
         <w:tc>
           <w:tcPr>
-            <w:tcW w:type="dxa" w:w="1080"/>
+            <w:tcW w:type="dxa" w:w="960"/>
           </w:tcPr>
           <w:p>
             <w:r>
               <w:rPr>
-                <w:sz w:val="13"/>
+                <w:sz w:val="12"/>
               </w:rPr>
             </w:r>
             <w:hyperlink r:id="rId10">
@@ -386,12 +427,12 @@
       <w:tr>
         <w:tc>
           <w:tcPr>
-            <w:tcW w:type="dxa" w:w="1080"/>
+            <w:tcW w:type="dxa" w:w="960"/>
           </w:tcPr>
           <w:p>
             <w:r>
               <w:rPr>
-                <w:sz w:val="13"/>
+                <w:sz w:val="12"/>
               </w:rPr>
               <w:t>Lov om vern mot forurensninger og om avfall (Forurensningsloven)</w:t>
             </w:r>
@@ -399,12 +440,25 @@
         </w:tc>
         <w:tc>
           <w:tcPr>
-            <w:tcW w:type="dxa" w:w="1080"/>
+            <w:tcW w:type="dxa" w:w="960"/>
           </w:tcPr>
           <w:p>
             <w:r>
               <w:rPr>
-                <w:sz w:val="13"/>
+                <w:sz w:val="12"/>
+              </w:rPr>
+              <w:t>Act relating to protection against pollution and concerning waste (Pollution Control Act)</w:t>
+            </w:r>
+          </w:p>
+        </w:tc>
+        <w:tc>
+          <w:tcPr>
+            <w:tcW w:type="dxa" w:w="960"/>
+          </w:tcPr>
+          <w:p>
+            <w:r>
+              <w:rPr>
+                <w:sz w:val="12"/>
               </w:rPr>
               <w:t>Act (Law)</w:t>
             </w:r>
@@ -412,12 +466,12 @@
         </w:tc>
         <w:tc>
           <w:tcPr>
-            <w:tcW w:type="dxa" w:w="1080"/>
+            <w:tcW w:type="dxa" w:w="960"/>
           </w:tcPr>
           <w:p>
             <w:r>
               <w:rPr>
-                <w:sz w:val="13"/>
+                <w:sz w:val="12"/>
               </w:rPr>
               <w:t>1981</w:t>
             </w:r>
@@ -425,12 +479,12 @@
         </w:tc>
         <w:tc>
           <w:tcPr>
-            <w:tcW w:type="dxa" w:w="1080"/>
+            <w:tcW w:type="dxa" w:w="960"/>
           </w:tcPr>
           <w:p>
             <w:r>
               <w:rPr>
-                <w:sz w:val="13"/>
+                <w:sz w:val="12"/>
               </w:rPr>
               <w:t>2024</w:t>
             </w:r>
@@ -438,12 +492,12 @@
         </w:tc>
         <w:tc>
           <w:tcPr>
-            <w:tcW w:type="dxa" w:w="1080"/>
+            <w:tcW w:type="dxa" w:w="960"/>
           </w:tcPr>
           <w:p>
             <w:r>
               <w:rPr>
-                <w:sz w:val="13"/>
+                <w:sz w:val="12"/>
               </w:rPr>
               <w:t>Principal environmental and waste law: prohibits littering (§7), establishes waste hierarchy, municipal waste duties, producer responsibility powers, and legal basis for waste and pollution regulations affecting plastics.</w:t>
             </w:r>
@@ -451,12 +505,12 @@
         </w:tc>
         <w:tc>
           <w:tcPr>
-            <w:tcW w:type="dxa" w:w="1080"/>
+            <w:tcW w:type="dxa" w:w="960"/>
           </w:tcPr>
           <w:p>
             <w:r>
               <w:rPr>
-                <w:sz w:val="13"/>
+                <w:sz w:val="12"/>
               </w:rPr>
               <w:t>All sectors; municipalities; waste management; industry</w:t>
             </w:r>
@@ -464,12 +518,12 @@
         </w:tc>
         <w:tc>
           <w:tcPr>
-            <w:tcW w:type="dxa" w:w="1080"/>
+            <w:tcW w:type="dxa" w:w="960"/>
           </w:tcPr>
           <w:p>
             <w:r>
               <w:rPr>
-                <w:sz w:val="13"/>
+                <w:sz w:val="12"/>
               </w:rPr>
               <w:t>End-of-life; Litter/Pollution; Production (indirect)</w:t>
             </w:r>
@@ -477,12 +531,12 @@
         </w:tc>
         <w:tc>
           <w:tcPr>
-            <w:tcW w:type="dxa" w:w="1080"/>
+            <w:tcW w:type="dxa" w:w="960"/>
           </w:tcPr>
           <w:p>
             <w:r>
               <w:rPr>
-                <w:sz w:val="13"/>
+                <w:sz w:val="12"/>
               </w:rPr>
             </w:r>
             <w:hyperlink r:id="rId11">
@@ -500,12 +554,12 @@
       <w:tr>
         <w:tc>
           <w:tcPr>
-            <w:tcW w:type="dxa" w:w="1080"/>
+            <w:tcW w:type="dxa" w:w="960"/>
           </w:tcPr>
           <w:p>
             <w:r>
               <w:rPr>
-                <w:sz w:val="13"/>
+                <w:sz w:val="12"/>
               </w:rPr>
               <w:t>Forskrift om merking av fiskeredskaper</w:t>
             </w:r>
@@ -513,12 +567,25 @@
         </w:tc>
         <w:tc>
           <w:tcPr>
-            <w:tcW w:type="dxa" w:w="1080"/>
+            <w:tcW w:type="dxa" w:w="960"/>
           </w:tcPr>
           <w:p>
             <w:r>
               <w:rPr>
-                <w:sz w:val="13"/>
+                <w:sz w:val="12"/>
+              </w:rPr>
+              <w:t>Regulation on marking of fishing gear</w:t>
+            </w:r>
+          </w:p>
+        </w:tc>
+        <w:tc>
+          <w:tcPr>
+            <w:tcW w:type="dxa" w:w="960"/>
+          </w:tcPr>
+          <w:p>
+            <w:r>
+              <w:rPr>
+                <w:sz w:val="12"/>
               </w:rPr>
               <w:t>Regulation</w:t>
             </w:r>
@@ -526,12 +593,12 @@
         </w:tc>
         <w:tc>
           <w:tcPr>
-            <w:tcW w:type="dxa" w:w="1080"/>
+            <w:tcW w:type="dxa" w:w="960"/>
           </w:tcPr>
           <w:p>
             <w:r>
               <w:rPr>
-                <w:sz w:val="13"/>
+                <w:sz w:val="12"/>
               </w:rPr>
               <w:t>1982</w:t>
             </w:r>
@@ -539,12 +606,12 @@
         </w:tc>
         <w:tc>
           <w:tcPr>
-            <w:tcW w:type="dxa" w:w="1080"/>
+            <w:tcW w:type="dxa" w:w="960"/>
           </w:tcPr>
           <w:p>
             <w:r>
               <w:rPr>
-                <w:sz w:val="13"/>
+                <w:sz w:val="12"/>
               </w:rPr>
               <w:t>1982</w:t>
             </w:r>
@@ -552,12 +619,12 @@
         </w:tc>
         <w:tc>
           <w:tcPr>
-            <w:tcW w:type="dxa" w:w="1080"/>
+            <w:tcW w:type="dxa" w:w="960"/>
           </w:tcPr>
           <w:p>
             <w:r>
               <w:rPr>
-                <w:sz w:val="13"/>
+                <w:sz w:val="12"/>
               </w:rPr>
               <w:t>Requires marking of fixed and drifting fishing gear in the Norwegian EEZ to identify owners; reduces lost gear and associated plastic marine litter (ghost fishing). In force from 1984.</w:t>
             </w:r>
@@ -565,12 +632,12 @@
         </w:tc>
         <w:tc>
           <w:tcPr>
-            <w:tcW w:type="dxa" w:w="1080"/>
+            <w:tcW w:type="dxa" w:w="960"/>
           </w:tcPr>
           <w:p>
             <w:r>
               <w:rPr>
-                <w:sz w:val="13"/>
+                <w:sz w:val="12"/>
               </w:rPr>
               <w:t>Fisheries; aquaculture</w:t>
             </w:r>
@@ -578,12 +645,12 @@
         </w:tc>
         <w:tc>
           <w:tcPr>
-            <w:tcW w:type="dxa" w:w="1080"/>
+            <w:tcW w:type="dxa" w:w="960"/>
           </w:tcPr>
           <w:p>
             <w:r>
               <w:rPr>
-                <w:sz w:val="13"/>
+                <w:sz w:val="12"/>
               </w:rPr>
               <w:t>Use/Consumption; Litter/Pollution</w:t>
             </w:r>
@@ -591,12 +658,12 @@
         </w:tc>
         <w:tc>
           <w:tcPr>
-            <w:tcW w:type="dxa" w:w="1080"/>
+            <w:tcW w:type="dxa" w:w="960"/>
           </w:tcPr>
           <w:p>
             <w:r>
               <w:rPr>
-                <w:sz w:val="13"/>
+                <w:sz w:val="12"/>
               </w:rPr>
             </w:r>
             <w:hyperlink r:id="rId12">
@@ -614,12 +681,12 @@
       <w:tr>
         <w:tc>
           <w:tcPr>
-            <w:tcW w:type="dxa" w:w="1080"/>
+            <w:tcW w:type="dxa" w:w="960"/>
           </w:tcPr>
           <w:p>
             <w:r>
               <w:rPr>
-                <w:sz w:val="13"/>
+                <w:sz w:val="12"/>
               </w:rPr>
               <w:t>Forskrift om særavgifter – Kap. 3-5: Avgifter på drikkevareemballasje</w:t>
             </w:r>
@@ -627,12 +694,25 @@
         </w:tc>
         <w:tc>
           <w:tcPr>
-            <w:tcW w:type="dxa" w:w="1080"/>
+            <w:tcW w:type="dxa" w:w="960"/>
           </w:tcPr>
           <w:p>
             <w:r>
               <w:rPr>
-                <w:sz w:val="13"/>
+                <w:sz w:val="12"/>
+              </w:rPr>
+              <w:t>Regulation on special excise duties – Ch. 3-5: Duties on beverage packaging</w:t>
+            </w:r>
+          </w:p>
+        </w:tc>
+        <w:tc>
+          <w:tcPr>
+            <w:tcW w:type="dxa" w:w="960"/>
+          </w:tcPr>
+          <w:p>
+            <w:r>
+              <w:rPr>
+                <w:sz w:val="12"/>
               </w:rPr>
               <w:t>Regulation (Tax)</w:t>
             </w:r>
@@ -640,12 +720,12 @@
         </w:tc>
         <w:tc>
           <w:tcPr>
-            <w:tcW w:type="dxa" w:w="1080"/>
+            <w:tcW w:type="dxa" w:w="960"/>
           </w:tcPr>
           <w:p>
             <w:r>
               <w:rPr>
-                <w:sz w:val="13"/>
+                <w:sz w:val="12"/>
               </w:rPr>
               <w:t>2001</w:t>
             </w:r>
@@ -653,12 +733,12 @@
         </w:tc>
         <w:tc>
           <w:tcPr>
-            <w:tcW w:type="dxa" w:w="1080"/>
+            <w:tcW w:type="dxa" w:w="960"/>
           </w:tcPr>
           <w:p>
             <w:r>
               <w:rPr>
-                <w:sz w:val="13"/>
+                <w:sz w:val="12"/>
               </w:rPr>
               <w:t>2025</w:t>
             </w:r>
@@ -666,12 +746,12 @@
         </w:tc>
         <w:tc>
           <w:tcPr>
-            <w:tcW w:type="dxa" w:w="1080"/>
+            <w:tcW w:type="dxa" w:w="960"/>
           </w:tcPr>
           <w:p>
             <w:r>
               <w:rPr>
-                <w:sz w:val="13"/>
+                <w:sz w:val="12"/>
               </w:rPr>
               <w:t>Detailed excise rules for beverage packaging including plastic; works with annual Stortingsvedtak setting per-unit environmental and basic tax rates.</w:t>
             </w:r>
@@ -679,12 +759,12 @@
         </w:tc>
         <w:tc>
           <w:tcPr>
-            <w:tcW w:type="dxa" w:w="1080"/>
+            <w:tcW w:type="dxa" w:w="960"/>
           </w:tcPr>
           <w:p>
             <w:r>
               <w:rPr>
-                <w:sz w:val="13"/>
+                <w:sz w:val="12"/>
               </w:rPr>
               <w:t>Beverage; packaging; retail</w:t>
             </w:r>
@@ -692,12 +772,12 @@
         </w:tc>
         <w:tc>
           <w:tcPr>
-            <w:tcW w:type="dxa" w:w="1080"/>
+            <w:tcW w:type="dxa" w:w="960"/>
           </w:tcPr>
           <w:p>
             <w:r>
               <w:rPr>
-                <w:sz w:val="13"/>
+                <w:sz w:val="12"/>
               </w:rPr>
               <w:t>Use/Consumption; End-of-life</w:t>
             </w:r>
@@ -705,12 +785,12 @@
         </w:tc>
         <w:tc>
           <w:tcPr>
-            <w:tcW w:type="dxa" w:w="1080"/>
+            <w:tcW w:type="dxa" w:w="960"/>
           </w:tcPr>
           <w:p>
             <w:r>
               <w:rPr>
-                <w:sz w:val="13"/>
+                <w:sz w:val="12"/>
               </w:rPr>
             </w:r>
             <w:hyperlink r:id="rId13">
@@ -728,12 +808,12 @@
       <w:tr>
         <w:tc>
           <w:tcPr>
-            <w:tcW w:type="dxa" w:w="1080"/>
+            <w:tcW w:type="dxa" w:w="960"/>
           </w:tcPr>
           <w:p>
             <w:r>
               <w:rPr>
-                <w:sz w:val="13"/>
+                <w:sz w:val="12"/>
               </w:rPr>
               <w:t>Stortingsvedtak om avgifter på drikkevareemballasje for 2026</w:t>
             </w:r>
@@ -741,12 +821,25 @@
         </w:tc>
         <w:tc>
           <w:tcPr>
-            <w:tcW w:type="dxa" w:w="1080"/>
+            <w:tcW w:type="dxa" w:w="960"/>
           </w:tcPr>
           <w:p>
             <w:r>
               <w:rPr>
-                <w:sz w:val="13"/>
+                <w:sz w:val="12"/>
+              </w:rPr>
+              <w:t>Parliamentary resolution on duties on beverage packaging for 2026</w:t>
+            </w:r>
+          </w:p>
+        </w:tc>
+        <w:tc>
+          <w:tcPr>
+            <w:tcW w:type="dxa" w:w="960"/>
+          </w:tcPr>
+          <w:p>
+            <w:r>
+              <w:rPr>
+                <w:sz w:val="12"/>
               </w:rPr>
               <w:t>Parliamentary resolution</w:t>
             </w:r>
@@ -754,12 +847,12 @@
         </w:tc>
         <w:tc>
           <w:tcPr>
-            <w:tcW w:type="dxa" w:w="1080"/>
+            <w:tcW w:type="dxa" w:w="960"/>
           </w:tcPr>
           <w:p>
             <w:r>
               <w:rPr>
-                <w:sz w:val="13"/>
+                <w:sz w:val="12"/>
               </w:rPr>
               <w:t>2001</w:t>
             </w:r>
@@ -767,12 +860,12 @@
         </w:tc>
         <w:tc>
           <w:tcPr>
-            <w:tcW w:type="dxa" w:w="1080"/>
+            <w:tcW w:type="dxa" w:w="960"/>
           </w:tcPr>
           <w:p>
             <w:r>
               <w:rPr>
-                <w:sz w:val="13"/>
+                <w:sz w:val="12"/>
               </w:rPr>
               <w:t>2025</w:t>
             </w:r>
@@ -780,12 +873,12 @@
         </w:tc>
         <w:tc>
           <w:tcPr>
-            <w:tcW w:type="dxa" w:w="1080"/>
+            <w:tcW w:type="dxa" w:w="960"/>
           </w:tcPr>
           <w:p>
             <w:r>
               <w:rPr>
-                <w:sz w:val="13"/>
+                <w:sz w:val="12"/>
               </w:rPr>
               <w:t>Annual rate-setting instrument; 2026 plastic packaging environmental tax NOK 4.27/unit with deposit-system exemptions.</w:t>
             </w:r>
@@ -793,12 +886,12 @@
         </w:tc>
         <w:tc>
           <w:tcPr>
-            <w:tcW w:type="dxa" w:w="1080"/>
+            <w:tcW w:type="dxa" w:w="960"/>
           </w:tcPr>
           <w:p>
             <w:r>
               <w:rPr>
-                <w:sz w:val="13"/>
+                <w:sz w:val="12"/>
               </w:rPr>
               <w:t>Beverage; plastic packaging</w:t>
             </w:r>
@@ -806,12 +899,12 @@
         </w:tc>
         <w:tc>
           <w:tcPr>
-            <w:tcW w:type="dxa" w:w="1080"/>
+            <w:tcW w:type="dxa" w:w="960"/>
           </w:tcPr>
           <w:p>
             <w:r>
               <w:rPr>
-                <w:sz w:val="13"/>
+                <w:sz w:val="12"/>
               </w:rPr>
               <w:t>Use/Consumption; End-of-life</w:t>
             </w:r>
@@ -819,12 +912,12 @@
         </w:tc>
         <w:tc>
           <w:tcPr>
-            <w:tcW w:type="dxa" w:w="1080"/>
+            <w:tcW w:type="dxa" w:w="960"/>
           </w:tcPr>
           <w:p>
             <w:r>
               <w:rPr>
-                <w:sz w:val="13"/>
+                <w:sz w:val="12"/>
               </w:rPr>
             </w:r>
             <w:hyperlink r:id="rId14">
@@ -842,12 +935,12 @@
       <w:tr>
         <w:tc>
           <w:tcPr>
-            <w:tcW w:type="dxa" w:w="1080"/>
+            <w:tcW w:type="dxa" w:w="960"/>
           </w:tcPr>
           <w:p>
             <w:r>
               <w:rPr>
-                <w:sz w:val="13"/>
+                <w:sz w:val="12"/>
               </w:rPr>
               <w:t>Avfallsforskriften – Kap. 15: Kommunalt avfallsgebyr</w:t>
             </w:r>
@@ -855,12 +948,25 @@
         </w:tc>
         <w:tc>
           <w:tcPr>
-            <w:tcW w:type="dxa" w:w="1080"/>
+            <w:tcW w:type="dxa" w:w="960"/>
           </w:tcPr>
           <w:p>
             <w:r>
               <w:rPr>
-                <w:sz w:val="13"/>
+                <w:sz w:val="12"/>
+              </w:rPr>
+              <w:t>Waste Regulation – Ch. 15: Municipal waste fee</w:t>
+            </w:r>
+          </w:p>
+        </w:tc>
+        <w:tc>
+          <w:tcPr>
+            <w:tcW w:type="dxa" w:w="960"/>
+          </w:tcPr>
+          <w:p>
+            <w:r>
+              <w:rPr>
+                <w:sz w:val="12"/>
               </w:rPr>
               <w:t>Regulation</w:t>
             </w:r>
@@ -868,12 +974,12 @@
         </w:tc>
         <w:tc>
           <w:tcPr>
-            <w:tcW w:type="dxa" w:w="1080"/>
+            <w:tcW w:type="dxa" w:w="960"/>
           </w:tcPr>
           <w:p>
             <w:r>
               <w:rPr>
-                <w:sz w:val="13"/>
+                <w:sz w:val="12"/>
               </w:rPr>
               <w:t>2004</w:t>
             </w:r>
@@ -881,12 +987,12 @@
         </w:tc>
         <w:tc>
           <w:tcPr>
-            <w:tcW w:type="dxa" w:w="1080"/>
+            <w:tcW w:type="dxa" w:w="960"/>
           </w:tcPr>
           <w:p>
             <w:r>
               <w:rPr>
-                <w:sz w:val="13"/>
+                <w:sz w:val="12"/>
               </w:rPr>
               <w:t>2024</w:t>
             </w:r>
@@ -894,12 +1000,12 @@
         </w:tc>
         <w:tc>
           <w:tcPr>
-            <w:tcW w:type="dxa" w:w="1080"/>
+            <w:tcW w:type="dxa" w:w="960"/>
           </w:tcPr>
           <w:p>
             <w:r>
               <w:rPr>
-                <w:sz w:val="13"/>
+                <w:sz w:val="12"/>
               </w:rPr>
               <w:t>National rules for municipal household waste fees; enables and structures local (subnational) waste collection and treatment financing including plastic household waste.</w:t>
             </w:r>
@@ -907,12 +1013,12 @@
         </w:tc>
         <w:tc>
           <w:tcPr>
-            <w:tcW w:type="dxa" w:w="1080"/>
+            <w:tcW w:type="dxa" w:w="960"/>
           </w:tcPr>
           <w:p>
             <w:r>
               <w:rPr>
-                <w:sz w:val="13"/>
+                <w:sz w:val="12"/>
               </w:rPr>
               <w:t>Municipalities; households; waste management</w:t>
             </w:r>
@@ -920,12 +1026,12 @@
         </w:tc>
         <w:tc>
           <w:tcPr>
-            <w:tcW w:type="dxa" w:w="1080"/>
+            <w:tcW w:type="dxa" w:w="960"/>
           </w:tcPr>
           <w:p>
             <w:r>
               <w:rPr>
-                <w:sz w:val="13"/>
+                <w:sz w:val="12"/>
               </w:rPr>
               <w:t>End-of-life</w:t>
             </w:r>
@@ -933,12 +1039,12 @@
         </w:tc>
         <w:tc>
           <w:tcPr>
-            <w:tcW w:type="dxa" w:w="1080"/>
+            <w:tcW w:type="dxa" w:w="960"/>
           </w:tcPr>
           <w:p>
             <w:r>
               <w:rPr>
-                <w:sz w:val="13"/>
+                <w:sz w:val="12"/>
               </w:rPr>
             </w:r>
             <w:hyperlink r:id="rId15">
@@ -956,12 +1062,12 @@
       <w:tr>
         <w:tc>
           <w:tcPr>
-            <w:tcW w:type="dxa" w:w="1080"/>
+            <w:tcW w:type="dxa" w:w="960"/>
           </w:tcPr>
           <w:p>
             <w:r>
               <w:rPr>
-                <w:sz w:val="13"/>
+                <w:sz w:val="12"/>
               </w:rPr>
               <w:t>Avfallsforskriften – Kap. 1: Kasserte elektriske og elektroniske produkter (EE-avfall)</w:t>
             </w:r>
@@ -969,12 +1075,25 @@
         </w:tc>
         <w:tc>
           <w:tcPr>
-            <w:tcW w:type="dxa" w:w="1080"/>
+            <w:tcW w:type="dxa" w:w="960"/>
           </w:tcPr>
           <w:p>
             <w:r>
               <w:rPr>
-                <w:sz w:val="13"/>
+                <w:sz w:val="12"/>
+              </w:rPr>
+              <w:t>Waste Regulation – Ch. 1: Discarded electrical and electronic equipment (WEEE)</w:t>
+            </w:r>
+          </w:p>
+        </w:tc>
+        <w:tc>
+          <w:tcPr>
+            <w:tcW w:type="dxa" w:w="960"/>
+          </w:tcPr>
+          <w:p>
+            <w:r>
+              <w:rPr>
+                <w:sz w:val="12"/>
               </w:rPr>
               <w:t>Regulation</w:t>
             </w:r>
@@ -982,12 +1101,12 @@
         </w:tc>
         <w:tc>
           <w:tcPr>
-            <w:tcW w:type="dxa" w:w="1080"/>
+            <w:tcW w:type="dxa" w:w="960"/>
           </w:tcPr>
           <w:p>
             <w:r>
               <w:rPr>
-                <w:sz w:val="13"/>
+                <w:sz w:val="12"/>
               </w:rPr>
               <w:t>2004</w:t>
             </w:r>
@@ -995,12 +1114,12 @@
         </w:tc>
         <w:tc>
           <w:tcPr>
-            <w:tcW w:type="dxa" w:w="1080"/>
+            <w:tcW w:type="dxa" w:w="960"/>
           </w:tcPr>
           <w:p>
             <w:r>
               <w:rPr>
-                <w:sz w:val="13"/>
+                <w:sz w:val="12"/>
               </w:rPr>
               <w:t>2025</w:t>
             </w:r>
@@ -1008,12 +1127,12 @@
         </w:tc>
         <w:tc>
           <w:tcPr>
-            <w:tcW w:type="dxa" w:w="1080"/>
+            <w:tcW w:type="dxa" w:w="960"/>
           </w:tcPr>
           <w:p>
             <w:r>
               <w:rPr>
-                <w:sz w:val="13"/>
+                <w:sz w:val="12"/>
               </w:rPr>
               <w:t>EPR for discarded electrical/electronic equipment containing significant plastics; requires collection, treatment and recycling nationwide.</w:t>
             </w:r>
@@ -1021,12 +1140,12 @@
         </w:tc>
         <w:tc>
           <w:tcPr>
-            <w:tcW w:type="dxa" w:w="1080"/>
+            <w:tcW w:type="dxa" w:w="960"/>
           </w:tcPr>
           <w:p>
             <w:r>
               <w:rPr>
-                <w:sz w:val="13"/>
+                <w:sz w:val="12"/>
               </w:rPr>
               <w:t>Electronics; retail; waste management</w:t>
             </w:r>
@@ -1034,12 +1153,12 @@
         </w:tc>
         <w:tc>
           <w:tcPr>
-            <w:tcW w:type="dxa" w:w="1080"/>
+            <w:tcW w:type="dxa" w:w="960"/>
           </w:tcPr>
           <w:p>
             <w:r>
               <w:rPr>
-                <w:sz w:val="13"/>
+                <w:sz w:val="12"/>
               </w:rPr>
               <w:t>End-of-life</w:t>
             </w:r>
@@ -1047,12 +1166,12 @@
         </w:tc>
         <w:tc>
           <w:tcPr>
-            <w:tcW w:type="dxa" w:w="1080"/>
+            <w:tcW w:type="dxa" w:w="960"/>
           </w:tcPr>
           <w:p>
             <w:r>
               <w:rPr>
-                <w:sz w:val="13"/>
+                <w:sz w:val="12"/>
               </w:rPr>
             </w:r>
             <w:hyperlink r:id="rId16">
@@ -1070,12 +1189,12 @@
       <w:tr>
         <w:tc>
           <w:tcPr>
-            <w:tcW w:type="dxa" w:w="1080"/>
+            <w:tcW w:type="dxa" w:w="960"/>
           </w:tcPr>
           <w:p>
             <w:r>
               <w:rPr>
-                <w:sz w:val="13"/>
+                <w:sz w:val="12"/>
               </w:rPr>
               <w:t>Avfallsforskriften – Kap. 4: Kasserte kjøretøy</w:t>
             </w:r>
@@ -1083,12 +1202,25 @@
         </w:tc>
         <w:tc>
           <w:tcPr>
-            <w:tcW w:type="dxa" w:w="1080"/>
+            <w:tcW w:type="dxa" w:w="960"/>
           </w:tcPr>
           <w:p>
             <w:r>
               <w:rPr>
-                <w:sz w:val="13"/>
+                <w:sz w:val="12"/>
+              </w:rPr>
+              <w:t>Waste Regulation – Ch. 4: End-of-life vehicles</w:t>
+            </w:r>
+          </w:p>
+        </w:tc>
+        <w:tc>
+          <w:tcPr>
+            <w:tcW w:type="dxa" w:w="960"/>
+          </w:tcPr>
+          <w:p>
+            <w:r>
+              <w:rPr>
+                <w:sz w:val="12"/>
               </w:rPr>
               <w:t>Regulation</w:t>
             </w:r>
@@ -1096,12 +1228,12 @@
         </w:tc>
         <w:tc>
           <w:tcPr>
-            <w:tcW w:type="dxa" w:w="1080"/>
+            <w:tcW w:type="dxa" w:w="960"/>
           </w:tcPr>
           <w:p>
             <w:r>
               <w:rPr>
-                <w:sz w:val="13"/>
+                <w:sz w:val="12"/>
               </w:rPr>
               <w:t>2004</w:t>
             </w:r>
@@ -1109,12 +1241,12 @@
         </w:tc>
         <w:tc>
           <w:tcPr>
-            <w:tcW w:type="dxa" w:w="1080"/>
+            <w:tcW w:type="dxa" w:w="960"/>
           </w:tcPr>
           <w:p>
             <w:r>
               <w:rPr>
-                <w:sz w:val="13"/>
+                <w:sz w:val="12"/>
               </w:rPr>
               <w:t>2024</w:t>
             </w:r>
@@ -1122,12 +1254,12 @@
         </w:tc>
         <w:tc>
           <w:tcPr>
-            <w:tcW w:type="dxa" w:w="1080"/>
+            <w:tcW w:type="dxa" w:w="960"/>
           </w:tcPr>
           <w:p>
             <w:r>
               <w:rPr>
-                <w:sz w:val="13"/>
+                <w:sz w:val="12"/>
               </w:rPr>
               <w:t>EPR for end-of-life vehicles including plastic components (bumpers, interiors, etc.); mandates depollution, reuse and material recovery.</w:t>
             </w:r>
@@ -1135,12 +1267,12 @@
         </w:tc>
         <w:tc>
           <w:tcPr>
-            <w:tcW w:type="dxa" w:w="1080"/>
+            <w:tcW w:type="dxa" w:w="960"/>
           </w:tcPr>
           <w:p>
             <w:r>
               <w:rPr>
-                <w:sz w:val="13"/>
+                <w:sz w:val="12"/>
               </w:rPr>
               <w:t>Automotive; waste management</w:t>
             </w:r>
@@ -1148,12 +1280,12 @@
         </w:tc>
         <w:tc>
           <w:tcPr>
-            <w:tcW w:type="dxa" w:w="1080"/>
+            <w:tcW w:type="dxa" w:w="960"/>
           </w:tcPr>
           <w:p>
             <w:r>
               <w:rPr>
-                <w:sz w:val="13"/>
+                <w:sz w:val="12"/>
               </w:rPr>
               <w:t>End-of-life</w:t>
             </w:r>
@@ -1161,12 +1293,12 @@
         </w:tc>
         <w:tc>
           <w:tcPr>
-            <w:tcW w:type="dxa" w:w="1080"/>
+            <w:tcW w:type="dxa" w:w="960"/>
           </w:tcPr>
           <w:p>
             <w:r>
               <w:rPr>
-                <w:sz w:val="13"/>
+                <w:sz w:val="12"/>
               </w:rPr>
             </w:r>
             <w:hyperlink r:id="rId17">
@@ -1184,12 +1316,12 @@
       <w:tr>
         <w:tc>
           <w:tcPr>
-            <w:tcW w:type="dxa" w:w="1080"/>
+            <w:tcW w:type="dxa" w:w="960"/>
           </w:tcPr>
           <w:p>
             <w:r>
               <w:rPr>
-                <w:sz w:val="13"/>
+                <w:sz w:val="12"/>
               </w:rPr>
               <w:t>Avfallsforskriften – Kap. 5: Kasserte dekk</w:t>
             </w:r>
@@ -1197,12 +1329,25 @@
         </w:tc>
         <w:tc>
           <w:tcPr>
-            <w:tcW w:type="dxa" w:w="1080"/>
+            <w:tcW w:type="dxa" w:w="960"/>
           </w:tcPr>
           <w:p>
             <w:r>
               <w:rPr>
-                <w:sz w:val="13"/>
+                <w:sz w:val="12"/>
+              </w:rPr>
+              <w:t>Waste Regulation – Ch. 5: Discarded tyres</w:t>
+            </w:r>
+          </w:p>
+        </w:tc>
+        <w:tc>
+          <w:tcPr>
+            <w:tcW w:type="dxa" w:w="960"/>
+          </w:tcPr>
+          <w:p>
+            <w:r>
+              <w:rPr>
+                <w:sz w:val="12"/>
               </w:rPr>
               <w:t>Regulation</w:t>
             </w:r>
@@ -1210,12 +1355,12 @@
         </w:tc>
         <w:tc>
           <w:tcPr>
-            <w:tcW w:type="dxa" w:w="1080"/>
+            <w:tcW w:type="dxa" w:w="960"/>
           </w:tcPr>
           <w:p>
             <w:r>
               <w:rPr>
-                <w:sz w:val="13"/>
+                <w:sz w:val="12"/>
               </w:rPr>
               <w:t>2004</w:t>
             </w:r>
@@ -1223,12 +1368,12 @@
         </w:tc>
         <w:tc>
           <w:tcPr>
-            <w:tcW w:type="dxa" w:w="1080"/>
+            <w:tcW w:type="dxa" w:w="960"/>
           </w:tcPr>
           <w:p>
             <w:r>
               <w:rPr>
-                <w:sz w:val="13"/>
+                <w:sz w:val="12"/>
               </w:rPr>
               <w:t>2024</w:t>
             </w:r>
@@ -1236,12 +1381,12 @@
         </w:tc>
         <w:tc>
           <w:tcPr>
-            <w:tcW w:type="dxa" w:w="1080"/>
+            <w:tcW w:type="dxa" w:w="960"/>
           </w:tcPr>
           <w:p>
             <w:r>
               <w:rPr>
-                <w:sz w:val="13"/>
+                <w:sz w:val="12"/>
               </w:rPr>
               <w:t>EPR for end-of-life tyres (synthetic rubber/plastic polymers); requires collection and recycling to reduce tyre waste and microplastic pollution.</w:t>
             </w:r>
@@ -1249,12 +1394,12 @@
         </w:tc>
         <w:tc>
           <w:tcPr>
-            <w:tcW w:type="dxa" w:w="1080"/>
+            <w:tcW w:type="dxa" w:w="960"/>
           </w:tcPr>
           <w:p>
             <w:r>
               <w:rPr>
-                <w:sz w:val="13"/>
+                <w:sz w:val="12"/>
               </w:rPr>
               <w:t>Automotive; transport; waste management</w:t>
             </w:r>
@@ -1262,12 +1407,12 @@
         </w:tc>
         <w:tc>
           <w:tcPr>
-            <w:tcW w:type="dxa" w:w="1080"/>
+            <w:tcW w:type="dxa" w:w="960"/>
           </w:tcPr>
           <w:p>
             <w:r>
               <w:rPr>
-                <w:sz w:val="13"/>
+                <w:sz w:val="12"/>
               </w:rPr>
               <w:t>End-of-life; Litter/Pollution</w:t>
             </w:r>
@@ -1275,12 +1420,12 @@
         </w:tc>
         <w:tc>
           <w:tcPr>
-            <w:tcW w:type="dxa" w:w="1080"/>
+            <w:tcW w:type="dxa" w:w="960"/>
           </w:tcPr>
           <w:p>
             <w:r>
               <w:rPr>
-                <w:sz w:val="13"/>
+                <w:sz w:val="12"/>
               </w:rPr>
             </w:r>
             <w:hyperlink r:id="rId18">
@@ -1298,12 +1443,12 @@
       <w:tr>
         <w:tc>
           <w:tcPr>
-            <w:tcW w:type="dxa" w:w="1080"/>
+            <w:tcW w:type="dxa" w:w="960"/>
           </w:tcPr>
           <w:p>
             <w:r>
               <w:rPr>
-                <w:sz w:val="13"/>
+                <w:sz w:val="12"/>
               </w:rPr>
               <w:t>Avfallsforskriften – Kap. 6: Retursystemer for emballasje til drikkevarer (pant)</w:t>
             </w:r>
@@ -1311,12 +1456,25 @@
         </w:tc>
         <w:tc>
           <w:tcPr>
-            <w:tcW w:type="dxa" w:w="1080"/>
+            <w:tcW w:type="dxa" w:w="960"/>
           </w:tcPr>
           <w:p>
             <w:r>
               <w:rPr>
-                <w:sz w:val="13"/>
+                <w:sz w:val="12"/>
+              </w:rPr>
+              <w:t>Waste Regulation – Ch. 6: Return systems for beverage packaging (deposit-return scheme)</w:t>
+            </w:r>
+          </w:p>
+        </w:tc>
+        <w:tc>
+          <w:tcPr>
+            <w:tcW w:type="dxa" w:w="960"/>
+          </w:tcPr>
+          <w:p>
+            <w:r>
+              <w:rPr>
+                <w:sz w:val="12"/>
               </w:rPr>
               <w:t>Regulation</w:t>
             </w:r>
@@ -1324,12 +1482,12 @@
         </w:tc>
         <w:tc>
           <w:tcPr>
-            <w:tcW w:type="dxa" w:w="1080"/>
+            <w:tcW w:type="dxa" w:w="960"/>
           </w:tcPr>
           <w:p>
             <w:r>
               <w:rPr>
-                <w:sz w:val="13"/>
+                <w:sz w:val="12"/>
               </w:rPr>
               <w:t>2004</w:t>
             </w:r>
@@ -1337,12 +1495,12 @@
         </w:tc>
         <w:tc>
           <w:tcPr>
-            <w:tcW w:type="dxa" w:w="1080"/>
+            <w:tcW w:type="dxa" w:w="960"/>
           </w:tcPr>
           <w:p>
             <w:r>
               <w:rPr>
-                <w:sz w:val="13"/>
+                <w:sz w:val="12"/>
               </w:rPr>
               <w:t>2025</w:t>
             </w:r>
@@ -1350,12 +1508,12 @@
         </w:tc>
         <w:tc>
           <w:tcPr>
-            <w:tcW w:type="dxa" w:w="1080"/>
+            <w:tcW w:type="dxa" w:w="960"/>
           </w:tcPr>
           <w:p>
             <w:r>
               <w:rPr>
-                <w:sz w:val="13"/>
+                <w:sz w:val="12"/>
               </w:rPr>
               <w:t>Mandatory deposit-return system for beverage containers including plastic bottles; &gt;95% return rate target; retailer take-back and approved PRO requirements.</w:t>
             </w:r>
@@ -1363,12 +1521,12 @@
         </w:tc>
         <w:tc>
           <w:tcPr>
-            <w:tcW w:type="dxa" w:w="1080"/>
+            <w:tcW w:type="dxa" w:w="960"/>
           </w:tcPr>
           <w:p>
             <w:r>
               <w:rPr>
-                <w:sz w:val="13"/>
+                <w:sz w:val="12"/>
               </w:rPr>
               <w:t>Beverage; retail; waste management</w:t>
             </w:r>
@@ -1376,12 +1534,12 @@
         </w:tc>
         <w:tc>
           <w:tcPr>
-            <w:tcW w:type="dxa" w:w="1080"/>
+            <w:tcW w:type="dxa" w:w="960"/>
           </w:tcPr>
           <w:p>
             <w:r>
               <w:rPr>
-                <w:sz w:val="13"/>
+                <w:sz w:val="12"/>
               </w:rPr>
               <w:t>Use/Consumption; End-of-life; Litter/Pollution</w:t>
             </w:r>
@@ -1389,12 +1547,12 @@
         </w:tc>
         <w:tc>
           <w:tcPr>
-            <w:tcW w:type="dxa" w:w="1080"/>
+            <w:tcW w:type="dxa" w:w="960"/>
           </w:tcPr>
           <w:p>
             <w:r>
               <w:rPr>
-                <w:sz w:val="13"/>
+                <w:sz w:val="12"/>
               </w:rPr>
             </w:r>
             <w:hyperlink r:id="rId19">
@@ -1412,12 +1570,12 @@
       <w:tr>
         <w:tc>
           <w:tcPr>
-            <w:tcW w:type="dxa" w:w="1080"/>
+            <w:tcW w:type="dxa" w:w="960"/>
           </w:tcPr>
           <w:p>
             <w:r>
               <w:rPr>
-                <w:sz w:val="13"/>
+                <w:sz w:val="12"/>
               </w:rPr>
               <w:t>Avfallsforskriften – Kap. 7: Emballasje og emballasjeavfall</w:t>
             </w:r>
@@ -1425,12 +1583,25 @@
         </w:tc>
         <w:tc>
           <w:tcPr>
-            <w:tcW w:type="dxa" w:w="1080"/>
+            <w:tcW w:type="dxa" w:w="960"/>
           </w:tcPr>
           <w:p>
             <w:r>
               <w:rPr>
-                <w:sz w:val="13"/>
+                <w:sz w:val="12"/>
+              </w:rPr>
+              <w:t>Waste Regulation – Ch. 7: Packaging and packaging waste</w:t>
+            </w:r>
+          </w:p>
+        </w:tc>
+        <w:tc>
+          <w:tcPr>
+            <w:tcW w:type="dxa" w:w="960"/>
+          </w:tcPr>
+          <w:p>
+            <w:r>
+              <w:rPr>
+                <w:sz w:val="12"/>
               </w:rPr>
               <w:t>Regulation</w:t>
             </w:r>
@@ -1438,12 +1609,12 @@
         </w:tc>
         <w:tc>
           <w:tcPr>
-            <w:tcW w:type="dxa" w:w="1080"/>
+            <w:tcW w:type="dxa" w:w="960"/>
           </w:tcPr>
           <w:p>
             <w:r>
               <w:rPr>
-                <w:sz w:val="13"/>
+                <w:sz w:val="12"/>
               </w:rPr>
               <w:t>2004</w:t>
             </w:r>
@@ -1451,12 +1622,12 @@
         </w:tc>
         <w:tc>
           <w:tcPr>
-            <w:tcW w:type="dxa" w:w="1080"/>
+            <w:tcW w:type="dxa" w:w="960"/>
           </w:tcPr>
           <w:p>
             <w:r>
               <w:rPr>
-                <w:sz w:val="13"/>
+                <w:sz w:val="12"/>
               </w:rPr>
               <w:t>2025</w:t>
             </w:r>
@@ -1464,12 +1635,12 @@
         </w:tc>
         <w:tc>
           <w:tcPr>
-            <w:tcW w:type="dxa" w:w="1080"/>
+            <w:tcW w:type="dxa" w:w="960"/>
           </w:tcPr>
           <w:p>
             <w:r>
               <w:rPr>
-                <w:sz w:val="13"/>
+                <w:sz w:val="12"/>
               </w:rPr>
               <w:t>EPR for packaging including plastic; recycling targets (47% plastic from 2025), plastic carrier bag reporting, essential design requirements. Implements EU Packaging Directive framework.</w:t>
             </w:r>
@@ -1477,12 +1648,12 @@
         </w:tc>
         <w:tc>
           <w:tcPr>
-            <w:tcW w:type="dxa" w:w="1080"/>
+            <w:tcW w:type="dxa" w:w="960"/>
           </w:tcPr>
           <w:p>
             <w:r>
               <w:rPr>
-                <w:sz w:val="13"/>
+                <w:sz w:val="12"/>
               </w:rPr>
               <w:t>Packaging; retail; manufacturing; waste management</w:t>
             </w:r>
@@ -1490,12 +1661,12 @@
         </w:tc>
         <w:tc>
           <w:tcPr>
-            <w:tcW w:type="dxa" w:w="1080"/>
+            <w:tcW w:type="dxa" w:w="960"/>
           </w:tcPr>
           <w:p>
             <w:r>
               <w:rPr>
-                <w:sz w:val="13"/>
+                <w:sz w:val="12"/>
               </w:rPr>
               <w:t>Production; Design; End-of-life; Use/Consumption</w:t>
             </w:r>
@@ -1503,12 +1674,12 @@
         </w:tc>
         <w:tc>
           <w:tcPr>
-            <w:tcW w:type="dxa" w:w="1080"/>
+            <w:tcW w:type="dxa" w:w="960"/>
           </w:tcPr>
           <w:p>
             <w:r>
               <w:rPr>
-                <w:sz w:val="13"/>
+                <w:sz w:val="12"/>
               </w:rPr>
             </w:r>
             <w:hyperlink r:id="rId20">
@@ -1526,12 +1697,12 @@
       <w:tr>
         <w:tc>
           <w:tcPr>
-            <w:tcW w:type="dxa" w:w="1080"/>
+            <w:tcW w:type="dxa" w:w="960"/>
           </w:tcPr>
           <w:p>
             <w:r>
               <w:rPr>
-                <w:sz w:val="13"/>
+                <w:sz w:val="12"/>
               </w:rPr>
               <w:t>Forskrift om begrensning av forurensning (Forurensningsforskriften)</w:t>
             </w:r>
@@ -1539,12 +1710,25 @@
         </w:tc>
         <w:tc>
           <w:tcPr>
-            <w:tcW w:type="dxa" w:w="1080"/>
+            <w:tcW w:type="dxa" w:w="960"/>
           </w:tcPr>
           <w:p>
             <w:r>
               <w:rPr>
-                <w:sz w:val="13"/>
+                <w:sz w:val="12"/>
+              </w:rPr>
+              <w:t>Regulation on limitation of pollution (Pollution Regulation)</w:t>
+            </w:r>
+          </w:p>
+        </w:tc>
+        <w:tc>
+          <w:tcPr>
+            <w:tcW w:type="dxa" w:w="960"/>
+          </w:tcPr>
+          <w:p>
+            <w:r>
+              <w:rPr>
+                <w:sz w:val="12"/>
               </w:rPr>
               <w:t>Regulation</w:t>
             </w:r>
@@ -1552,12 +1736,12 @@
         </w:tc>
         <w:tc>
           <w:tcPr>
-            <w:tcW w:type="dxa" w:w="1080"/>
+            <w:tcW w:type="dxa" w:w="960"/>
           </w:tcPr>
           <w:p>
             <w:r>
               <w:rPr>
-                <w:sz w:val="13"/>
+                <w:sz w:val="12"/>
               </w:rPr>
               <w:t>2004</w:t>
             </w:r>
@@ -1565,12 +1749,12 @@
         </w:tc>
         <w:tc>
           <w:tcPr>
-            <w:tcW w:type="dxa" w:w="1080"/>
+            <w:tcW w:type="dxa" w:w="960"/>
           </w:tcPr>
           <w:p>
             <w:r>
               <w:rPr>
-                <w:sz w:val="13"/>
+                <w:sz w:val="12"/>
               </w:rPr>
               <w:t>2026</w:t>
             </w:r>
@@ -1578,12 +1762,12 @@
         </w:tc>
         <w:tc>
           <w:tcPr>
-            <w:tcW w:type="dxa" w:w="1080"/>
+            <w:tcW w:type="dxa" w:w="960"/>
           </w:tcPr>
           <w:p>
             <w:r>
               <w:rPr>
-                <w:sz w:val="13"/>
+                <w:sz w:val="12"/>
               </w:rPr>
               <w:t>Principal pollution regulation; includes ship waste reception, artificial turf/microplastic controls, and discharge rules indirectly preventing plastic pollution to water.</w:t>
             </w:r>
@@ -1591,12 +1775,12 @@
         </w:tc>
         <w:tc>
           <w:tcPr>
-            <w:tcW w:type="dxa" w:w="1080"/>
+            <w:tcW w:type="dxa" w:w="960"/>
           </w:tcPr>
           <w:p>
             <w:r>
               <w:rPr>
-                <w:sz w:val="13"/>
+                <w:sz w:val="12"/>
               </w:rPr>
               <w:t>Industry; maritime; municipalities</w:t>
             </w:r>
@@ -1604,12 +1788,12 @@
         </w:tc>
         <w:tc>
           <w:tcPr>
-            <w:tcW w:type="dxa" w:w="1080"/>
+            <w:tcW w:type="dxa" w:w="960"/>
           </w:tcPr>
           <w:p>
             <w:r>
               <w:rPr>
-                <w:sz w:val="13"/>
+                <w:sz w:val="12"/>
               </w:rPr>
               <w:t>Litter/Pollution; End-of-life</w:t>
             </w:r>
@@ -1617,12 +1801,12 @@
         </w:tc>
         <w:tc>
           <w:tcPr>
-            <w:tcW w:type="dxa" w:w="1080"/>
+            <w:tcW w:type="dxa" w:w="960"/>
           </w:tcPr>
           <w:p>
             <w:r>
               <w:rPr>
-                <w:sz w:val="13"/>
+                <w:sz w:val="12"/>
               </w:rPr>
             </w:r>
             <w:hyperlink r:id="rId21">
@@ -1640,12 +1824,12 @@
       <w:tr>
         <w:tc>
           <w:tcPr>
-            <w:tcW w:type="dxa" w:w="1080"/>
+            <w:tcW w:type="dxa" w:w="960"/>
           </w:tcPr>
           <w:p>
             <w:r>
               <w:rPr>
-                <w:sz w:val="13"/>
+                <w:sz w:val="12"/>
               </w:rPr>
               <w:t>Forskrift om begrensning i bruk av helse- og miljøfarlige kjemikalier (Produktforskriften)</w:t>
             </w:r>
@@ -1653,12 +1837,25 @@
         </w:tc>
         <w:tc>
           <w:tcPr>
-            <w:tcW w:type="dxa" w:w="1080"/>
+            <w:tcW w:type="dxa" w:w="960"/>
           </w:tcPr>
           <w:p>
             <w:r>
               <w:rPr>
-                <w:sz w:val="13"/>
+                <w:sz w:val="12"/>
+              </w:rPr>
+              <w:t>Regulation on restriction of the use of hazardous chemicals and other products (Product Regulation)</w:t>
+            </w:r>
+          </w:p>
+        </w:tc>
+        <w:tc>
+          <w:tcPr>
+            <w:tcW w:type="dxa" w:w="960"/>
+          </w:tcPr>
+          <w:p>
+            <w:r>
+              <w:rPr>
+                <w:sz w:val="12"/>
               </w:rPr>
               <w:t>Regulation</w:t>
             </w:r>
@@ -1666,12 +1863,12 @@
         </w:tc>
         <w:tc>
           <w:tcPr>
-            <w:tcW w:type="dxa" w:w="1080"/>
+            <w:tcW w:type="dxa" w:w="960"/>
           </w:tcPr>
           <w:p>
             <w:r>
               <w:rPr>
-                <w:sz w:val="13"/>
+                <w:sz w:val="12"/>
               </w:rPr>
               <w:t>2004</w:t>
             </w:r>
@@ -1679,12 +1876,12 @@
         </w:tc>
         <w:tc>
           <w:tcPr>
-            <w:tcW w:type="dxa" w:w="1080"/>
+            <w:tcW w:type="dxa" w:w="960"/>
           </w:tcPr>
           <w:p>
             <w:r>
               <w:rPr>
-                <w:sz w:val="13"/>
+                <w:sz w:val="12"/>
               </w:rPr>
               <w:t>2026</w:t>
             </w:r>
@@ -1692,12 +1889,12 @@
         </w:tc>
         <w:tc>
           <w:tcPr>
-            <w:tcW w:type="dxa" w:w="1080"/>
+            <w:tcW w:type="dxa" w:w="960"/>
           </w:tcPr>
           <w:p>
             <w:r>
               <w:rPr>
-                <w:sz w:val="13"/>
+                <w:sz w:val="12"/>
               </w:rPr>
               <w:t>Umbrella product regulation implementing EU/EEA chemical and product rules; parent instrument for Chapter 2b plastic product measures and other substance restrictions relevant to plastics.</w:t>
             </w:r>
@@ -1705,12 +1902,12 @@
         </w:tc>
         <w:tc>
           <w:tcPr>
-            <w:tcW w:type="dxa" w:w="1080"/>
+            <w:tcW w:type="dxa" w:w="960"/>
           </w:tcPr>
           <w:p>
             <w:r>
               <w:rPr>
-                <w:sz w:val="13"/>
+                <w:sz w:val="12"/>
               </w:rPr>
               <w:t>Manufacturing; retail; chemicals</w:t>
             </w:r>
@@ -1718,12 +1915,12 @@
         </w:tc>
         <w:tc>
           <w:tcPr>
-            <w:tcW w:type="dxa" w:w="1080"/>
+            <w:tcW w:type="dxa" w:w="960"/>
           </w:tcPr>
           <w:p>
             <w:r>
               <w:rPr>
-                <w:sz w:val="13"/>
+                <w:sz w:val="12"/>
               </w:rPr>
               <w:t>Production; Use/Consumption</w:t>
             </w:r>
@@ -1731,12 +1928,12 @@
         </w:tc>
         <w:tc>
           <w:tcPr>
-            <w:tcW w:type="dxa" w:w="1080"/>
+            <w:tcW w:type="dxa" w:w="960"/>
           </w:tcPr>
           <w:p>
             <w:r>
               <w:rPr>
-                <w:sz w:val="13"/>
+                <w:sz w:val="12"/>
               </w:rPr>
             </w:r>
             <w:hyperlink r:id="rId22">
@@ -1754,12 +1951,12 @@
       <w:tr>
         <w:tc>
           <w:tcPr>
-            <w:tcW w:type="dxa" w:w="1080"/>
+            <w:tcW w:type="dxa" w:w="960"/>
           </w:tcPr>
           <w:p>
             <w:r>
               <w:rPr>
-                <w:sz w:val="13"/>
+                <w:sz w:val="12"/>
               </w:rPr>
               <w:t>Forskrift om gjenvinning og behandling av avfall (Avfallsforskriften)</w:t>
             </w:r>
@@ -1767,12 +1964,25 @@
         </w:tc>
         <w:tc>
           <w:tcPr>
-            <w:tcW w:type="dxa" w:w="1080"/>
+            <w:tcW w:type="dxa" w:w="960"/>
           </w:tcPr>
           <w:p>
             <w:r>
               <w:rPr>
-                <w:sz w:val="13"/>
+                <w:sz w:val="12"/>
+              </w:rPr>
+              <w:t>Regulation on recovery and treatment of waste (Waste Regulation)</w:t>
+            </w:r>
+          </w:p>
+        </w:tc>
+        <w:tc>
+          <w:tcPr>
+            <w:tcW w:type="dxa" w:w="960"/>
+          </w:tcPr>
+          <w:p>
+            <w:r>
+              <w:rPr>
+                <w:sz w:val="12"/>
               </w:rPr>
               <w:t>Regulation</w:t>
             </w:r>
@@ -1780,12 +1990,12 @@
         </w:tc>
         <w:tc>
           <w:tcPr>
-            <w:tcW w:type="dxa" w:w="1080"/>
+            <w:tcW w:type="dxa" w:w="960"/>
           </w:tcPr>
           <w:p>
             <w:r>
               <w:rPr>
-                <w:sz w:val="13"/>
+                <w:sz w:val="12"/>
               </w:rPr>
               <w:t>2004</w:t>
             </w:r>
@@ -1793,12 +2003,12 @@
         </w:tc>
         <w:tc>
           <w:tcPr>
-            <w:tcW w:type="dxa" w:w="1080"/>
+            <w:tcW w:type="dxa" w:w="960"/>
           </w:tcPr>
           <w:p>
             <w:r>
               <w:rPr>
-                <w:sz w:val="13"/>
+                <w:sz w:val="12"/>
               </w:rPr>
               <w:t>2025</w:t>
             </w:r>
@@ -1806,12 +2016,12 @@
         </w:tc>
         <w:tc>
           <w:tcPr>
-            <w:tcW w:type="dxa" w:w="1080"/>
+            <w:tcW w:type="dxa" w:w="960"/>
           </w:tcPr>
           <w:p>
             <w:r>
               <w:rPr>
-                <w:sz w:val="13"/>
+                <w:sz w:val="12"/>
               </w:rPr>
               <w:t>Central waste regulation implementing EU waste directives; establishes producer responsibility schemes, municipal duties, and treatment rules for many plastic-containing waste streams.</w:t>
             </w:r>
@@ -1819,12 +2029,12 @@
         </w:tc>
         <w:tc>
           <w:tcPr>
-            <w:tcW w:type="dxa" w:w="1080"/>
+            <w:tcW w:type="dxa" w:w="960"/>
           </w:tcPr>
           <w:p>
             <w:r>
               <w:rPr>
-                <w:sz w:val="13"/>
+                <w:sz w:val="12"/>
               </w:rPr>
               <w:t>Waste management; municipalities; all sectors</w:t>
             </w:r>
@@ -1832,12 +2042,12 @@
         </w:tc>
         <w:tc>
           <w:tcPr>
-            <w:tcW w:type="dxa" w:w="1080"/>
+            <w:tcW w:type="dxa" w:w="960"/>
           </w:tcPr>
           <w:p>
             <w:r>
               <w:rPr>
-                <w:sz w:val="13"/>
+                <w:sz w:val="12"/>
               </w:rPr>
               <w:t>End-of-life; Litter/Pollution</w:t>
             </w:r>
@@ -1845,12 +2055,12 @@
         </w:tc>
         <w:tc>
           <w:tcPr>
-            <w:tcW w:type="dxa" w:w="1080"/>
+            <w:tcW w:type="dxa" w:w="960"/>
           </w:tcPr>
           <w:p>
             <w:r>
               <w:rPr>
-                <w:sz w:val="13"/>
+                <w:sz w:val="12"/>
               </w:rPr>
             </w:r>
             <w:hyperlink r:id="rId23">
@@ -1868,12 +2078,12 @@
       <w:tr>
         <w:tc>
           <w:tcPr>
-            <w:tcW w:type="dxa" w:w="1080"/>
+            <w:tcW w:type="dxa" w:w="960"/>
           </w:tcPr>
           <w:p>
             <w:r>
               <w:rPr>
-                <w:sz w:val="13"/>
+                <w:sz w:val="12"/>
               </w:rPr>
               <w:t>Forurensningsforskriften – Kap. 20: Levering og mottak av avfall fra skip</w:t>
             </w:r>
@@ -1881,12 +2091,25 @@
         </w:tc>
         <w:tc>
           <w:tcPr>
-            <w:tcW w:type="dxa" w:w="1080"/>
+            <w:tcW w:type="dxa" w:w="960"/>
           </w:tcPr>
           <w:p>
             <w:r>
               <w:rPr>
-                <w:sz w:val="13"/>
+                <w:sz w:val="12"/>
+              </w:rPr>
+              <w:t>Pollution Regulation – Ch. 20: Delivery and reception of waste from ships</w:t>
+            </w:r>
+          </w:p>
+        </w:tc>
+        <w:tc>
+          <w:tcPr>
+            <w:tcW w:type="dxa" w:w="960"/>
+          </w:tcPr>
+          <w:p>
+            <w:r>
+              <w:rPr>
+                <w:sz w:val="12"/>
               </w:rPr>
               <w:t>Regulation</w:t>
             </w:r>
@@ -1894,12 +2117,12 @@
         </w:tc>
         <w:tc>
           <w:tcPr>
-            <w:tcW w:type="dxa" w:w="1080"/>
+            <w:tcW w:type="dxa" w:w="960"/>
           </w:tcPr>
           <w:p>
             <w:r>
               <w:rPr>
-                <w:sz w:val="13"/>
+                <w:sz w:val="12"/>
               </w:rPr>
               <w:t>2004</w:t>
             </w:r>
@@ -1907,12 +2130,12 @@
         </w:tc>
         <w:tc>
           <w:tcPr>
-            <w:tcW w:type="dxa" w:w="1080"/>
+            <w:tcW w:type="dxa" w:w="960"/>
           </w:tcPr>
           <w:p>
             <w:r>
               <w:rPr>
-                <w:sz w:val="13"/>
+                <w:sz w:val="12"/>
               </w:rPr>
               <w:t>2025</w:t>
             </w:r>
@@ -1920,12 +2143,12 @@
         </w:tc>
         <w:tc>
           <w:tcPr>
-            <w:tcW w:type="dxa" w:w="1080"/>
+            <w:tcW w:type="dxa" w:w="960"/>
           </w:tcPr>
           <w:p>
             <w:r>
               <w:rPr>
-                <w:sz w:val="13"/>
+                <w:sz w:val="12"/>
               </w:rPr>
               <w:t>Port waste reception facilities; mandatory delivery of ship waste including plastics (MARPOL Annex V); sorting and recycling obligations.</w:t>
             </w:r>
@@ -1933,12 +2156,12 @@
         </w:tc>
         <w:tc>
           <w:tcPr>
-            <w:tcW w:type="dxa" w:w="1080"/>
+            <w:tcW w:type="dxa" w:w="960"/>
           </w:tcPr>
           <w:p>
             <w:r>
               <w:rPr>
-                <w:sz w:val="13"/>
+                <w:sz w:val="12"/>
               </w:rPr>
               <w:t>Maritime; ports; fisheries</w:t>
             </w:r>
@@ -1946,12 +2169,12 @@
         </w:tc>
         <w:tc>
           <w:tcPr>
-            <w:tcW w:type="dxa" w:w="1080"/>
+            <w:tcW w:type="dxa" w:w="960"/>
           </w:tcPr>
           <w:p>
             <w:r>
               <w:rPr>
-                <w:sz w:val="13"/>
+                <w:sz w:val="12"/>
               </w:rPr>
               <w:t>End-of-life; Litter/Pollution</w:t>
             </w:r>
@@ -1959,12 +2182,12 @@
         </w:tc>
         <w:tc>
           <w:tcPr>
-            <w:tcW w:type="dxa" w:w="1080"/>
+            <w:tcW w:type="dxa" w:w="960"/>
           </w:tcPr>
           <w:p>
             <w:r>
               <w:rPr>
-                <w:sz w:val="13"/>
+                <w:sz w:val="12"/>
               </w:rPr>
             </w:r>
             <w:hyperlink r:id="rId24">
@@ -1982,12 +2205,12 @@
       <w:tr>
         <w:tc>
           <w:tcPr>
-            <w:tcW w:type="dxa" w:w="1080"/>
+            <w:tcW w:type="dxa" w:w="960"/>
           </w:tcPr>
           <w:p>
             <w:r>
               <w:rPr>
-                <w:sz w:val="13"/>
+                <w:sz w:val="12"/>
               </w:rPr>
               <w:t>Forskrift om registrering, vurdering, godkjenning og begrensning av kjemikalier (REACH-forskriften)</w:t>
             </w:r>
@@ -1995,12 +2218,25 @@
         </w:tc>
         <w:tc>
           <w:tcPr>
-            <w:tcW w:type="dxa" w:w="1080"/>
+            <w:tcW w:type="dxa" w:w="960"/>
           </w:tcPr>
           <w:p>
             <w:r>
               <w:rPr>
-                <w:sz w:val="13"/>
+                <w:sz w:val="12"/>
+              </w:rPr>
+              <w:t>Regulation on registration, evaluation, authorisation and restriction of chemicals (REACH Regulation)</w:t>
+            </w:r>
+          </w:p>
+        </w:tc>
+        <w:tc>
+          <w:tcPr>
+            <w:tcW w:type="dxa" w:w="960"/>
+          </w:tcPr>
+          <w:p>
+            <w:r>
+              <w:rPr>
+                <w:sz w:val="12"/>
               </w:rPr>
               <w:t>Regulation</w:t>
             </w:r>
@@ -2008,12 +2244,12 @@
         </w:tc>
         <w:tc>
           <w:tcPr>
-            <w:tcW w:type="dxa" w:w="1080"/>
+            <w:tcW w:type="dxa" w:w="960"/>
           </w:tcPr>
           <w:p>
             <w:r>
               <w:rPr>
-                <w:sz w:val="13"/>
+                <w:sz w:val="12"/>
               </w:rPr>
               <w:t>2008</w:t>
             </w:r>
@@ -2021,12 +2257,12 @@
         </w:tc>
         <w:tc>
           <w:tcPr>
-            <w:tcW w:type="dxa" w:w="1080"/>
+            <w:tcW w:type="dxa" w:w="960"/>
           </w:tcPr>
           <w:p>
             <w:r>
               <w:rPr>
-                <w:sz w:val="13"/>
+                <w:sz w:val="12"/>
               </w:rPr>
               <w:t>2026</w:t>
             </w:r>
@@ -2034,12 +2270,12 @@
         </w:tc>
         <w:tc>
           <w:tcPr>
-            <w:tcW w:type="dxa" w:w="1080"/>
+            <w:tcW w:type="dxa" w:w="960"/>
           </w:tcPr>
           <w:p>
             <w:r>
               <w:rPr>
-                <w:sz w:val="13"/>
+                <w:sz w:val="12"/>
               </w:rPr>
               <w:t>Norwegian REACH implementation; includes restriction on intentionally added microplastics (effective Norway 17 March 2025) with phased market bans.</w:t>
             </w:r>
@@ -2047,12 +2283,12 @@
         </w:tc>
         <w:tc>
           <w:tcPr>
-            <w:tcW w:type="dxa" w:w="1080"/>
+            <w:tcW w:type="dxa" w:w="960"/>
           </w:tcPr>
           <w:p>
             <w:r>
               <w:rPr>
-                <w:sz w:val="13"/>
+                <w:sz w:val="12"/>
               </w:rPr>
               <w:t>Cosmetics; detergents; chemicals; manufacturing</w:t>
             </w:r>
@@ -2060,12 +2296,12 @@
         </w:tc>
         <w:tc>
           <w:tcPr>
-            <w:tcW w:type="dxa" w:w="1080"/>
+            <w:tcW w:type="dxa" w:w="960"/>
           </w:tcPr>
           <w:p>
             <w:r>
               <w:rPr>
-                <w:sz w:val="13"/>
+                <w:sz w:val="12"/>
               </w:rPr>
               <w:t>Production; Use/Consumption; Litter/Pollution</w:t>
             </w:r>
@@ -2073,12 +2309,12 @@
         </w:tc>
         <w:tc>
           <w:tcPr>
-            <w:tcW w:type="dxa" w:w="1080"/>
+            <w:tcW w:type="dxa" w:w="960"/>
           </w:tcPr>
           <w:p>
             <w:r>
               <w:rPr>
-                <w:sz w:val="13"/>
+                <w:sz w:val="12"/>
               </w:rPr>
             </w:r>
             <w:hyperlink r:id="rId25">
@@ -2096,12 +2332,12 @@
       <w:tr>
         <w:tc>
           <w:tcPr>
-            <w:tcW w:type="dxa" w:w="1080"/>
+            <w:tcW w:type="dxa" w:w="960"/>
           </w:tcPr>
           <w:p>
             <w:r>
               <w:rPr>
-                <w:sz w:val="13"/>
+                <w:sz w:val="12"/>
               </w:rPr>
               <w:t>Forskrift om miljømessig sikkerhet for skip – § 11: MARPOL vedlegg V</w:t>
             </w:r>
@@ -2109,12 +2345,25 @@
         </w:tc>
         <w:tc>
           <w:tcPr>
-            <w:tcW w:type="dxa" w:w="1080"/>
+            <w:tcW w:type="dxa" w:w="960"/>
           </w:tcPr>
           <w:p>
             <w:r>
               <w:rPr>
-                <w:sz w:val="13"/>
+                <w:sz w:val="12"/>
+              </w:rPr>
+              <w:t>Regulation on environmental safety for ships – § 11: MARPOL Annex V (garbage)</w:t>
+            </w:r>
+          </w:p>
+        </w:tc>
+        <w:tc>
+          <w:tcPr>
+            <w:tcW w:type="dxa" w:w="960"/>
+          </w:tcPr>
+          <w:p>
+            <w:r>
+              <w:rPr>
+                <w:sz w:val="12"/>
               </w:rPr>
               <w:t>Regulation</w:t>
             </w:r>
@@ -2122,12 +2371,12 @@
         </w:tc>
         <w:tc>
           <w:tcPr>
-            <w:tcW w:type="dxa" w:w="1080"/>
+            <w:tcW w:type="dxa" w:w="960"/>
           </w:tcPr>
           <w:p>
             <w:r>
               <w:rPr>
-                <w:sz w:val="13"/>
+                <w:sz w:val="12"/>
               </w:rPr>
               <w:t>2012</w:t>
             </w:r>
@@ -2135,12 +2384,12 @@
         </w:tc>
         <w:tc>
           <w:tcPr>
-            <w:tcW w:type="dxa" w:w="1080"/>
+            <w:tcW w:type="dxa" w:w="960"/>
           </w:tcPr>
           <w:p>
             <w:r>
               <w:rPr>
-                <w:sz w:val="13"/>
+                <w:sz w:val="12"/>
               </w:rPr>
               <w:t>2025</w:t>
             </w:r>
@@ -2148,12 +2397,12 @@
         </w:tc>
         <w:tc>
           <w:tcPr>
-            <w:tcW w:type="dxa" w:w="1080"/>
+            <w:tcW w:type="dxa" w:w="960"/>
           </w:tcPr>
           <w:p>
             <w:r>
               <w:rPr>
-                <w:sz w:val="13"/>
+                <w:sz w:val="12"/>
               </w:rPr>
               <w:t>Incorporates MARPOL Annex V prohibiting discharge of garbage including plastics at sea; onboard storage and port delivery requirements.</w:t>
             </w:r>
@@ -2161,12 +2410,12 @@
         </w:tc>
         <w:tc>
           <w:tcPr>
-            <w:tcW w:type="dxa" w:w="1080"/>
+            <w:tcW w:type="dxa" w:w="960"/>
           </w:tcPr>
           <w:p>
             <w:r>
               <w:rPr>
-                <w:sz w:val="13"/>
+                <w:sz w:val="12"/>
               </w:rPr>
               <w:t>Maritime; offshore; fisheries</w:t>
             </w:r>
@@ -2174,12 +2423,12 @@
         </w:tc>
         <w:tc>
           <w:tcPr>
-            <w:tcW w:type="dxa" w:w="1080"/>
+            <w:tcW w:type="dxa" w:w="960"/>
           </w:tcPr>
           <w:p>
             <w:r>
               <w:rPr>
-                <w:sz w:val="13"/>
+                <w:sz w:val="12"/>
               </w:rPr>
               <w:t>Use/Consumption; Litter/Pollution</w:t>
             </w:r>
@@ -2187,12 +2436,12 @@
         </w:tc>
         <w:tc>
           <w:tcPr>
-            <w:tcW w:type="dxa" w:w="1080"/>
+            <w:tcW w:type="dxa" w:w="960"/>
           </w:tcPr>
           <w:p>
             <w:r>
               <w:rPr>
-                <w:sz w:val="13"/>
+                <w:sz w:val="12"/>
               </w:rPr>
             </w:r>
             <w:hyperlink r:id="rId26">
@@ -2210,12 +2459,12 @@
       <w:tr>
         <w:tc>
           <w:tcPr>
-            <w:tcW w:type="dxa" w:w="1080"/>
+            <w:tcW w:type="dxa" w:w="960"/>
           </w:tcPr>
           <w:p>
             <w:r>
               <w:rPr>
-                <w:sz w:val="13"/>
+                <w:sz w:val="12"/>
               </w:rPr>
               <w:t>Meld. St. 45 (2016–2017) – Kap. 7: Marin forsøpling og mikroplast</w:t>
             </w:r>
@@ -2223,12 +2472,25 @@
         </w:tc>
         <w:tc>
           <w:tcPr>
-            <w:tcW w:type="dxa" w:w="1080"/>
+            <w:tcW w:type="dxa" w:w="960"/>
           </w:tcPr>
           <w:p>
             <w:r>
               <w:rPr>
-                <w:sz w:val="13"/>
+                <w:sz w:val="12"/>
+              </w:rPr>
+              <w:t>White Paper to the Storting No. 45 (2016–2017) – Ch. 7: Marine litter and microplastics</w:t>
+            </w:r>
+          </w:p>
+        </w:tc>
+        <w:tc>
+          <w:tcPr>
+            <w:tcW w:type="dxa" w:w="960"/>
+          </w:tcPr>
+          <w:p>
+            <w:r>
+              <w:rPr>
+                <w:sz w:val="12"/>
               </w:rPr>
               <w:t>Government white paper / Strategy</w:t>
             </w:r>
@@ -2236,12 +2498,12 @@
         </w:tc>
         <w:tc>
           <w:tcPr>
-            <w:tcW w:type="dxa" w:w="1080"/>
+            <w:tcW w:type="dxa" w:w="960"/>
           </w:tcPr>
           <w:p>
             <w:r>
               <w:rPr>
-                <w:sz w:val="13"/>
+                <w:sz w:val="12"/>
               </w:rPr>
               <w:t>2017</w:t>
             </w:r>
@@ -2249,12 +2511,12 @@
         </w:tc>
         <w:tc>
           <w:tcPr>
-            <w:tcW w:type="dxa" w:w="1080"/>
+            <w:tcW w:type="dxa" w:w="960"/>
           </w:tcPr>
           <w:p>
             <w:r>
               <w:rPr>
-                <w:sz w:val="13"/>
+                <w:sz w:val="12"/>
               </w:rPr>
               <w:t>2017</w:t>
             </w:r>
@@ -2262,12 +2524,12 @@
         </w:tc>
         <w:tc>
           <w:tcPr>
-            <w:tcW w:type="dxa" w:w="1080"/>
+            <w:tcW w:type="dxa" w:w="960"/>
           </w:tcPr>
           <w:p>
             <w:r>
               <w:rPr>
-                <w:sz w:val="13"/>
+                <w:sz w:val="12"/>
               </w:rPr>
               <w:t>National strategy on marine litter and microplastics; Parliament-requested microplastics action plan framework.</w:t>
             </w:r>
@@ -2275,12 +2537,12 @@
         </w:tc>
         <w:tc>
           <w:tcPr>
-            <w:tcW w:type="dxa" w:w="1080"/>
+            <w:tcW w:type="dxa" w:w="960"/>
           </w:tcPr>
           <w:p>
             <w:r>
               <w:rPr>
-                <w:sz w:val="13"/>
+                <w:sz w:val="12"/>
               </w:rPr>
               <w:t>Marine; fisheries; municipalities</w:t>
             </w:r>
@@ -2288,12 +2550,12 @@
         </w:tc>
         <w:tc>
           <w:tcPr>
-            <w:tcW w:type="dxa" w:w="1080"/>
+            <w:tcW w:type="dxa" w:w="960"/>
           </w:tcPr>
           <w:p>
             <w:r>
               <w:rPr>
-                <w:sz w:val="13"/>
+                <w:sz w:val="12"/>
               </w:rPr>
               <w:t>Litter/Pollution; End-of-life</w:t>
             </w:r>
@@ -2301,12 +2563,12 @@
         </w:tc>
         <w:tc>
           <w:tcPr>
-            <w:tcW w:type="dxa" w:w="1080"/>
+            <w:tcW w:type="dxa" w:w="960"/>
           </w:tcPr>
           <w:p>
             <w:r>
               <w:rPr>
-                <w:sz w:val="13"/>
+                <w:sz w:val="12"/>
               </w:rPr>
             </w:r>
             <w:hyperlink r:id="rId27">
@@ -2324,12 +2586,12 @@
       <w:tr>
         <w:tc>
           <w:tcPr>
-            <w:tcW w:type="dxa" w:w="1080"/>
+            <w:tcW w:type="dxa" w:w="960"/>
           </w:tcPr>
           <w:p>
             <w:r>
               <w:rPr>
-                <w:sz w:val="13"/>
+                <w:sz w:val="12"/>
               </w:rPr>
               <w:t>Forskrift om endring i produktforskriften (forbud mot enkelte plastprodukter) – 18.12.2020 nr. 3200</w:t>
             </w:r>
@@ -2337,12 +2599,25 @@
         </w:tc>
         <w:tc>
           <w:tcPr>
-            <w:tcW w:type="dxa" w:w="1080"/>
+            <w:tcW w:type="dxa" w:w="960"/>
           </w:tcPr>
           <w:p>
             <w:r>
               <w:rPr>
-                <w:sz w:val="13"/>
+                <w:sz w:val="12"/>
+              </w:rPr>
+              <w:t>Amendment to the Product Regulation (ban on certain plastic products) – 18 Dec 2020 No. 3200</w:t>
+            </w:r>
+          </w:p>
+        </w:tc>
+        <w:tc>
+          <w:tcPr>
+            <w:tcW w:type="dxa" w:w="960"/>
+          </w:tcPr>
+          <w:p>
+            <w:r>
+              <w:rPr>
+                <w:sz w:val="12"/>
               </w:rPr>
               <w:t>Regulation (amending)</w:t>
             </w:r>
@@ -2350,12 +2625,12 @@
         </w:tc>
         <w:tc>
           <w:tcPr>
-            <w:tcW w:type="dxa" w:w="1080"/>
+            <w:tcW w:type="dxa" w:w="960"/>
           </w:tcPr>
           <w:p>
             <w:r>
               <w:rPr>
-                <w:sz w:val="13"/>
+                <w:sz w:val="12"/>
               </w:rPr>
               <w:t>2021</w:t>
             </w:r>
@@ -2363,12 +2638,12 @@
         </w:tc>
         <w:tc>
           <w:tcPr>
-            <w:tcW w:type="dxa" w:w="1080"/>
+            <w:tcW w:type="dxa" w:w="960"/>
           </w:tcPr>
           <w:p>
             <w:r>
               <w:rPr>
-                <w:sz w:val="13"/>
+                <w:sz w:val="12"/>
               </w:rPr>
               <w:t>2021</w:t>
             </w:r>
@@ -2376,12 +2651,12 @@
         </w:tc>
         <w:tc>
           <w:tcPr>
-            <w:tcW w:type="dxa" w:w="1080"/>
+            <w:tcW w:type="dxa" w:w="960"/>
           </w:tcPr>
           <w:p>
             <w:r>
               <w:rPr>
-                <w:sz w:val="13"/>
+                <w:sz w:val="12"/>
               </w:rPr>
               <w:t>Adopted Chapter 2b and SUP bans (cutlery, straws, EPS food containers, oxo-degradable plastic, etc.); entered into force 3 July 2021. Parent chapter now in Produktforskriften kap. 2b.</w:t>
             </w:r>
@@ -2389,12 +2664,12 @@
         </w:tc>
         <w:tc>
           <w:tcPr>
-            <w:tcW w:type="dxa" w:w="1080"/>
+            <w:tcW w:type="dxa" w:w="960"/>
           </w:tcPr>
           <w:p>
             <w:r>
               <w:rPr>
-                <w:sz w:val="13"/>
+                <w:sz w:val="12"/>
               </w:rPr>
               <w:t>Retail; food service; manufacturing</w:t>
             </w:r>
@@ -2402,12 +2677,12 @@
         </w:tc>
         <w:tc>
           <w:tcPr>
-            <w:tcW w:type="dxa" w:w="1080"/>
+            <w:tcW w:type="dxa" w:w="960"/>
           </w:tcPr>
           <w:p>
             <w:r>
               <w:rPr>
-                <w:sz w:val="13"/>
+                <w:sz w:val="12"/>
               </w:rPr>
               <w:t>Production; Use/Consumption; Litter/Pollution</w:t>
             </w:r>
@@ -2415,12 +2690,12 @@
         </w:tc>
         <w:tc>
           <w:tcPr>
-            <w:tcW w:type="dxa" w:w="1080"/>
+            <w:tcW w:type="dxa" w:w="960"/>
           </w:tcPr>
           <w:p>
             <w:r>
               <w:rPr>
-                <w:sz w:val="13"/>
+                <w:sz w:val="12"/>
               </w:rPr>
             </w:r>
             <w:hyperlink r:id="rId28">
@@ -2438,12 +2713,12 @@
       <w:tr>
         <w:tc>
           <w:tcPr>
-            <w:tcW w:type="dxa" w:w="1080"/>
+            <w:tcW w:type="dxa" w:w="960"/>
           </w:tcPr>
           <w:p>
             <w:r>
               <w:rPr>
-                <w:sz w:val="13"/>
+                <w:sz w:val="12"/>
               </w:rPr>
               <w:t>Forurensningsforskriften – Kap. 23A: Idrettsbaner med plastholdig fyllmateriale</w:t>
             </w:r>
@@ -2451,12 +2726,25 @@
         </w:tc>
         <w:tc>
           <w:tcPr>
-            <w:tcW w:type="dxa" w:w="1080"/>
+            <w:tcW w:type="dxa" w:w="960"/>
           </w:tcPr>
           <w:p>
             <w:r>
               <w:rPr>
-                <w:sz w:val="13"/>
+                <w:sz w:val="12"/>
+              </w:rPr>
+              <w:t>Pollution Regulation – Ch. 23A: Sports surfaces using plastic-containing loose infill material</w:t>
+            </w:r>
+          </w:p>
+        </w:tc>
+        <w:tc>
+          <w:tcPr>
+            <w:tcW w:type="dxa" w:w="960"/>
+          </w:tcPr>
+          <w:p>
+            <w:r>
+              <w:rPr>
+                <w:sz w:val="12"/>
               </w:rPr>
               <w:t>Regulation</w:t>
             </w:r>
@@ -2464,12 +2752,12 @@
         </w:tc>
         <w:tc>
           <w:tcPr>
-            <w:tcW w:type="dxa" w:w="1080"/>
+            <w:tcW w:type="dxa" w:w="960"/>
           </w:tcPr>
           <w:p>
             <w:r>
               <w:rPr>
-                <w:sz w:val="13"/>
+                <w:sz w:val="12"/>
               </w:rPr>
               <w:t>2021</w:t>
             </w:r>
@@ -2477,12 +2765,12 @@
         </w:tc>
         <w:tc>
           <w:tcPr>
-            <w:tcW w:type="dxa" w:w="1080"/>
+            <w:tcW w:type="dxa" w:w="960"/>
           </w:tcPr>
           <w:p>
             <w:r>
               <w:rPr>
-                <w:sz w:val="13"/>
+                <w:sz w:val="12"/>
               </w:rPr>
               <w:t>2021</w:t>
             </w:r>
@@ -2490,12 +2778,12 @@
         </w:tc>
         <w:tc>
           <w:tcPr>
-            <w:tcW w:type="dxa" w:w="1080"/>
+            <w:tcW w:type="dxa" w:w="960"/>
           </w:tcPr>
           <w:p>
             <w:r>
               <w:rPr>
-                <w:sz w:val="13"/>
+                <w:sz w:val="12"/>
               </w:rPr>
               <w:t>Design and operation rules for artificial turf and sports surfaces using plastic infill; barriers and granulate management to prevent microplastic spread. In force 1 July 2021.</w:t>
             </w:r>
@@ -2503,12 +2791,12 @@
         </w:tc>
         <w:tc>
           <w:tcPr>
-            <w:tcW w:type="dxa" w:w="1080"/>
+            <w:tcW w:type="dxa" w:w="960"/>
           </w:tcPr>
           <w:p>
             <w:r>
               <w:rPr>
-                <w:sz w:val="13"/>
+                <w:sz w:val="12"/>
               </w:rPr>
               <w:t>Sports; municipalities; construction</w:t>
             </w:r>
@@ -2516,12 +2804,12 @@
         </w:tc>
         <w:tc>
           <w:tcPr>
-            <w:tcW w:type="dxa" w:w="1080"/>
+            <w:tcW w:type="dxa" w:w="960"/>
           </w:tcPr>
           <w:p>
             <w:r>
               <w:rPr>
-                <w:sz w:val="13"/>
+                <w:sz w:val="12"/>
               </w:rPr>
               <w:t>Use/Consumption; Litter/Pollution</w:t>
             </w:r>
@@ -2529,12 +2817,12 @@
         </w:tc>
         <w:tc>
           <w:tcPr>
-            <w:tcW w:type="dxa" w:w="1080"/>
+            <w:tcW w:type="dxa" w:w="960"/>
           </w:tcPr>
           <w:p>
             <w:r>
               <w:rPr>
-                <w:sz w:val="13"/>
+                <w:sz w:val="12"/>
               </w:rPr>
             </w:r>
             <w:hyperlink r:id="rId29">
@@ -2552,12 +2840,12 @@
       <w:tr>
         <w:tc>
           <w:tcPr>
-            <w:tcW w:type="dxa" w:w="1080"/>
+            <w:tcW w:type="dxa" w:w="960"/>
           </w:tcPr>
           <w:p>
             <w:r>
               <w:rPr>
-                <w:sz w:val="13"/>
+                <w:sz w:val="12"/>
               </w:rPr>
               <w:t>Høstingsforskriften – Kap. XV–XVI: Merking og tap av fiskeredskap</w:t>
             </w:r>
@@ -2565,12 +2853,25 @@
         </w:tc>
         <w:tc>
           <w:tcPr>
-            <w:tcW w:type="dxa" w:w="1080"/>
+            <w:tcW w:type="dxa" w:w="960"/>
           </w:tcPr>
           <w:p>
             <w:r>
               <w:rPr>
-                <w:sz w:val="13"/>
+                <w:sz w:val="12"/>
+              </w:rPr>
+              <w:t>Harvesting Regulation – Ch. XV–XVI: Marking and loss of fishing gear</w:t>
+            </w:r>
+          </w:p>
+        </w:tc>
+        <w:tc>
+          <w:tcPr>
+            <w:tcW w:type="dxa" w:w="960"/>
+          </w:tcPr>
+          <w:p>
+            <w:r>
+              <w:rPr>
+                <w:sz w:val="12"/>
               </w:rPr>
               <w:t>Regulation</w:t>
             </w:r>
@@ -2578,12 +2879,12 @@
         </w:tc>
         <w:tc>
           <w:tcPr>
-            <w:tcW w:type="dxa" w:w="1080"/>
+            <w:tcW w:type="dxa" w:w="960"/>
           </w:tcPr>
           <w:p>
             <w:r>
               <w:rPr>
-                <w:sz w:val="13"/>
+                <w:sz w:val="12"/>
               </w:rPr>
               <w:t>2021</w:t>
             </w:r>
@@ -2591,12 +2892,12 @@
         </w:tc>
         <w:tc>
           <w:tcPr>
-            <w:tcW w:type="dxa" w:w="1080"/>
+            <w:tcW w:type="dxa" w:w="960"/>
           </w:tcPr>
           <w:p>
             <w:r>
               <w:rPr>
-                <w:sz w:val="13"/>
+                <w:sz w:val="12"/>
               </w:rPr>
               <w:t>2025</w:t>
             </w:r>
@@ -2604,12 +2905,12 @@
         </w:tc>
         <w:tc>
           <w:tcPr>
-            <w:tcW w:type="dxa" w:w="1080"/>
+            <w:tcW w:type="dxa" w:w="960"/>
           </w:tcPr>
           <w:p>
             <w:r>
               <w:rPr>
-                <w:sz w:val="13"/>
+                <w:sz w:val="12"/>
               </w:rPr>
               <w:t>Modern fisheries regulation on gear marking and lost-gear prevention for plastic-containing fishing equipment.</w:t>
             </w:r>
@@ -2617,12 +2918,12 @@
         </w:tc>
         <w:tc>
           <w:tcPr>
-            <w:tcW w:type="dxa" w:w="1080"/>
+            <w:tcW w:type="dxa" w:w="960"/>
           </w:tcPr>
           <w:p>
             <w:r>
               <w:rPr>
-                <w:sz w:val="13"/>
+                <w:sz w:val="12"/>
               </w:rPr>
               <w:t>Fisheries; aquaculture; recreational fishing</w:t>
             </w:r>
@@ -2630,12 +2931,12 @@
         </w:tc>
         <w:tc>
           <w:tcPr>
-            <w:tcW w:type="dxa" w:w="1080"/>
+            <w:tcW w:type="dxa" w:w="960"/>
           </w:tcPr>
           <w:p>
             <w:r>
               <w:rPr>
-                <w:sz w:val="13"/>
+                <w:sz w:val="12"/>
               </w:rPr>
               <w:t>Use/Consumption; Litter/Pollution</w:t>
             </w:r>
@@ -2643,12 +2944,12 @@
         </w:tc>
         <w:tc>
           <w:tcPr>
-            <w:tcW w:type="dxa" w:w="1080"/>
+            <w:tcW w:type="dxa" w:w="960"/>
           </w:tcPr>
           <w:p>
             <w:r>
               <w:rPr>
-                <w:sz w:val="13"/>
+                <w:sz w:val="12"/>
               </w:rPr>
             </w:r>
             <w:hyperlink r:id="rId30">
@@ -2666,12 +2967,12 @@
       <w:tr>
         <w:tc>
           <w:tcPr>
-            <w:tcW w:type="dxa" w:w="1080"/>
+            <w:tcW w:type="dxa" w:w="960"/>
           </w:tcPr>
           <w:p>
             <w:r>
               <w:rPr>
-                <w:sz w:val="13"/>
+                <w:sz w:val="12"/>
               </w:rPr>
               <w:t>Nasjonal strategi for ein grøn, sirkulær økonomi</w:t>
             </w:r>
@@ -2679,12 +2980,25 @@
         </w:tc>
         <w:tc>
           <w:tcPr>
-            <w:tcW w:type="dxa" w:w="1080"/>
+            <w:tcW w:type="dxa" w:w="960"/>
           </w:tcPr>
           <w:p>
             <w:r>
               <w:rPr>
-                <w:sz w:val="13"/>
+                <w:sz w:val="12"/>
+              </w:rPr>
+              <w:t>National Strategy for a Green, Circular Economy</w:t>
+            </w:r>
+          </w:p>
+        </w:tc>
+        <w:tc>
+          <w:tcPr>
+            <w:tcW w:type="dxa" w:w="960"/>
+          </w:tcPr>
+          <w:p>
+            <w:r>
+              <w:rPr>
+                <w:sz w:val="12"/>
               </w:rPr>
               <w:t>National strategy</w:t>
             </w:r>
@@ -2692,12 +3006,12 @@
         </w:tc>
         <w:tc>
           <w:tcPr>
-            <w:tcW w:type="dxa" w:w="1080"/>
+            <w:tcW w:type="dxa" w:w="960"/>
           </w:tcPr>
           <w:p>
             <w:r>
               <w:rPr>
-                <w:sz w:val="13"/>
+                <w:sz w:val="12"/>
               </w:rPr>
               <w:t>2021</w:t>
             </w:r>
@@ -2705,12 +3019,12 @@
         </w:tc>
         <w:tc>
           <w:tcPr>
-            <w:tcW w:type="dxa" w:w="1080"/>
+            <w:tcW w:type="dxa" w:w="960"/>
           </w:tcPr>
           <w:p>
             <w:r>
               <w:rPr>
-                <w:sz w:val="13"/>
+                <w:sz w:val="12"/>
               </w:rPr>
               <w:t>2021</w:t>
             </w:r>
@@ -2718,12 +3032,12 @@
         </w:tc>
         <w:tc>
           <w:tcPr>
-            <w:tcW w:type="dxa" w:w="1080"/>
+            <w:tcW w:type="dxa" w:w="960"/>
           </w:tcPr>
           <w:p>
             <w:r>
               <w:rPr>
-                <w:sz w:val="13"/>
+                <w:sz w:val="12"/>
               </w:rPr>
               <w:t>Circular economy strategy including plastics measures to reduce marine litter and strengthen recycling.</w:t>
             </w:r>
@@ -2731,12 +3045,12 @@
         </w:tc>
         <w:tc>
           <w:tcPr>
-            <w:tcW w:type="dxa" w:w="1080"/>
+            <w:tcW w:type="dxa" w:w="960"/>
           </w:tcPr>
           <w:p>
             <w:r>
               <w:rPr>
-                <w:sz w:val="13"/>
+                <w:sz w:val="12"/>
               </w:rPr>
               <w:t>All sectors</w:t>
             </w:r>
@@ -2744,12 +3058,12 @@
         </w:tc>
         <w:tc>
           <w:tcPr>
-            <w:tcW w:type="dxa" w:w="1080"/>
+            <w:tcW w:type="dxa" w:w="960"/>
           </w:tcPr>
           <w:p>
             <w:r>
               <w:rPr>
-                <w:sz w:val="13"/>
+                <w:sz w:val="12"/>
               </w:rPr>
               <w:t>Production; End-of-life; Use/Consumption</w:t>
             </w:r>
@@ -2757,12 +3071,12 @@
         </w:tc>
         <w:tc>
           <w:tcPr>
-            <w:tcW w:type="dxa" w:w="1080"/>
+            <w:tcW w:type="dxa" w:w="960"/>
           </w:tcPr>
           <w:p>
             <w:r>
               <w:rPr>
-                <w:sz w:val="13"/>
+                <w:sz w:val="12"/>
               </w:rPr>
             </w:r>
             <w:hyperlink r:id="rId31">
@@ -2780,12 +3094,12 @@
       <w:tr>
         <w:tc>
           <w:tcPr>
-            <w:tcW w:type="dxa" w:w="1080"/>
+            <w:tcW w:type="dxa" w:w="960"/>
           </w:tcPr>
           <w:p>
             <w:r>
               <w:rPr>
-                <w:sz w:val="13"/>
+                <w:sz w:val="12"/>
               </w:rPr>
               <w:t>Noregs plaststrategi</w:t>
             </w:r>
@@ -2793,12 +3107,25 @@
         </w:tc>
         <w:tc>
           <w:tcPr>
-            <w:tcW w:type="dxa" w:w="1080"/>
+            <w:tcW w:type="dxa" w:w="960"/>
           </w:tcPr>
           <w:p>
             <w:r>
               <w:rPr>
-                <w:sz w:val="13"/>
+                <w:sz w:val="12"/>
+              </w:rPr>
+              <w:t>Norway's Plastics Strategy</w:t>
+            </w:r>
+          </w:p>
+        </w:tc>
+        <w:tc>
+          <w:tcPr>
+            <w:tcW w:type="dxa" w:w="960"/>
+          </w:tcPr>
+          <w:p>
+            <w:r>
+              <w:rPr>
+                <w:sz w:val="12"/>
               </w:rPr>
               <w:t>National strategy / Action plan</w:t>
             </w:r>
@@ -2806,12 +3133,12 @@
         </w:tc>
         <w:tc>
           <w:tcPr>
-            <w:tcW w:type="dxa" w:w="1080"/>
+            <w:tcW w:type="dxa" w:w="960"/>
           </w:tcPr>
           <w:p>
             <w:r>
               <w:rPr>
-                <w:sz w:val="13"/>
+                <w:sz w:val="12"/>
               </w:rPr>
               <w:t>2021</w:t>
             </w:r>
@@ -2819,12 +3146,12 @@
         </w:tc>
         <w:tc>
           <w:tcPr>
-            <w:tcW w:type="dxa" w:w="1080"/>
+            <w:tcW w:type="dxa" w:w="960"/>
           </w:tcPr>
           <w:p>
             <w:r>
               <w:rPr>
-                <w:sz w:val="13"/>
+                <w:sz w:val="12"/>
               </w:rPr>
               <w:t>2021</w:t>
             </w:r>
@@ -2832,12 +3159,12 @@
         </w:tc>
         <w:tc>
           <w:tcPr>
-            <w:tcW w:type="dxa" w:w="1080"/>
+            <w:tcW w:type="dxa" w:w="960"/>
           </w:tcPr>
           <w:p>
             <w:r>
               <w:rPr>
-                <w:sz w:val="13"/>
+                <w:sz w:val="12"/>
               </w:rPr>
               <w:t>Comprehensive national plastics management plan across the full lifecycle; Norway's national example of a plastics management plan.</w:t>
             </w:r>
@@ -2845,12 +3172,12 @@
         </w:tc>
         <w:tc>
           <w:tcPr>
-            <w:tcW w:type="dxa" w:w="1080"/>
+            <w:tcW w:type="dxa" w:w="960"/>
           </w:tcPr>
           <w:p>
             <w:r>
               <w:rPr>
-                <w:sz w:val="13"/>
+                <w:sz w:val="12"/>
               </w:rPr>
               <w:t>All sectors; fisheries; municipalities</w:t>
             </w:r>
@@ -2858,12 +3185,12 @@
         </w:tc>
         <w:tc>
           <w:tcPr>
-            <w:tcW w:type="dxa" w:w="1080"/>
+            <w:tcW w:type="dxa" w:w="960"/>
           </w:tcPr>
           <w:p>
             <w:r>
               <w:rPr>
-                <w:sz w:val="13"/>
+                <w:sz w:val="12"/>
               </w:rPr>
               <w:t>Production; Use/Consumption; End-of-life; Litter/Pollution</w:t>
             </w:r>
@@ -2871,12 +3198,12 @@
         </w:tc>
         <w:tc>
           <w:tcPr>
-            <w:tcW w:type="dxa" w:w="1080"/>
+            <w:tcW w:type="dxa" w:w="960"/>
           </w:tcPr>
           <w:p>
             <w:r>
               <w:rPr>
-                <w:sz w:val="13"/>
+                <w:sz w:val="12"/>
               </w:rPr>
             </w:r>
             <w:hyperlink r:id="rId32">
@@ -2894,12 +3221,12 @@
       <w:tr>
         <w:tc>
           <w:tcPr>
-            <w:tcW w:type="dxa" w:w="1080"/>
+            <w:tcW w:type="dxa" w:w="960"/>
           </w:tcPr>
           <w:p>
             <w:r>
               <w:rPr>
-                <w:sz w:val="13"/>
+                <w:sz w:val="12"/>
               </w:rPr>
               <w:t>Produktforskriften – Kap. 2b: Regulering av enkelte produkter av plast</w:t>
             </w:r>
@@ -2907,12 +3234,25 @@
         </w:tc>
         <w:tc>
           <w:tcPr>
-            <w:tcW w:type="dxa" w:w="1080"/>
+            <w:tcW w:type="dxa" w:w="960"/>
           </w:tcPr>
           <w:p>
             <w:r>
               <w:rPr>
-                <w:sz w:val="13"/>
+                <w:sz w:val="12"/>
+              </w:rPr>
+              <w:t>Product Regulation – Ch. 2b: Regulation of certain plastic products</w:t>
+            </w:r>
+          </w:p>
+        </w:tc>
+        <w:tc>
+          <w:tcPr>
+            <w:tcW w:type="dxa" w:w="960"/>
+          </w:tcPr>
+          <w:p>
+            <w:r>
+              <w:rPr>
+                <w:sz w:val="12"/>
               </w:rPr>
               <w:t>Regulation</w:t>
             </w:r>
@@ -2920,12 +3260,12 @@
         </w:tc>
         <w:tc>
           <w:tcPr>
-            <w:tcW w:type="dxa" w:w="1080"/>
+            <w:tcW w:type="dxa" w:w="960"/>
           </w:tcPr>
           <w:p>
             <w:r>
               <w:rPr>
-                <w:sz w:val="13"/>
+                <w:sz w:val="12"/>
               </w:rPr>
               <w:t>2021</w:t>
             </w:r>
@@ -2933,12 +3273,12 @@
         </w:tc>
         <w:tc>
           <w:tcPr>
-            <w:tcW w:type="dxa" w:w="1080"/>
+            <w:tcW w:type="dxa" w:w="960"/>
           </w:tcPr>
           <w:p>
             <w:r>
               <w:rPr>
-                <w:sz w:val="13"/>
+                <w:sz w:val="12"/>
               </w:rPr>
               <w:t>2026</w:t>
             </w:r>
@@ -2946,12 +3286,12 @@
         </w:tc>
         <w:tc>
           <w:tcPr>
-            <w:tcW w:type="dxa" w:w="1080"/>
+            <w:tcW w:type="dxa" w:w="960"/>
           </w:tcPr>
           <w:p>
             <w:r>
               <w:rPr>
-                <w:sz w:val="13"/>
+                <w:sz w:val="12"/>
               </w:rPr>
               <w:t>Ongoing SUP rules: product bans, marking, tethered caps, 25% recycled PET in bottles from 2025. Chapter added 2021; subsequently amended.</w:t>
             </w:r>
@@ -2959,12 +3299,12 @@
         </w:tc>
         <w:tc>
           <w:tcPr>
-            <w:tcW w:type="dxa" w:w="1080"/>
+            <w:tcW w:type="dxa" w:w="960"/>
           </w:tcPr>
           <w:p>
             <w:r>
               <w:rPr>
-                <w:sz w:val="13"/>
+                <w:sz w:val="12"/>
               </w:rPr>
               <w:t>Retail; food service; cosmetics; manufacturing</w:t>
             </w:r>
@@ -2972,12 +3312,12 @@
         </w:tc>
         <w:tc>
           <w:tcPr>
-            <w:tcW w:type="dxa" w:w="1080"/>
+            <w:tcW w:type="dxa" w:w="960"/>
           </w:tcPr>
           <w:p>
             <w:r>
               <w:rPr>
-                <w:sz w:val="13"/>
+                <w:sz w:val="12"/>
               </w:rPr>
               <w:t>Production; Design; Use/Consumption; Litter/Pollution</w:t>
             </w:r>
@@ -2985,12 +3325,12 @@
         </w:tc>
         <w:tc>
           <w:tcPr>
-            <w:tcW w:type="dxa" w:w="1080"/>
+            <w:tcW w:type="dxa" w:w="960"/>
           </w:tcPr>
           <w:p>
             <w:r>
               <w:rPr>
-                <w:sz w:val="13"/>
+                <w:sz w:val="12"/>
               </w:rPr>
             </w:r>
             <w:hyperlink r:id="rId33">
@@ -3008,12 +3348,12 @@
       <w:tr>
         <w:tc>
           <w:tcPr>
-            <w:tcW w:type="dxa" w:w="1080"/>
+            <w:tcW w:type="dxa" w:w="960"/>
           </w:tcPr>
           <w:p>
             <w:r>
               <w:rPr>
-                <w:sz w:val="13"/>
+                <w:sz w:val="12"/>
               </w:rPr>
               <w:t>Avfallsforskriften – Kap. 10a: Utsortering og innsamling av plastavfall</w:t>
             </w:r>
@@ -3021,12 +3361,25 @@
         </w:tc>
         <w:tc>
           <w:tcPr>
-            <w:tcW w:type="dxa" w:w="1080"/>
+            <w:tcW w:type="dxa" w:w="960"/>
           </w:tcPr>
           <w:p>
             <w:r>
               <w:rPr>
-                <w:sz w:val="13"/>
+                <w:sz w:val="12"/>
+              </w:rPr>
+              <w:t>Waste Regulation – Ch. 10a: Sorting and collection of plastic waste</w:t>
+            </w:r>
+          </w:p>
+        </w:tc>
+        <w:tc>
+          <w:tcPr>
+            <w:tcW w:type="dxa" w:w="960"/>
+          </w:tcPr>
+          <w:p>
+            <w:r>
+              <w:rPr>
+                <w:sz w:val="12"/>
               </w:rPr>
               <w:t>Regulation</w:t>
             </w:r>
@@ -3034,12 +3387,12 @@
         </w:tc>
         <w:tc>
           <w:tcPr>
-            <w:tcW w:type="dxa" w:w="1080"/>
+            <w:tcW w:type="dxa" w:w="960"/>
           </w:tcPr>
           <w:p>
             <w:r>
               <w:rPr>
-                <w:sz w:val="13"/>
+                <w:sz w:val="12"/>
               </w:rPr>
               <w:t>2023</w:t>
             </w:r>
@@ -3047,12 +3400,12 @@
         </w:tc>
         <w:tc>
           <w:tcPr>
-            <w:tcW w:type="dxa" w:w="1080"/>
+            <w:tcW w:type="dxa" w:w="960"/>
           </w:tcPr>
           <w:p>
             <w:r>
               <w:rPr>
-                <w:sz w:val="13"/>
+                <w:sz w:val="12"/>
               </w:rPr>
               <w:t>2025</w:t>
             </w:r>
@@ -3060,12 +3413,12 @@
         </w:tc>
         <w:tc>
           <w:tcPr>
-            <w:tcW w:type="dxa" w:w="1080"/>
+            <w:tcW w:type="dxa" w:w="960"/>
           </w:tcPr>
           <w:p>
             <w:r>
               <w:rPr>
-                <w:sz w:val="13"/>
+                <w:sz w:val="12"/>
               </w:rPr>
               <w:t>Municipal duties for household plastic waste source-sorting (50% by 2028, 70% by 2035) and agricultural plastic waste collection.</w:t>
             </w:r>
@@ -3073,12 +3426,12 @@
         </w:tc>
         <w:tc>
           <w:tcPr>
-            <w:tcW w:type="dxa" w:w="1080"/>
+            <w:tcW w:type="dxa" w:w="960"/>
           </w:tcPr>
           <w:p>
             <w:r>
               <w:rPr>
-                <w:sz w:val="13"/>
+                <w:sz w:val="12"/>
               </w:rPr>
               <w:t>Municipalities; agriculture; waste management</w:t>
             </w:r>
@@ -3086,12 +3439,12 @@
         </w:tc>
         <w:tc>
           <w:tcPr>
-            <w:tcW w:type="dxa" w:w="1080"/>
+            <w:tcW w:type="dxa" w:w="960"/>
           </w:tcPr>
           <w:p>
             <w:r>
               <w:rPr>
-                <w:sz w:val="13"/>
+                <w:sz w:val="12"/>
               </w:rPr>
               <w:t>End-of-life</w:t>
             </w:r>
@@ -3099,12 +3452,12 @@
         </w:tc>
         <w:tc>
           <w:tcPr>
-            <w:tcW w:type="dxa" w:w="1080"/>
+            <w:tcW w:type="dxa" w:w="960"/>
           </w:tcPr>
           <w:p>
             <w:r>
               <w:rPr>
-                <w:sz w:val="13"/>
+                <w:sz w:val="12"/>
               </w:rPr>
             </w:r>
             <w:hyperlink r:id="rId34">
@@ -3122,12 +3475,12 @@
       <w:tr>
         <w:tc>
           <w:tcPr>
-            <w:tcW w:type="dxa" w:w="1080"/>
+            <w:tcW w:type="dxa" w:w="960"/>
           </w:tcPr>
           <w:p>
             <w:r>
               <w:rPr>
-                <w:sz w:val="13"/>
+                <w:sz w:val="12"/>
               </w:rPr>
               <w:t>Handlingsplan for en sirkulær økonomi 2024–2025</w:t>
             </w:r>
@@ -3135,12 +3488,25 @@
         </w:tc>
         <w:tc>
           <w:tcPr>
-            <w:tcW w:type="dxa" w:w="1080"/>
+            <w:tcW w:type="dxa" w:w="960"/>
           </w:tcPr>
           <w:p>
             <w:r>
               <w:rPr>
-                <w:sz w:val="13"/>
+                <w:sz w:val="12"/>
+              </w:rPr>
+              <w:t>Action Plan for a Circular Economy 2024–2025</w:t>
+            </w:r>
+          </w:p>
+        </w:tc>
+        <w:tc>
+          <w:tcPr>
+            <w:tcW w:type="dxa" w:w="960"/>
+          </w:tcPr>
+          <w:p>
+            <w:r>
+              <w:rPr>
+                <w:sz w:val="12"/>
               </w:rPr>
               <w:t>Government action plan</w:t>
             </w:r>
@@ -3148,12 +3514,12 @@
         </w:tc>
         <w:tc>
           <w:tcPr>
-            <w:tcW w:type="dxa" w:w="1080"/>
+            <w:tcW w:type="dxa" w:w="960"/>
           </w:tcPr>
           <w:p>
             <w:r>
               <w:rPr>
-                <w:sz w:val="13"/>
+                <w:sz w:val="12"/>
               </w:rPr>
               <w:t>2024</w:t>
             </w:r>
@@ -3161,12 +3527,12 @@
         </w:tc>
         <w:tc>
           <w:tcPr>
-            <w:tcW w:type="dxa" w:w="1080"/>
+            <w:tcW w:type="dxa" w:w="960"/>
           </w:tcPr>
           <w:p>
             <w:r>
               <w:rPr>
-                <w:sz w:val="13"/>
+                <w:sz w:val="12"/>
               </w:rPr>
               <w:t>2024</w:t>
             </w:r>
@@ -3174,12 +3540,12 @@
         </w:tc>
         <w:tc>
           <w:tcPr>
-            <w:tcW w:type="dxa" w:w="1080"/>
+            <w:tcW w:type="dxa" w:w="960"/>
           </w:tcPr>
           <w:p>
             <w:r>
               <w:rPr>
-                <w:sz w:val="13"/>
+                <w:sz w:val="12"/>
               </w:rPr>
               <w:t>Follow-up plan with concrete plastics measures: SUP EPR, fishing-gear EPR, REACH microplastics, packaging regulation preparation.</w:t>
             </w:r>
@@ -3187,12 +3553,12 @@
         </w:tc>
         <w:tc>
           <w:tcPr>
-            <w:tcW w:type="dxa" w:w="1080"/>
+            <w:tcW w:type="dxa" w:w="960"/>
           </w:tcPr>
           <w:p>
             <w:r>
               <w:rPr>
-                <w:sz w:val="13"/>
+                <w:sz w:val="12"/>
               </w:rPr>
               <w:t>All sectors; fisheries</w:t>
             </w:r>
@@ -3200,12 +3566,12 @@
         </w:tc>
         <w:tc>
           <w:tcPr>
-            <w:tcW w:type="dxa" w:w="1080"/>
+            <w:tcW w:type="dxa" w:w="960"/>
           </w:tcPr>
           <w:p>
             <w:r>
               <w:rPr>
-                <w:sz w:val="13"/>
+                <w:sz w:val="12"/>
               </w:rPr>
               <w:t>Production; End-of-life; Litter/Pollution</w:t>
             </w:r>
@@ -3213,12 +3579,12 @@
         </w:tc>
         <w:tc>
           <w:tcPr>
-            <w:tcW w:type="dxa" w:w="1080"/>
+            <w:tcW w:type="dxa" w:w="960"/>
           </w:tcPr>
           <w:p>
             <w:r>
               <w:rPr>
-                <w:sz w:val="13"/>
+                <w:sz w:val="12"/>
               </w:rPr>
             </w:r>
             <w:hyperlink r:id="rId35">
@@ -3236,12 +3602,12 @@
       <w:tr>
         <w:tc>
           <w:tcPr>
-            <w:tcW w:type="dxa" w:w="1080"/>
+            <w:tcW w:type="dxa" w:w="960"/>
           </w:tcPr>
           <w:p>
             <w:r>
               <w:rPr>
-                <w:sz w:val="13"/>
+                <w:sz w:val="12"/>
               </w:rPr>
               <w:t>Lov om bærekraftige produkter og verdikjeder</w:t>
             </w:r>
@@ -3249,12 +3615,25 @@
         </w:tc>
         <w:tc>
           <w:tcPr>
-            <w:tcW w:type="dxa" w:w="1080"/>
+            <w:tcW w:type="dxa" w:w="960"/>
           </w:tcPr>
           <w:p>
             <w:r>
               <w:rPr>
-                <w:sz w:val="13"/>
+                <w:sz w:val="12"/>
+              </w:rPr>
+              <w:t>Act relating to sustainable products and value chains (Sustainable Products Act)</w:t>
+            </w:r>
+          </w:p>
+        </w:tc>
+        <w:tc>
+          <w:tcPr>
+            <w:tcW w:type="dxa" w:w="960"/>
+          </w:tcPr>
+          <w:p>
+            <w:r>
+              <w:rPr>
+                <w:sz w:val="12"/>
               </w:rPr>
               <w:t>Act (Law)</w:t>
             </w:r>
@@ -3262,12 +3641,12 @@
         </w:tc>
         <w:tc>
           <w:tcPr>
-            <w:tcW w:type="dxa" w:w="1080"/>
+            <w:tcW w:type="dxa" w:w="960"/>
           </w:tcPr>
           <w:p>
             <w:r>
               <w:rPr>
-                <w:sz w:val="13"/>
+                <w:sz w:val="12"/>
               </w:rPr>
               <w:t>2024</w:t>
             </w:r>
@@ -3275,12 +3654,12 @@
         </w:tc>
         <w:tc>
           <w:tcPr>
-            <w:tcW w:type="dxa" w:w="1080"/>
+            <w:tcW w:type="dxa" w:w="960"/>
           </w:tcPr>
           <w:p>
             <w:r>
               <w:rPr>
-                <w:sz w:val="13"/>
+                <w:sz w:val="12"/>
               </w:rPr>
               <w:t>2026</w:t>
             </w:r>
@@ -3288,12 +3667,12 @@
         </w:tc>
         <w:tc>
           <w:tcPr>
-            <w:tcW w:type="dxa" w:w="1080"/>
+            <w:tcW w:type="dxa" w:w="960"/>
           </w:tcPr>
           <w:p>
             <w:r>
               <w:rPr>
-                <w:sz w:val="13"/>
+                <w:sz w:val="12"/>
               </w:rPr>
               <w:t>Enabling law for EU sustainable product/circular economy rules including future plastic packaging and EPR requirements.</w:t>
             </w:r>
@@ -3301,12 +3680,12 @@
         </w:tc>
         <w:tc>
           <w:tcPr>
-            <w:tcW w:type="dxa" w:w="1080"/>
+            <w:tcW w:type="dxa" w:w="960"/>
           </w:tcPr>
           <w:p>
             <w:r>
               <w:rPr>
-                <w:sz w:val="13"/>
+                <w:sz w:val="12"/>
               </w:rPr>
               <w:t>All sectors; manufacturing</w:t>
             </w:r>
@@ -3314,12 +3693,12 @@
         </w:tc>
         <w:tc>
           <w:tcPr>
-            <w:tcW w:type="dxa" w:w="1080"/>
+            <w:tcW w:type="dxa" w:w="960"/>
           </w:tcPr>
           <w:p>
             <w:r>
               <w:rPr>
-                <w:sz w:val="13"/>
+                <w:sz w:val="12"/>
               </w:rPr>
               <w:t>Production; Design; End-of-life</w:t>
             </w:r>
@@ -3327,12 +3706,12 @@
         </w:tc>
         <w:tc>
           <w:tcPr>
-            <w:tcW w:type="dxa" w:w="1080"/>
+            <w:tcW w:type="dxa" w:w="960"/>
           </w:tcPr>
           <w:p>
             <w:r>
               <w:rPr>
-                <w:sz w:val="13"/>
+                <w:sz w:val="12"/>
               </w:rPr>
             </w:r>
             <w:hyperlink r:id="rId36">
@@ -3350,12 +3729,12 @@
       <w:tr>
         <w:tc>
           <w:tcPr>
-            <w:tcW w:type="dxa" w:w="1080"/>
+            <w:tcW w:type="dxa" w:w="960"/>
           </w:tcPr>
           <w:p>
             <w:r>
               <w:rPr>
-                <w:sz w:val="13"/>
+                <w:sz w:val="12"/>
               </w:rPr>
               <w:t>Avfallsforskriften – Kap. 7A: EPR for engangsplastprodukter</w:t>
             </w:r>
@@ -3363,12 +3742,25 @@
         </w:tc>
         <w:tc>
           <w:tcPr>
-            <w:tcW w:type="dxa" w:w="1080"/>
+            <w:tcW w:type="dxa" w:w="960"/>
           </w:tcPr>
           <w:p>
             <w:r>
               <w:rPr>
-                <w:sz w:val="13"/>
+                <w:sz w:val="12"/>
+              </w:rPr>
+              <w:t>Waste Regulation – Ch. 7A: Extended producer responsibility for single-use plastic products</w:t>
+            </w:r>
+          </w:p>
+        </w:tc>
+        <w:tc>
+          <w:tcPr>
+            <w:tcW w:type="dxa" w:w="960"/>
+          </w:tcPr>
+          <w:p>
+            <w:r>
+              <w:rPr>
+                <w:sz w:val="12"/>
               </w:rPr>
               <w:t>Regulation</w:t>
             </w:r>
@@ -3376,12 +3768,12 @@
         </w:tc>
         <w:tc>
           <w:tcPr>
-            <w:tcW w:type="dxa" w:w="1080"/>
+            <w:tcW w:type="dxa" w:w="960"/>
           </w:tcPr>
           <w:p>
             <w:r>
               <w:rPr>
-                <w:sz w:val="13"/>
+                <w:sz w:val="12"/>
               </w:rPr>
               <w:t>2025</w:t>
             </w:r>
@@ -3389,12 +3781,12 @@
         </w:tc>
         <w:tc>
           <w:tcPr>
-            <w:tcW w:type="dxa" w:w="1080"/>
+            <w:tcW w:type="dxa" w:w="960"/>
           </w:tcPr>
           <w:p>
             <w:r>
               <w:rPr>
-                <w:sz w:val="13"/>
+                <w:sz w:val="12"/>
               </w:rPr>
               <w:t>2025</w:t>
             </w:r>
@@ -3402,12 +3794,12 @@
         </w:tc>
         <w:tc>
           <w:tcPr>
-            <w:tcW w:type="dxa" w:w="1080"/>
+            <w:tcW w:type="dxa" w:w="960"/>
           </w:tcPr>
           <w:p>
             <w:r>
               <w:rPr>
-                <w:sz w:val="13"/>
+                <w:sz w:val="12"/>
               </w:rPr>
               <w:t>New EPR for listed SUP items: producers cover municipal litter cleanup and public-bin collection from 1 January 2027.</w:t>
             </w:r>
@@ -3415,12 +3807,12 @@
         </w:tc>
         <w:tc>
           <w:tcPr>
-            <w:tcW w:type="dxa" w:w="1080"/>
+            <w:tcW w:type="dxa" w:w="960"/>
           </w:tcPr>
           <w:p>
             <w:r>
               <w:rPr>
-                <w:sz w:val="13"/>
+                <w:sz w:val="12"/>
               </w:rPr>
               <w:t>Retail; food service; municipalities</w:t>
             </w:r>
@@ -3428,12 +3820,12 @@
         </w:tc>
         <w:tc>
           <w:tcPr>
-            <w:tcW w:type="dxa" w:w="1080"/>
+            <w:tcW w:type="dxa" w:w="960"/>
           </w:tcPr>
           <w:p>
             <w:r>
               <w:rPr>
-                <w:sz w:val="13"/>
+                <w:sz w:val="12"/>
               </w:rPr>
               <w:t>Use/Consumption; Litter/Pollution; End-of-life</w:t>
             </w:r>
@@ -3441,12 +3833,12 @@
         </w:tc>
         <w:tc>
           <w:tcPr>
-            <w:tcW w:type="dxa" w:w="1080"/>
+            <w:tcW w:type="dxa" w:w="960"/>
           </w:tcPr>
           <w:p>
             <w:r>
               <w:rPr>
-                <w:sz w:val="13"/>
+                <w:sz w:val="12"/>
               </w:rPr>
             </w:r>
             <w:hyperlink r:id="rId37">
@@ -3464,12 +3856,12 @@
       <w:tr>
         <w:tc>
           <w:tcPr>
-            <w:tcW w:type="dxa" w:w="1080"/>
+            <w:tcW w:type="dxa" w:w="960"/>
           </w:tcPr>
           <w:p>
             <w:r>
               <w:rPr>
-                <w:sz w:val="13"/>
+                <w:sz w:val="12"/>
               </w:rPr>
               <w:t>Avfallsforskriften – Kap. 7B: EPR for fiskeutstyr med plast</w:t>
             </w:r>
@@ -3477,12 +3869,25 @@
         </w:tc>
         <w:tc>
           <w:tcPr>
-            <w:tcW w:type="dxa" w:w="1080"/>
+            <w:tcW w:type="dxa" w:w="960"/>
           </w:tcPr>
           <w:p>
             <w:r>
               <w:rPr>
-                <w:sz w:val="13"/>
+                <w:sz w:val="12"/>
+              </w:rPr>
+              <w:t>Waste Regulation – Ch. 7B: Extended producer responsibility for fishing gear containing plastic</w:t>
+            </w:r>
+          </w:p>
+        </w:tc>
+        <w:tc>
+          <w:tcPr>
+            <w:tcW w:type="dxa" w:w="960"/>
+          </w:tcPr>
+          <w:p>
+            <w:r>
+              <w:rPr>
+                <w:sz w:val="12"/>
               </w:rPr>
               <w:t>Regulation</w:t>
             </w:r>
@@ -3490,12 +3895,12 @@
         </w:tc>
         <w:tc>
           <w:tcPr>
-            <w:tcW w:type="dxa" w:w="1080"/>
+            <w:tcW w:type="dxa" w:w="960"/>
           </w:tcPr>
           <w:p>
             <w:r>
               <w:rPr>
-                <w:sz w:val="13"/>
+                <w:sz w:val="12"/>
               </w:rPr>
               <w:t>2025</w:t>
             </w:r>
@@ -3503,12 +3908,12 @@
         </w:tc>
         <w:tc>
           <w:tcPr>
-            <w:tcW w:type="dxa" w:w="1080"/>
+            <w:tcW w:type="dxa" w:w="960"/>
           </w:tcPr>
           <w:p>
             <w:r>
               <w:rPr>
-                <w:sz w:val="13"/>
+                <w:sz w:val="12"/>
               </w:rPr>
               <w:t>2025</w:t>
             </w:r>
@@ -3516,12 +3921,12 @@
         </w:tc>
         <w:tc>
           <w:tcPr>
-            <w:tcW w:type="dxa" w:w="1080"/>
+            <w:tcW w:type="dxa" w:w="960"/>
           </w:tcPr>
           <w:p>
             <w:r>
               <w:rPr>
-                <w:sz w:val="13"/>
+                <w:sz w:val="12"/>
               </w:rPr>
               <w:t>New EPR for fishing, aquaculture and recreational fishing gear containing plastic.</w:t>
             </w:r>
@@ -3529,12 +3934,12 @@
         </w:tc>
         <w:tc>
           <w:tcPr>
-            <w:tcW w:type="dxa" w:w="1080"/>
+            <w:tcW w:type="dxa" w:w="960"/>
           </w:tcPr>
           <w:p>
             <w:r>
               <w:rPr>
-                <w:sz w:val="13"/>
+                <w:sz w:val="12"/>
               </w:rPr>
               <w:t>Fisheries; aquaculture; manufacturing</w:t>
             </w:r>
@@ -3542,12 +3947,12 @@
         </w:tc>
         <w:tc>
           <w:tcPr>
-            <w:tcW w:type="dxa" w:w="1080"/>
+            <w:tcW w:type="dxa" w:w="960"/>
           </w:tcPr>
           <w:p>
             <w:r>
               <w:rPr>
-                <w:sz w:val="13"/>
+                <w:sz w:val="12"/>
               </w:rPr>
               <w:t>Use/Consumption; End-of-life; Litter/Pollution</w:t>
             </w:r>
@@ -3555,12 +3960,12 @@
         </w:tc>
         <w:tc>
           <w:tcPr>
-            <w:tcW w:type="dxa" w:w="1080"/>
+            <w:tcW w:type="dxa" w:w="960"/>
           </w:tcPr>
           <w:p>
             <w:r>
               <w:rPr>
-                <w:sz w:val="13"/>
+                <w:sz w:val="12"/>
               </w:rPr>
             </w:r>
             <w:hyperlink r:id="rId38">
@@ -3582,15 +3987,10 @@
         <w:rPr>
           <w:b/>
         </w:rPr>
-        <w:t xml:space="preserve">Important note on dates: </w:t>
+        <w:t xml:space="preserve">Note on dates: </w:t>
       </w:r>
       <w:r>
-        <w:t>Many instruments date from the 1970s–2000s but show recent Last Amendment Years (2024–2026) because Norwegian regulations are living instruments updated frequently to transpose new EU/EEA rules. Use the Original Year column for chronological policy history; use Last Amendment Year for the current legal text.</w:t>
-      </w:r>
-    </w:p>
-    <w:p>
-      <w:r>
-        <w:t>Policies with original year before 2022: 25 of 30.</w:t>
+        <w:t>Use Original Year for policy chronology; Last Amendment Year reflects the most recent legal update. English titles are standard translations of official Norwegian titles and may differ slightly from informal English names used by government agencies.</w:t>
       </w:r>
     </w:p>
     <w:sectPr>

</xml_diff>